<commit_message>
docs: revise wireless communication progress narrative
</commit_message>
<xml_diff>
--- a/260929_report/多机器人无线通信调度近期进展分享文档.docx
+++ b/260929_report/多机器人无线通信调度近期进展分享文档.docx
@@ -5,33 +5,33 @@
     <w:p>
       <w:pPr>
         <w:pStyle w:val="Title"/>
-        <w:spacing w:before="1400" w:after="240"/>
+        <w:spacing w:before="1240" w:after="240"/>
         <w:jc w:val="center"/>
       </w:pPr>
       <w:r>
-        <w:t>多机器人无线通信调度近期进展分享</w:t>
+        <w:t>复杂环境下多机器人无线通信问题</w:t>
       </w:r>
     </w:p>
     <w:p>
       <w:pPr>
         <w:pStyle w:val="Subtitle"/>
-        <w:spacing w:after="400"/>
+        <w:spacing w:after="320"/>
         <w:jc w:val="center"/>
       </w:pPr>
       <w:r>
-        <w:t>从问题提出到 Gazebo ns3 方向的阶段性路线</w:t>
+        <w:t>近期工作进展与研究路线</w:t>
       </w:r>
     </w:p>
     <w:p>
       <w:pPr>
-        <w:spacing w:after="1200"/>
+        <w:spacing w:after="840"/>
         <w:jc w:val="center"/>
       </w:pPr>
       <w:r>
         <w:rPr>
           <w:sz w:val="22"/>
         </w:rPr>
-        <w:t>面向组内交流与讨论 · 2026 年 9 月 29 日</w:t>
+        <w:t>从问题提出、文献调研到 Gazebo–ns-3 验证</w:t>
       </w:r>
     </w:p>
     <w:p>
@@ -43,7 +43,7 @@
         <w:drawing>
           <wp:inline xmlns:a="http://schemas.openxmlformats.org/drawingml/2006/main" xmlns:pic="http://schemas.openxmlformats.org/drawingml/2006/picture">
             <wp:extent cx="5897880" cy="2654046"/>
-            <wp:docPr id="1" name="Picture 1" descr="汇报文档示意图"/>
+            <wp:docPr id="1" name="Picture 1" descr="汇报文档示意图 1"/>
             <wp:cNvGraphicFramePr>
               <a:graphicFrameLocks noChangeAspect="1"/>
             </wp:cNvGraphicFramePr>
@@ -80,7 +80,7 @@
         <w:jc w:val="center"/>
       </w:pPr>
       <w:r>
-        <w:t>图 1 这次分享希望讨论的核心问题链</w:t>
+        <w:t>图 1　从任务需求到消息准入、无线不确定性和任务后果的因果链</w:t>
       </w:r>
     </w:p>
     <w:p>
@@ -89,7 +89,7 @@
         <w:rPr>
           <w:i/>
         </w:rPr>
-        <w:t>这份文档服务于一次“分享最近做了什么、读了什么、接下来想怎么做”的交流。它把当前能证明的工程事实、还没有证明的研究假设和下一步需要大家帮助判断的地方放在一起。</w:t>
+        <w:t>今天想从一个更大的应用问题开始：当多台机器人在陌生、拥挤或受干扰的环境中协同工作时，无线通信的不确定性会怎样改变任务本身？这份文档把目前形成的认识、正在尝试的方法、已经完成的任务层工作，以及还没有解决的问题放在同一条线上。</w:t>
       </w:r>
     </w:p>
     <w:p>
@@ -119,7 +119,7 @@
         <w:t xml:space="preserve">• </w:t>
       </w:r>
       <w:r>
-        <w:t>我想分享的问题</w:t>
+        <w:t>从一个大问题开始：多机器人无线通信为什么会影响任务</w:t>
       </w:r>
     </w:p>
     <w:p>
@@ -133,7 +133,7 @@
         <w:t xml:space="preserve">• </w:t>
       </w:r>
       <w:r>
-        <w:t>为什么无线通信会变成任务问题</w:t>
+        <w:t>文献调研：从网络资源分配走向任务导向通信</w:t>
       </w:r>
     </w:p>
     <w:p>
@@ -147,7 +147,7 @@
         <w:t xml:space="preserve">• </w:t>
       </w:r>
       <w:r>
-        <w:t>11 篇论文带来的问题地图</w:t>
+        <w:t>把文献落到一个可验证的问题</w:t>
       </w:r>
     </w:p>
     <w:p>
@@ -161,7 +161,7 @@
         <w:t xml:space="preserve">• </w:t>
       </w:r>
       <w:r>
-        <w:t>我现在想尝试的方法</w:t>
+        <w:t>当前想尝试的方法</w:t>
       </w:r>
     </w:p>
     <w:p>
@@ -175,7 +175,7 @@
         <w:t xml:space="preserve">• </w:t>
       </w:r>
       <w:r>
-        <w:t>从仿真到实物的工程路线</w:t>
+        <w:t>从仿真到实物的 P0–P8 路线</w:t>
       </w:r>
     </w:p>
     <w:p>
@@ -189,7 +189,7 @@
         <w:t xml:space="preserve">• </w:t>
       </w:r>
       <w:r>
-        <w:t>已经完成的工作和目前证据</w:t>
+        <w:t>已经完成的工作、证据和边界</w:t>
       </w:r>
     </w:p>
     <w:p>
@@ -217,7 +217,7 @@
         <w:t xml:space="preserve">• </w:t>
       </w:r>
       <w:r>
-        <w:t>现在的反思和希望一起讨论的问题</w:t>
+        <w:t>反思与待讨论的问题</w:t>
       </w:r>
     </w:p>
     <w:p>
@@ -231,7 +231,7 @@
         <w:t xml:space="preserve">• </w:t>
       </w:r>
       <w:r>
-        <w:t>附录：听众可能会追问的口径和资料入口</w:t>
+        <w:t>附录：口径和资料入口</w:t>
       </w:r>
     </w:p>
     <w:p>
@@ -247,7 +247,7 @@
         <w:rPr>
           <w:i w:val="0"/>
         </w:rPr>
-        <w:t>1 我想分享的问题</w:t>
+        <w:t>1 从一个大问题开始：多机器人无线通信为什么会影响任务</w:t>
       </w:r>
     </w:p>
     <w:p>
@@ -256,7 +256,7 @@
         <w:rPr>
           <w:i w:val="0"/>
         </w:rPr>
-        <w:t>这次汇报不以“已经取得什么成果”为主线，而是希望把问题、调研、方法和路线摊开来，请大家一起看它是否值得继续，以及当前的边界是否足够清楚。</w:t>
+        <w:t>今天想先把问题放在应用的大背景里：灾害搜索、仓储盘点、工业巡检、地下空间勘测和未知室内探索都在使用多台移动机器人。它们需要共享地图、位姿、目标线索和任务状态，同时保持各自的局部感知和避障能力。机器人数量增加以后，问题不只是“每台机器人能不能走”，而是团队能不能在有限通信条件下及时形成共同的状态判断。</w:t>
       </w:r>
     </w:p>
     <w:p>
@@ -267,7 +267,7 @@
         <w:rPr>
           <w:i w:val="0"/>
         </w:rPr>
-        <w:t>1.1 先从一个应用场景开始</w:t>
+        <w:t>1.1 应用中的共同场景</w:t>
       </w:r>
     </w:p>
     <w:p>
@@ -276,16 +276,7 @@
         <w:rPr>
           <w:i w:val="0"/>
         </w:rPr>
-        <w:t>设想一个陌生的室内环境，例如实验室、房间组合或长走廊。2–3 台移动机器人从共同充电区域附近出发，不预先知道地图；它们一边用激光雷达和本地 SLAM 建图，一边用 frontier 方法分配探索区域，之后寻找指定目标。找到目标后，发现信息要送到中央协调器，再给仍参与任务的机器人分配互相分离的安全集合位姿。电量不足时，机器人必须先本地返航、充电，再继续任务。</w:t>
-      </w:r>
-    </w:p>
-    <w:p>
-      <w:pPr/>
-      <w:r>
-        <w:rPr>
-          <w:i w:val="0"/>
-        </w:rPr>
-        <w:t>这个场景中，通信不是“把一个已经决定好的动作发出去”这么简单。机器人产生的是一组不同语义、不同大小、不同紧急程度的消息：地图增量、位姿和电量、frontier 摘要、目标检测、返航请求、集合命令。它们对任务的敏感度并不一样：一条过期地图可能只是减少探索效率，一条没有及时送达的目标确认则可能让整个团队继续搜索；一条返航或急停命令不能和普通状态消息使用完全相同的等待规则。</w:t>
+        <w:t>无线链路通常比有线链路更适合移动和临时部署，但它把不确定性带进了任务闭环：机器人移动后链路会变化，墙体和遮挡会改变接收质量，多台机器人同时上报会形成突发负载，共享信道的随机接入会产生排队和竞争，碰撞、ACK 失败和重传会拉长时延尾部。某个消息即使最终到达，也可能已经过期，接收端据此做出的分工或集合决策未必仍然合适。</w:t>
       </w:r>
     </w:p>
     <w:p>
@@ -296,7 +287,72 @@
         <w:rPr>
           <w:i w:val="0"/>
         </w:rPr>
-        <w:t>1.2 需要一起看的问题链</w:t>
+        <w:t>1.2 不同任务、不同消息的敏感度并不一样</w:t>
+      </w:r>
+    </w:p>
+    <w:p>
+      <w:pPr/>
+      <w:r>
+        <w:rPr>
+          <w:i w:val="0"/>
+        </w:rPr>
+        <w:t>在同一个任务里，通信内容也不是同质的。地图增量可以用版本替代，普通位姿和电量可以周期更新，frontier 摘要可能在几秒后就失去价值；目标确认、集合命令、返航和急停却有更强的时限和安全约束。只优化吞吐率，可能让大量重复地图占满队列；只追求低时延，也可能把本来不重要的更新送得过于频繁。</w:t>
+      </w:r>
+    </w:p>
+    <w:p>
+      <w:pPr>
+        <w:pStyle w:val="BulletCustom"/>
+      </w:pPr>
+      <w:r>
+        <w:rPr>
+          <w:b/>
+        </w:rPr>
+        <w:t xml:space="preserve">• </w:t>
+      </w:r>
+      <w:r>
+        <w:t>哪类信息值得进入发送队列？</w:t>
+      </w:r>
+    </w:p>
+    <w:p>
+      <w:pPr>
+        <w:pStyle w:val="BulletCustom"/>
+      </w:pPr>
+      <w:r>
+        <w:rPr>
+          <w:b/>
+        </w:rPr>
+        <w:t xml:space="preserve">• </w:t>
+      </w:r>
+      <w:r>
+        <w:t>什么时候发送比继续等待更有价值？</w:t>
+      </w:r>
+    </w:p>
+    <w:p>
+      <w:pPr>
+        <w:pStyle w:val="BulletCustom"/>
+      </w:pPr>
+      <w:r>
+        <w:rPr>
+          <w:b/>
+        </w:rPr>
+        <w:t xml:space="preserve">• </w:t>
+      </w:r>
+      <w:r>
+        <w:t>在多个机器人同时有消息时，先满足谁？</w:t>
+      </w:r>
+    </w:p>
+    <w:p>
+      <w:pPr>
+        <w:pStyle w:val="BulletCustom"/>
+      </w:pPr>
+      <w:r>
+        <w:rPr>
+          <w:b/>
+        </w:rPr>
+        <w:t xml:space="preserve">• </w:t>
+      </w:r>
+      <w:r>
+        <w:t>消息的交付是否真的改变了任务状态、路径或最终完成结果？</w:t>
       </w:r>
     </w:p>
     <w:p>
@@ -308,7 +364,7 @@
         <w:drawing>
           <wp:inline xmlns:a="http://schemas.openxmlformats.org/drawingml/2006/main" xmlns:pic="http://schemas.openxmlformats.org/drawingml/2006/picture">
             <wp:extent cx="5897880" cy="2654046"/>
-            <wp:docPr id="2" name="Picture 2" descr="汇报文档示意图"/>
+            <wp:docPr id="2" name="Picture 2" descr="汇报文档示意图 2"/>
             <wp:cNvGraphicFramePr>
               <a:graphicFrameLocks noChangeAspect="1"/>
             </wp:cNvGraphicFramePr>
@@ -345,16 +401,7 @@
         <w:jc w:val="center"/>
       </w:pPr>
       <w:r>
-        <w:t>图 2 问题链：从任务需求到消息、无线不确定性和任务后果</w:t>
-      </w:r>
-    </w:p>
-    <w:p>
-      <w:pPr/>
-      <w:r>
-        <w:rPr>
-          <w:i/>
-        </w:rPr>
-        <w:t>汇报时可以把“通信是否可靠”改成更具体的问题：一条消息是否被准入、实际是否进入队列、是否获得发送机会、是否及时交付、接收端是否消费，以及它是否改变了后续任务决策。</w:t>
+        <w:t>图 2　从任务需求到消息准入、无线不确定性和任务后果的因果链</w:t>
       </w:r>
     </w:p>
     <w:p>
@@ -365,7 +412,7 @@
         <w:rPr>
           <w:i w:val="0"/>
         </w:rPr>
-        <w:t>1.3 为什么 Wi-Fi 会带来不确定性</w:t>
+        <w:t>1.3 为什么 Wi-Fi 的随机接入会变成应用问题</w:t>
       </w:r>
     </w:p>
     <w:p>
@@ -374,7 +421,7 @@
         <w:rPr>
           <w:i w:val="0"/>
         </w:rPr>
-        <w:t>在共享 Wi-Fi 中，机器人不是各自拥有一条独立的“管道”。随机接入和竞争会带来发送时刻的不确定性；队列排队会把本来有意义的信息变成旧信息；碰撞、ACK 失败和重传会拉长尾部时延；移动、墙体和同信道干扰会让链路状态随位置变化。多机器人同时发送地图或状态时，通信负担可能出现 burst，而不是均匀流量。</w:t>
+        <w:t>在共享 Wi-Fi 中，机器人没有各自独立的管道。随机接入和竞争决定发送时刻，队列排队改变信息年龄，重传和退避增加尾延迟，移动和干扰让链路条件随时间变化。多机器人同时发布地图、状态或检测结果时，通信负载还会出现 burst；负载是否形成拥塞，要由实际消息大小、生成频率和接收端消费速度共同决定。</w:t>
       </w:r>
     </w:p>
     <w:p>
@@ -383,7 +430,7 @@
         <w:rPr>
           <w:i w:val="0"/>
         </w:rPr>
-        <w:t>有线通信能把一部分无线不确定性移走，但对移动机器人、临时部署或需要穿越不同区域的系统并不方便。更关键的是，单纯追求吞吐率也不一定对应任务更好：地图消息可能很多但重复，目标检测很小却更紧急；“最新”也不自动等于“有用”，因为 AoI 只描述时间新鲜度，不知道内容是否改变了任务。</w:t>
+        <w:t>有线传输可以绕开一部分无线不确定性，但不适合很多移动、临时部署或跨区域场景。更重要的是，“最新”不一定等于“有用”：一条很新的普通状态可能没有改变任务，而一条稍晚但包含目标确认的消息却可能决定团队何时停止搜索。因此，通信指标需要和任务结果放在同一条因果链上。</w:t>
       </w:r>
     </w:p>
     <w:p>
@@ -394,7 +441,7 @@
         <w:rPr>
           <w:i w:val="0"/>
         </w:rPr>
-        <w:t>1.4 我希望把问题说成什么</w:t>
+        <w:t>1.4 当前想回答的大问题</w:t>
       </w:r>
     </w:p>
     <w:p>
@@ -412,7 +459,7 @@
         <w:rPr>
           <w:i w:val="0"/>
         </w:rPr>
-        <w:t>这里的“调度”首先指应用层消息是否进入发送通道，不等同于取代 802.11 DCF/EDCA、MAC 重传、MCS、功率或信道控制。</w:t>
+        <w:t>这里的“调度”首先指应用层消息是否进入发送通道，不把它直接等同于取代 802.11 DCF/EDCA、MAC 重传、MCS、功率或信道控制。</w:t>
       </w:r>
     </w:p>
     <w:p>
@@ -428,7 +475,16 @@
         <w:rPr>
           <w:i w:val="0"/>
         </w:rPr>
-        <w:t>2 为什么无线通信会变成任务问题</w:t>
+        <w:t>2 文献调研：从网络资源分配走向任务导向通信</w:t>
+      </w:r>
+    </w:p>
+    <w:p>
+      <w:pPr/>
+      <w:r>
+        <w:rPr>
+          <w:i w:val="0"/>
+        </w:rPr>
+        <w:t>目录中的 11 篇论文覆盖了通信 DRL、无线资源分配、多 UAV 网络、多机器人通信、多机器人任务、目标导向通信和 AoI 等方向。把它们并排看时，最有帮助的不是逐篇罗列，而是它们共同把问题推向了四个判断：网络侧为什么需要学习，机器人和网络为什么要共同设计，信息价值为什么不能只用比特数或新鲜度表示，以及任务层应该如何固定以便做出公平比较。</w:t>
       </w:r>
     </w:p>
     <w:p>
@@ -439,7 +495,270 @@
         <w:rPr>
           <w:i w:val="0"/>
         </w:rPr>
-        <w:t>2.1 不同消息的时效和价值不同</w:t>
+        <w:t>2.1 判断一：DRL 适合处理动态和复杂决策，但“用了 DRL”不是结论</w:t>
+      </w:r>
+    </w:p>
+    <w:p>
+      <w:pPr/>
+      <w:r>
+        <w:rPr>
+          <w:i w:val="0"/>
+        </w:rPr>
+        <w:t>通信领域的 DRL 综述把频谱接入、速率控制、缓存、卸载、路由和资源共享都写成状态—动作—奖励的连续决策问题。它给出的帮助是：当网络状态动态变化、模型不完备、动作空间很大时，学习策略有机会替代难以在线求解的全局优化；但同一批工作也反复出现状态爆炸、训练样本、稳定性、泛化和部署安全等困难。</w:t>
+      </w:r>
+    </w:p>
+    <w:p>
+      <w:pPr>
+        <w:spacing w:before="100" w:after="20"/>
+        <w:jc w:val="center"/>
+      </w:pPr>
+      <w:r>
+        <w:drawing>
+          <wp:inline xmlns:a="http://schemas.openxmlformats.org/drawingml/2006/main" xmlns:pic="http://schemas.openxmlformats.org/drawingml/2006/picture">
+            <wp:extent cx="5897880" cy="5829696"/>
+            <wp:docPr id="3" name="Picture 3" descr="汇报文档示意图 3"/>
+            <wp:cNvGraphicFramePr>
+              <a:graphicFrameLocks noChangeAspect="1"/>
+            </wp:cNvGraphicFramePr>
+            <a:graphic>
+              <a:graphicData uri="http://schemas.openxmlformats.org/drawingml/2006/picture">
+                <pic:pic>
+                  <pic:nvPicPr>
+                    <pic:cNvPr id="0" name="fig06_literature_drl.png"/>
+                    <pic:cNvPicPr/>
+                  </pic:nvPicPr>
+                  <pic:blipFill>
+                    <a:blip r:embed="rId12"/>
+                    <a:stretch>
+                      <a:fillRect/>
+                    </a:stretch>
+                  </pic:blipFill>
+                  <pic:spPr>
+                    <a:xfrm>
+                      <a:off x="0" y="0"/>
+                      <a:ext cx="5897880" cy="5829696"/>
+                    </a:xfrm>
+                    <a:prstGeom prst="rect"/>
+                  </pic:spPr>
+                </pic:pic>
+              </a:graphicData>
+            </a:graphic>
+          </wp:inline>
+        </w:drawing>
+      </w:r>
+    </w:p>
+    <w:p>
+      <w:pPr>
+        <w:pStyle w:val="CaptionCustom"/>
+        <w:jc w:val="center"/>
+      </w:pPr>
+      <w:r>
+        <w:t>图 3　论文页面证据：通信 DRL 关注动态网络中的决策复杂度和资源管理；它提供建模语言，尚不能直接证明任务导向的 RL 会胜过规则方法。</w:t>
+      </w:r>
+    </w:p>
+    <w:p>
+      <w:pPr/>
+      <w:r>
+        <w:rPr>
+          <w:i w:val="0"/>
+        </w:rPr>
+        <w:t>这对当前路线的直接影响是：先建立“问题是否真的需要学习”的门槛。需要先测量真实候选负载、队列、过期和任务影响，再和强规则基线比较；如果固定周期、deadline 或 task-value greedy 已经足够稳定，得到“不需要复杂 RL”的结果也有价值。</w:t>
+      </w:r>
+    </w:p>
+    <w:p>
+      <w:pPr>
+        <w:pStyle w:val="Heading2"/>
+      </w:pPr>
+      <w:r>
+        <w:rPr>
+          <w:i w:val="0"/>
+        </w:rPr>
+        <w:t>2.2 判断二：多机器人通信不能长期和机器人算法割开</w:t>
+      </w:r>
+    </w:p>
+    <w:p>
+      <w:pPr/>
+      <w:r>
+        <w:rPr>
+          <w:i w:val="0"/>
+        </w:rPr>
+        <w:t>多机器人通信综述从机器人应用和网络技术两侧回顾了这个领域，指出很多系统把通信当成一个已经存在的约束，而不是和运动、感知、控制共同设计的变量。它还把数据驱动方法和 sim-to-real gap 放在一起讨论：网络模型再精细，如果消息怎样改变机器人行为没有进入评估，仍然无法判断通信改进是否有任务价值。</w:t>
+      </w:r>
+    </w:p>
+    <w:p>
+      <w:pPr>
+        <w:spacing w:before="100" w:after="20"/>
+        <w:jc w:val="center"/>
+      </w:pPr>
+      <w:r>
+        <w:drawing>
+          <wp:inline xmlns:a="http://schemas.openxmlformats.org/drawingml/2006/main" xmlns:pic="http://schemas.openxmlformats.org/drawingml/2006/picture">
+            <wp:extent cx="5897880" cy="5206153"/>
+            <wp:docPr id="4" name="Picture 4" descr="汇报文档示意图 4"/>
+            <wp:cNvGraphicFramePr>
+              <a:graphicFrameLocks noChangeAspect="1"/>
+            </wp:cNvGraphicFramePr>
+            <a:graphic>
+              <a:graphicData uri="http://schemas.openxmlformats.org/drawingml/2006/picture">
+                <pic:pic>
+                  <pic:nvPicPr>
+                    <pic:cNvPr id="0" name="fig07_literature_codesign.png"/>
+                    <pic:cNvPicPr/>
+                  </pic:nvPicPr>
+                  <pic:blipFill>
+                    <a:blip r:embed="rId13"/>
+                    <a:stretch>
+                      <a:fillRect/>
+                    </a:stretch>
+                  </pic:blipFill>
+                  <pic:spPr>
+                    <a:xfrm>
+                      <a:off x="0" y="0"/>
+                      <a:ext cx="5897880" cy="5206153"/>
+                    </a:xfrm>
+                    <a:prstGeom prst="rect"/>
+                  </pic:spPr>
+                </pic:pic>
+              </a:graphicData>
+            </a:graphic>
+          </wp:inline>
+        </w:drawing>
+      </w:r>
+    </w:p>
+    <w:p>
+      <w:pPr>
+        <w:pStyle w:val="CaptionCustom"/>
+        <w:jc w:val="center"/>
+      </w:pPr>
+      <w:r>
+        <w:t>图 4　论文页面证据：通信、机器人算法和网络需要共同设计；当前路线把消息生成、网络交付、接收端状态和任务结果放进同一条日志。</w:t>
+      </w:r>
+    </w:p>
+    <w:p>
+      <w:pPr/>
+      <w:r>
+        <w:rPr>
+          <w:i w:val="0"/>
+        </w:rPr>
+        <w:t>这并不意味着第一版要同时学习运动、任务分配和 PHY/MAC。相反，需要先固定任务栈，把通信准入作为一个可控变量，才能知道变化来自哪里。</w:t>
+      </w:r>
+    </w:p>
+    <w:p>
+      <w:pPr>
+        <w:pStyle w:val="Heading2"/>
+      </w:pPr>
+      <w:r>
+        <w:rPr>
+          <w:i w:val="0"/>
+        </w:rPr>
+        <w:t>2.3 判断三：任务导向通信把“传多少”改写成“这条信息能否推进共同目标”</w:t>
+      </w:r>
+    </w:p>
+    <w:p>
+      <w:pPr/>
+      <w:r>
+        <w:rPr>
+          <w:i w:val="0"/>
+        </w:rPr>
+        <w:t>Goal-oriented communication 的综述把通信价值从比特保真转向共同目标贡献，讨论了 VoI、CoIL、AoI、VAoI 等概念；推理增强的任务导向通信进一步强调 agent 应该判断传什么、什么时候传、为什么传。这些工作给当前问题一个更贴近应用的语言：地图、位姿、目标和集合消息的价值，取决于它们能否改变下一步任务决策，而不是只取决于字节数。</w:t>
+      </w:r>
+    </w:p>
+    <w:p>
+      <w:pPr/>
+      <w:r>
+        <w:rPr>
+          <w:i w:val="0"/>
+        </w:rPr>
+        <w:t>AoI 文献又提供了一个必要但不充分的提醒：状态更新越新通常越好，但“尽可能快、尽可能多地发送”不等于系统更优；排队、能源和接收端消费速度都会影响最合适的更新策略。AoI 可以进入指标，但不能独自代表内容价值。</w:t>
+      </w:r>
+    </w:p>
+    <w:p>
+      <w:pPr>
+        <w:spacing w:before="100" w:after="20"/>
+        <w:jc w:val="center"/>
+      </w:pPr>
+      <w:r>
+        <w:drawing>
+          <wp:inline xmlns:a="http://schemas.openxmlformats.org/drawingml/2006/main" xmlns:pic="http://schemas.openxmlformats.org/drawingml/2006/picture">
+            <wp:extent cx="5897880" cy="3129164"/>
+            <wp:docPr id="5" name="Picture 5" descr="汇报文档示意图 5"/>
+            <wp:cNvGraphicFramePr>
+              <a:graphicFrameLocks noChangeAspect="1"/>
+            </wp:cNvGraphicFramePr>
+            <a:graphic>
+              <a:graphicData uri="http://schemas.openxmlformats.org/drawingml/2006/picture">
+                <pic:pic>
+                  <pic:nvPicPr>
+                    <pic:cNvPr id="0" name="fig08_literature_goal_aoi.png"/>
+                    <pic:cNvPicPr/>
+                  </pic:nvPicPr>
+                  <pic:blipFill>
+                    <a:blip r:embed="rId14"/>
+                    <a:stretch>
+                      <a:fillRect/>
+                    </a:stretch>
+                  </pic:blipFill>
+                  <pic:spPr>
+                    <a:xfrm>
+                      <a:off x="0" y="0"/>
+                      <a:ext cx="5897880" cy="3129164"/>
+                    </a:xfrm>
+                    <a:prstGeom prst="rect"/>
+                  </pic:spPr>
+                </pic:pic>
+              </a:graphicData>
+            </a:graphic>
+          </wp:inline>
+        </w:drawing>
+      </w:r>
+    </w:p>
+    <w:p>
+      <w:pPr>
+        <w:pStyle w:val="CaptionCustom"/>
+        <w:jc w:val="center"/>
+      </w:pPr>
+      <w:r>
+        <w:t>图 5　论文页面证据：Goal-oriented communication 关注共同目标，AoI 关注状态新鲜度；两者结合后更接近“消息是否值得占用信道”。</w:t>
+      </w:r>
+    </w:p>
+    <w:p>
+      <w:pPr>
+        <w:pStyle w:val="Heading2"/>
+      </w:pPr>
+      <w:r>
+        <w:rPr>
+          <w:i w:val="0"/>
+        </w:rPr>
+        <w:t>2.4 判断四：任务研究提供了稳定的应用基线，通信通常仍被当作约束</w:t>
+      </w:r>
+    </w:p>
+    <w:p>
+      <w:pPr/>
+      <w:r>
+        <w:rPr>
+          <w:i w:val="0"/>
+        </w:rPr>
+        <w:t>多机器人探索和多智能体 DRL 文献通常把任务拆成定位建图、frontier 生成、分配、规划、避障、导航和信息收集。这个模块化结构很适合构建可重复的应用基线，也说明了为什么第一版应该固定 SLAM、frontier 和 Nav2，而不是同时让通信策略改变任务栈。</w:t>
+      </w:r>
+    </w:p>
+    <w:p>
+      <w:pPr/>
+      <w:r>
+        <w:rPr>
+          <w:i w:val="0"/>
+        </w:rPr>
+        <w:t>另一方面，很多任务工作把通信简单处理成“可用/不可用”、范围约束或带宽限制，较少保留消息生成、排队、重传、过期、消费和任务变化的逐条因果记录。当前路线要补的不是再造一个探索算法，而是把这些消息过程显式化，并验证它们是否会改变探索、目标确认、集合和充电恢复。</w:t>
+      </w:r>
+    </w:p>
+    <w:p>
+      <w:pPr>
+        <w:pStyle w:val="Heading2"/>
+      </w:pPr>
+      <w:r>
+        <w:rPr>
+          <w:i w:val="0"/>
+        </w:rPr>
+        <w:t>2.5 11 篇论文合起来后的问题地图</w:t>
       </w:r>
     </w:p>
     <w:tbl>
@@ -461,825 +780,7 @@
         </w:trPr>
         <w:tc>
           <w:tcPr>
-            <w:tcW w:type="dxa" w:w="1417"/>
-            <w:shd w:fill="1F4E79"/>
-            <w:tcBorders>
-              <w:top w:val="single" w:sz="6" w:space="0" w:color="D9D9D9"/>
-              <w:left w:val="single" w:sz="6" w:space="0" w:color="D9D9D9"/>
-              <w:bottom w:val="single" w:sz="6" w:space="0" w:color="D9D9D9"/>
-              <w:right w:val="single" w:sz="6" w:space="0" w:color="D9D9D9"/>
-              <w:insideH w:val="single" w:sz="6" w:space="0" w:color="D9D9D9"/>
-              <w:insideV w:val="single" w:sz="6" w:space="0" w:color="D9D9D9"/>
-            </w:tcBorders>
-            <w:tcMar>
-              <w:top w:w="90" w:type="dxa"/>
-              <w:start w:w="110" w:type="dxa"/>
-              <w:bottom w:w="90" w:type="dxa"/>
-              <w:end w:w="110" w:type="dxa"/>
-            </w:tcMar>
-            <w:vAlign w:val="center"/>
-          </w:tcPr>
-          <w:p>
-            <w:pPr>
-              <w:pStyle w:val="SmallTable"/>
-              <w:jc w:val="center"/>
-            </w:pPr>
-            <w:r>
-              <w:rPr>
-                <w:b/>
-                <w:color w:val="FFFFFF"/>
-                <w:sz w:val="16"/>
-              </w:rPr>
-              <w:t>消息类别</w:t>
-            </w:r>
-          </w:p>
-        </w:tc>
-        <w:tc>
-          <w:tcPr>
-            <w:tcW w:type="dxa" w:w="1814"/>
-            <w:shd w:fill="1F4E79"/>
-            <w:tcBorders>
-              <w:top w:val="single" w:sz="6" w:space="0" w:color="D9D9D9"/>
-              <w:left w:val="single" w:sz="6" w:space="0" w:color="D9D9D9"/>
-              <w:bottom w:val="single" w:sz="6" w:space="0" w:color="D9D9D9"/>
-              <w:right w:val="single" w:sz="6" w:space="0" w:color="D9D9D9"/>
-              <w:insideH w:val="single" w:sz="6" w:space="0" w:color="D9D9D9"/>
-              <w:insideV w:val="single" w:sz="6" w:space="0" w:color="D9D9D9"/>
-            </w:tcBorders>
-            <w:tcMar>
-              <w:top w:w="90" w:type="dxa"/>
-              <w:start w:w="110" w:type="dxa"/>
-              <w:bottom w:w="90" w:type="dxa"/>
-              <w:end w:w="110" w:type="dxa"/>
-            </w:tcMar>
-            <w:vAlign w:val="center"/>
-          </w:tcPr>
-          <w:p>
-            <w:pPr>
-              <w:pStyle w:val="SmallTable"/>
-              <w:jc w:val="center"/>
-            </w:pPr>
-            <w:r>
-              <w:rPr>
-                <w:b/>
-                <w:color w:val="FFFFFF"/>
-                <w:sz w:val="16"/>
-              </w:rPr>
-              <w:t>例子</w:t>
-            </w:r>
-          </w:p>
-        </w:tc>
-        <w:tc>
-          <w:tcPr>
-            <w:tcW w:type="dxa" w:w="2891"/>
-            <w:shd w:fill="1F4E79"/>
-            <w:tcBorders>
-              <w:top w:val="single" w:sz="6" w:space="0" w:color="D9D9D9"/>
-              <w:left w:val="single" w:sz="6" w:space="0" w:color="D9D9D9"/>
-              <w:bottom w:val="single" w:sz="6" w:space="0" w:color="D9D9D9"/>
-              <w:right w:val="single" w:sz="6" w:space="0" w:color="D9D9D9"/>
-              <w:insideH w:val="single" w:sz="6" w:space="0" w:color="D9D9D9"/>
-              <w:insideV w:val="single" w:sz="6" w:space="0" w:color="D9D9D9"/>
-            </w:tcBorders>
-            <w:tcMar>
-              <w:top w:w="90" w:type="dxa"/>
-              <w:start w:w="110" w:type="dxa"/>
-              <w:bottom w:w="90" w:type="dxa"/>
-              <w:end w:w="110" w:type="dxa"/>
-            </w:tcMar>
-            <w:vAlign w:val="center"/>
-          </w:tcPr>
-          <w:p>
-            <w:pPr>
-              <w:pStyle w:val="SmallTable"/>
-              <w:jc w:val="center"/>
-            </w:pPr>
-            <w:r>
-              <w:rPr>
-                <w:b/>
-                <w:color w:val="FFFFFF"/>
-                <w:sz w:val="16"/>
-              </w:rPr>
-              <w:t>典型风险</w:t>
-            </w:r>
-          </w:p>
-        </w:tc>
-        <w:tc>
-          <w:tcPr>
-            <w:tcW w:type="dxa" w:w="2494"/>
-            <w:shd w:fill="1F4E79"/>
-            <w:tcBorders>
-              <w:top w:val="single" w:sz="6" w:space="0" w:color="D9D9D9"/>
-              <w:left w:val="single" w:sz="6" w:space="0" w:color="D9D9D9"/>
-              <w:bottom w:val="single" w:sz="6" w:space="0" w:color="D9D9D9"/>
-              <w:right w:val="single" w:sz="6" w:space="0" w:color="D9D9D9"/>
-              <w:insideH w:val="single" w:sz="6" w:space="0" w:color="D9D9D9"/>
-              <w:insideV w:val="single" w:sz="6" w:space="0" w:color="D9D9D9"/>
-            </w:tcBorders>
-            <w:tcMar>
-              <w:top w:w="90" w:type="dxa"/>
-              <w:start w:w="110" w:type="dxa"/>
-              <w:bottom w:w="90" w:type="dxa"/>
-              <w:end w:w="110" w:type="dxa"/>
-            </w:tcMar>
-            <w:vAlign w:val="center"/>
-          </w:tcPr>
-          <w:p>
-            <w:pPr>
-              <w:pStyle w:val="SmallTable"/>
-              <w:jc w:val="center"/>
-            </w:pPr>
-            <w:r>
-              <w:rPr>
-                <w:b/>
-                <w:color w:val="FFFFFF"/>
-                <w:sz w:val="16"/>
-              </w:rPr>
-              <w:t>第一版处理想法</w:t>
-            </w:r>
-          </w:p>
-        </w:tc>
-      </w:tr>
-      <w:tr>
-        <w:tc>
-          <w:tcPr>
-            <w:tcW w:type="dxa" w:w="2493"/>
-            <w:tcBorders>
-              <w:top w:val="single" w:sz="6" w:space="0" w:color="D9D9D9"/>
-              <w:left w:val="single" w:sz="6" w:space="0" w:color="D9D9D9"/>
-              <w:bottom w:val="single" w:sz="6" w:space="0" w:color="D9D9D9"/>
-              <w:right w:val="single" w:sz="6" w:space="0" w:color="D9D9D9"/>
-              <w:insideH w:val="single" w:sz="6" w:space="0" w:color="D9D9D9"/>
-              <w:insideV w:val="single" w:sz="6" w:space="0" w:color="D9D9D9"/>
-            </w:tcBorders>
-            <w:tcMar>
-              <w:top w:w="90" w:type="dxa"/>
-              <w:start w:w="110" w:type="dxa"/>
-              <w:bottom w:w="90" w:type="dxa"/>
-              <w:end w:w="110" w:type="dxa"/>
-            </w:tcMar>
-            <w:vAlign w:val="center"/>
-          </w:tcPr>
-          <w:p>
-            <w:pPr>
-              <w:pStyle w:val="SmallTable"/>
-              <w:jc w:val="center"/>
-            </w:pPr>
-            <w:r>
-              <w:rPr>
-                <w:sz w:val="16"/>
-              </w:rPr>
-              <w:t>心跳和状态</w:t>
-            </w:r>
-          </w:p>
-        </w:tc>
-        <w:tc>
-          <w:tcPr>
-            <w:tcW w:type="dxa" w:w="2493"/>
-            <w:tcBorders>
-              <w:top w:val="single" w:sz="6" w:space="0" w:color="D9D9D9"/>
-              <w:left w:val="single" w:sz="6" w:space="0" w:color="D9D9D9"/>
-              <w:bottom w:val="single" w:sz="6" w:space="0" w:color="D9D9D9"/>
-              <w:right w:val="single" w:sz="6" w:space="0" w:color="D9D9D9"/>
-              <w:insideH w:val="single" w:sz="6" w:space="0" w:color="D9D9D9"/>
-              <w:insideV w:val="single" w:sz="6" w:space="0" w:color="D9D9D9"/>
-            </w:tcBorders>
-            <w:tcMar>
-              <w:top w:w="90" w:type="dxa"/>
-              <w:start w:w="110" w:type="dxa"/>
-              <w:bottom w:w="90" w:type="dxa"/>
-              <w:end w:w="110" w:type="dxa"/>
-            </w:tcMar>
-            <w:vAlign w:val="center"/>
-          </w:tcPr>
-          <w:p>
-            <w:pPr>
-              <w:pStyle w:val="SmallTable"/>
-              <w:jc w:val="left"/>
-            </w:pPr>
-            <w:r>
-              <w:rPr>
-                <w:sz w:val="16"/>
-              </w:rPr>
-              <w:t>位姿、电量、任务阶段</w:t>
-            </w:r>
-          </w:p>
-        </w:tc>
-        <w:tc>
-          <w:tcPr>
-            <w:tcW w:type="dxa" w:w="2493"/>
-            <w:tcBorders>
-              <w:top w:val="single" w:sz="6" w:space="0" w:color="D9D9D9"/>
-              <w:left w:val="single" w:sz="6" w:space="0" w:color="D9D9D9"/>
-              <w:bottom w:val="single" w:sz="6" w:space="0" w:color="D9D9D9"/>
-              <w:right w:val="single" w:sz="6" w:space="0" w:color="D9D9D9"/>
-              <w:insideH w:val="single" w:sz="6" w:space="0" w:color="D9D9D9"/>
-              <w:insideV w:val="single" w:sz="6" w:space="0" w:color="D9D9D9"/>
-            </w:tcBorders>
-            <w:tcMar>
-              <w:top w:w="90" w:type="dxa"/>
-              <w:start w:w="110" w:type="dxa"/>
-              <w:bottom w:w="90" w:type="dxa"/>
-              <w:end w:w="110" w:type="dxa"/>
-            </w:tcMar>
-            <w:vAlign w:val="center"/>
-          </w:tcPr>
-          <w:p>
-            <w:pPr>
-              <w:pStyle w:val="SmallTable"/>
-              <w:jc w:val="left"/>
-            </w:pPr>
-            <w:r>
-              <w:rPr>
-                <w:sz w:val="16"/>
-              </w:rPr>
-              <w:t>丢一条可以接受，长期没有会误判掉线</w:t>
-            </w:r>
-          </w:p>
-        </w:tc>
-        <w:tc>
-          <w:tcPr>
-            <w:tcW w:type="dxa" w:w="2493"/>
-            <w:tcBorders>
-              <w:top w:val="single" w:sz="6" w:space="0" w:color="D9D9D9"/>
-              <w:left w:val="single" w:sz="6" w:space="0" w:color="D9D9D9"/>
-              <w:bottom w:val="single" w:sz="6" w:space="0" w:color="D9D9D9"/>
-              <w:right w:val="single" w:sz="6" w:space="0" w:color="D9D9D9"/>
-              <w:insideH w:val="single" w:sz="6" w:space="0" w:color="D9D9D9"/>
-              <w:insideV w:val="single" w:sz="6" w:space="0" w:color="D9D9D9"/>
-            </w:tcBorders>
-            <w:tcMar>
-              <w:top w:w="90" w:type="dxa"/>
-              <w:start w:w="110" w:type="dxa"/>
-              <w:bottom w:w="90" w:type="dxa"/>
-              <w:end w:w="110" w:type="dxa"/>
-            </w:tcMar>
-            <w:vAlign w:val="center"/>
-          </w:tcPr>
-          <w:p>
-            <w:pPr>
-              <w:pStyle w:val="SmallTable"/>
-              <w:jc w:val="left"/>
-            </w:pPr>
-            <w:r>
-              <w:rPr>
-                <w:sz w:val="16"/>
-              </w:rPr>
-              <w:t>小包、周期发送、允许旧包丢失</w:t>
-            </w:r>
-          </w:p>
-        </w:tc>
-      </w:tr>
-      <w:tr>
-        <w:tc>
-          <w:tcPr>
-            <w:tcW w:type="dxa" w:w="2493"/>
-            <w:tcBorders>
-              <w:top w:val="single" w:sz="6" w:space="0" w:color="D9D9D9"/>
-              <w:left w:val="single" w:sz="6" w:space="0" w:color="D9D9D9"/>
-              <w:bottom w:val="single" w:sz="6" w:space="0" w:color="D9D9D9"/>
-              <w:right w:val="single" w:sz="6" w:space="0" w:color="D9D9D9"/>
-              <w:insideH w:val="single" w:sz="6" w:space="0" w:color="D9D9D9"/>
-              <w:insideV w:val="single" w:sz="6" w:space="0" w:color="D9D9D9"/>
-            </w:tcBorders>
-            <w:tcMar>
-              <w:top w:w="90" w:type="dxa"/>
-              <w:start w:w="110" w:type="dxa"/>
-              <w:bottom w:w="90" w:type="dxa"/>
-              <w:end w:w="110" w:type="dxa"/>
-            </w:tcMar>
-            <w:vAlign w:val="center"/>
-            <w:shd w:fill="F7F9FB"/>
-          </w:tcPr>
-          <w:p>
-            <w:pPr>
-              <w:pStyle w:val="SmallTable"/>
-              <w:jc w:val="center"/>
-            </w:pPr>
-            <w:r>
-              <w:rPr>
-                <w:sz w:val="16"/>
-              </w:rPr>
-              <w:t>地图和 frontier</w:t>
-            </w:r>
-          </w:p>
-        </w:tc>
-        <w:tc>
-          <w:tcPr>
-            <w:tcW w:type="dxa" w:w="2493"/>
-            <w:tcBorders>
-              <w:top w:val="single" w:sz="6" w:space="0" w:color="D9D9D9"/>
-              <w:left w:val="single" w:sz="6" w:space="0" w:color="D9D9D9"/>
-              <w:bottom w:val="single" w:sz="6" w:space="0" w:color="D9D9D9"/>
-              <w:right w:val="single" w:sz="6" w:space="0" w:color="D9D9D9"/>
-              <w:insideH w:val="single" w:sz="6" w:space="0" w:color="D9D9D9"/>
-              <w:insideV w:val="single" w:sz="6" w:space="0" w:color="D9D9D9"/>
-            </w:tcBorders>
-            <w:tcMar>
-              <w:top w:w="90" w:type="dxa"/>
-              <w:start w:w="110" w:type="dxa"/>
-              <w:bottom w:w="90" w:type="dxa"/>
-              <w:end w:w="110" w:type="dxa"/>
-            </w:tcMar>
-            <w:vAlign w:val="center"/>
-            <w:shd w:fill="F7F9FB"/>
-          </w:tcPr>
-          <w:p>
-            <w:pPr>
-              <w:pStyle w:val="SmallTable"/>
-              <w:jc w:val="left"/>
-            </w:pPr>
-            <w:r>
-              <w:rPr>
-                <w:sz w:val="16"/>
-              </w:rPr>
-              <w:t>地图快照、局部地图、frontier 摘要</w:t>
-            </w:r>
-          </w:p>
-        </w:tc>
-        <w:tc>
-          <w:tcPr>
-            <w:tcW w:type="dxa" w:w="2493"/>
-            <w:tcBorders>
-              <w:top w:val="single" w:sz="6" w:space="0" w:color="D9D9D9"/>
-              <w:left w:val="single" w:sz="6" w:space="0" w:color="D9D9D9"/>
-              <w:bottom w:val="single" w:sz="6" w:space="0" w:color="D9D9D9"/>
-              <w:right w:val="single" w:sz="6" w:space="0" w:color="D9D9D9"/>
-              <w:insideH w:val="single" w:sz="6" w:space="0" w:color="D9D9D9"/>
-              <w:insideV w:val="single" w:sz="6" w:space="0" w:color="D9D9D9"/>
-            </w:tcBorders>
-            <w:tcMar>
-              <w:top w:w="90" w:type="dxa"/>
-              <w:start w:w="110" w:type="dxa"/>
-              <w:bottom w:w="90" w:type="dxa"/>
-              <w:end w:w="110" w:type="dxa"/>
-            </w:tcMar>
-            <w:vAlign w:val="center"/>
-            <w:shd w:fill="F7F9FB"/>
-          </w:tcPr>
-          <w:p>
-            <w:pPr>
-              <w:pStyle w:val="SmallTable"/>
-              <w:jc w:val="left"/>
-            </w:pPr>
-            <w:r>
-              <w:rPr>
-                <w:sz w:val="16"/>
-              </w:rPr>
-              <w:t>过期后可能引起重复探索或错误分工</w:t>
-            </w:r>
-          </w:p>
-        </w:tc>
-        <w:tc>
-          <w:tcPr>
-            <w:tcW w:type="dxa" w:w="2493"/>
-            <w:tcBorders>
-              <w:top w:val="single" w:sz="6" w:space="0" w:color="D9D9D9"/>
-              <w:left w:val="single" w:sz="6" w:space="0" w:color="D9D9D9"/>
-              <w:bottom w:val="single" w:sz="6" w:space="0" w:color="D9D9D9"/>
-              <w:right w:val="single" w:sz="6" w:space="0" w:color="D9D9D9"/>
-              <w:insideH w:val="single" w:sz="6" w:space="0" w:color="D9D9D9"/>
-              <w:insideV w:val="single" w:sz="6" w:space="0" w:color="D9D9D9"/>
-            </w:tcBorders>
-            <w:tcMar>
-              <w:top w:w="90" w:type="dxa"/>
-              <w:start w:w="110" w:type="dxa"/>
-              <w:bottom w:w="90" w:type="dxa"/>
-              <w:end w:w="110" w:type="dxa"/>
-            </w:tcMar>
-            <w:vAlign w:val="center"/>
-            <w:shd w:fill="F7F9FB"/>
-          </w:tcPr>
-          <w:p>
-            <w:pPr>
-              <w:pStyle w:val="SmallTable"/>
-              <w:jc w:val="left"/>
-            </w:pPr>
-            <w:r>
-              <w:rPr>
-                <w:sz w:val="16"/>
-              </w:rPr>
-              <w:t>版本替代、TTL、按需准入</w:t>
-            </w:r>
-          </w:p>
-        </w:tc>
-      </w:tr>
-      <w:tr>
-        <w:tc>
-          <w:tcPr>
-            <w:tcW w:type="dxa" w:w="2493"/>
-            <w:tcBorders>
-              <w:top w:val="single" w:sz="6" w:space="0" w:color="D9D9D9"/>
-              <w:left w:val="single" w:sz="6" w:space="0" w:color="D9D9D9"/>
-              <w:bottom w:val="single" w:sz="6" w:space="0" w:color="D9D9D9"/>
-              <w:right w:val="single" w:sz="6" w:space="0" w:color="D9D9D9"/>
-              <w:insideH w:val="single" w:sz="6" w:space="0" w:color="D9D9D9"/>
-              <w:insideV w:val="single" w:sz="6" w:space="0" w:color="D9D9D9"/>
-            </w:tcBorders>
-            <w:tcMar>
-              <w:top w:w="90" w:type="dxa"/>
-              <w:start w:w="110" w:type="dxa"/>
-              <w:bottom w:w="90" w:type="dxa"/>
-              <w:end w:w="110" w:type="dxa"/>
-            </w:tcMar>
-            <w:vAlign w:val="center"/>
-          </w:tcPr>
-          <w:p>
-            <w:pPr>
-              <w:pStyle w:val="SmallTable"/>
-              <w:jc w:val="center"/>
-            </w:pPr>
-            <w:r>
-              <w:rPr>
-                <w:sz w:val="16"/>
-              </w:rPr>
-              <w:t>目标事件</w:t>
-            </w:r>
-          </w:p>
-        </w:tc>
-        <w:tc>
-          <w:tcPr>
-            <w:tcW w:type="dxa" w:w="2493"/>
-            <w:tcBorders>
-              <w:top w:val="single" w:sz="6" w:space="0" w:color="D9D9D9"/>
-              <w:left w:val="single" w:sz="6" w:space="0" w:color="D9D9D9"/>
-              <w:bottom w:val="single" w:sz="6" w:space="0" w:color="D9D9D9"/>
-              <w:right w:val="single" w:sz="6" w:space="0" w:color="D9D9D9"/>
-              <w:insideH w:val="single" w:sz="6" w:space="0" w:color="D9D9D9"/>
-              <w:insideV w:val="single" w:sz="6" w:space="0" w:color="D9D9D9"/>
-            </w:tcBorders>
-            <w:tcMar>
-              <w:top w:w="90" w:type="dxa"/>
-              <w:start w:w="110" w:type="dxa"/>
-              <w:bottom w:w="90" w:type="dxa"/>
-              <w:end w:w="110" w:type="dxa"/>
-            </w:tcMar>
-            <w:vAlign w:val="center"/>
-          </w:tcPr>
-          <w:p>
-            <w:pPr>
-              <w:pStyle w:val="SmallTable"/>
-              <w:jc w:val="left"/>
-            </w:pPr>
-            <w:r>
-              <w:rPr>
-                <w:sz w:val="16"/>
-              </w:rPr>
-              <w:t>目标确认、目标位置</w:t>
-            </w:r>
-          </w:p>
-        </w:tc>
-        <w:tc>
-          <w:tcPr>
-            <w:tcW w:type="dxa" w:w="2493"/>
-            <w:tcBorders>
-              <w:top w:val="single" w:sz="6" w:space="0" w:color="D9D9D9"/>
-              <w:left w:val="single" w:sz="6" w:space="0" w:color="D9D9D9"/>
-              <w:bottom w:val="single" w:sz="6" w:space="0" w:color="D9D9D9"/>
-              <w:right w:val="single" w:sz="6" w:space="0" w:color="D9D9D9"/>
-              <w:insideH w:val="single" w:sz="6" w:space="0" w:color="D9D9D9"/>
-              <w:insideV w:val="single" w:sz="6" w:space="0" w:color="D9D9D9"/>
-            </w:tcBorders>
-            <w:tcMar>
-              <w:top w:w="90" w:type="dxa"/>
-              <w:start w:w="110" w:type="dxa"/>
-              <w:bottom w:w="90" w:type="dxa"/>
-              <w:end w:w="110" w:type="dxa"/>
-            </w:tcMar>
-            <w:vAlign w:val="center"/>
-          </w:tcPr>
-          <w:p>
-            <w:pPr>
-              <w:pStyle w:val="SmallTable"/>
-              <w:jc w:val="left"/>
-            </w:pPr>
-            <w:r>
-              <w:rPr>
-                <w:sz w:val="16"/>
-              </w:rPr>
-              <w:t>没送达会延迟进入集合阶段</w:t>
-            </w:r>
-          </w:p>
-        </w:tc>
-        <w:tc>
-          <w:tcPr>
-            <w:tcW w:type="dxa" w:w="2493"/>
-            <w:tcBorders>
-              <w:top w:val="single" w:sz="6" w:space="0" w:color="D9D9D9"/>
-              <w:left w:val="single" w:sz="6" w:space="0" w:color="D9D9D9"/>
-              <w:bottom w:val="single" w:sz="6" w:space="0" w:color="D9D9D9"/>
-              <w:right w:val="single" w:sz="6" w:space="0" w:color="D9D9D9"/>
-              <w:insideH w:val="single" w:sz="6" w:space="0" w:color="D9D9D9"/>
-              <w:insideV w:val="single" w:sz="6" w:space="0" w:color="D9D9D9"/>
-            </w:tcBorders>
-            <w:tcMar>
-              <w:top w:w="90" w:type="dxa"/>
-              <w:start w:w="110" w:type="dxa"/>
-              <w:bottom w:w="90" w:type="dxa"/>
-              <w:end w:w="110" w:type="dxa"/>
-            </w:tcMar>
-            <w:vAlign w:val="center"/>
-          </w:tcPr>
-          <w:p>
-            <w:pPr>
-              <w:pStyle w:val="SmallTable"/>
-              <w:jc w:val="left"/>
-            </w:pPr>
-            <w:r>
-              <w:rPr>
-                <w:sz w:val="16"/>
-              </w:rPr>
-              <w:t>关键事件、序号、ACK、有限重传</w:t>
-            </w:r>
-          </w:p>
-        </w:tc>
-      </w:tr>
-      <w:tr>
-        <w:tc>
-          <w:tcPr>
-            <w:tcW w:type="dxa" w:w="2493"/>
-            <w:tcBorders>
-              <w:top w:val="single" w:sz="6" w:space="0" w:color="D9D9D9"/>
-              <w:left w:val="single" w:sz="6" w:space="0" w:color="D9D9D9"/>
-              <w:bottom w:val="single" w:sz="6" w:space="0" w:color="D9D9D9"/>
-              <w:right w:val="single" w:sz="6" w:space="0" w:color="D9D9D9"/>
-              <w:insideH w:val="single" w:sz="6" w:space="0" w:color="D9D9D9"/>
-              <w:insideV w:val="single" w:sz="6" w:space="0" w:color="D9D9D9"/>
-            </w:tcBorders>
-            <w:tcMar>
-              <w:top w:w="90" w:type="dxa"/>
-              <w:start w:w="110" w:type="dxa"/>
-              <w:bottom w:w="90" w:type="dxa"/>
-              <w:end w:w="110" w:type="dxa"/>
-            </w:tcMar>
-            <w:vAlign w:val="center"/>
-            <w:shd w:fill="F7F9FB"/>
-          </w:tcPr>
-          <w:p>
-            <w:pPr>
-              <w:pStyle w:val="SmallTable"/>
-              <w:jc w:val="center"/>
-            </w:pPr>
-            <w:r>
-              <w:rPr>
-                <w:sz w:val="16"/>
-              </w:rPr>
-              <w:t>安全和控制</w:t>
-            </w:r>
-          </w:p>
-        </w:tc>
-        <w:tc>
-          <w:tcPr>
-            <w:tcW w:type="dxa" w:w="2493"/>
-            <w:tcBorders>
-              <w:top w:val="single" w:sz="6" w:space="0" w:color="D9D9D9"/>
-              <w:left w:val="single" w:sz="6" w:space="0" w:color="D9D9D9"/>
-              <w:bottom w:val="single" w:sz="6" w:space="0" w:color="D9D9D9"/>
-              <w:right w:val="single" w:sz="6" w:space="0" w:color="D9D9D9"/>
-              <w:insideH w:val="single" w:sz="6" w:space="0" w:color="D9D9D9"/>
-              <w:insideV w:val="single" w:sz="6" w:space="0" w:color="D9D9D9"/>
-            </w:tcBorders>
-            <w:tcMar>
-              <w:top w:w="90" w:type="dxa"/>
-              <w:start w:w="110" w:type="dxa"/>
-              <w:bottom w:w="90" w:type="dxa"/>
-              <w:end w:w="110" w:type="dxa"/>
-            </w:tcMar>
-            <w:vAlign w:val="center"/>
-            <w:shd w:fill="F7F9FB"/>
-          </w:tcPr>
-          <w:p>
-            <w:pPr>
-              <w:pStyle w:val="SmallTable"/>
-              <w:jc w:val="left"/>
-            </w:pPr>
-            <w:r>
-              <w:rPr>
-                <w:sz w:val="16"/>
-              </w:rPr>
-              <w:t>返航、集合、急停</w:t>
-            </w:r>
-          </w:p>
-        </w:tc>
-        <w:tc>
-          <w:tcPr>
-            <w:tcW w:type="dxa" w:w="2493"/>
-            <w:tcBorders>
-              <w:top w:val="single" w:sz="6" w:space="0" w:color="D9D9D9"/>
-              <w:left w:val="single" w:sz="6" w:space="0" w:color="D9D9D9"/>
-              <w:bottom w:val="single" w:sz="6" w:space="0" w:color="D9D9D9"/>
-              <w:right w:val="single" w:sz="6" w:space="0" w:color="D9D9D9"/>
-              <w:insideH w:val="single" w:sz="6" w:space="0" w:color="D9D9D9"/>
-              <w:insideV w:val="single" w:sz="6" w:space="0" w:color="D9D9D9"/>
-            </w:tcBorders>
-            <w:tcMar>
-              <w:top w:w="90" w:type="dxa"/>
-              <w:start w:w="110" w:type="dxa"/>
-              <w:bottom w:w="90" w:type="dxa"/>
-              <w:end w:w="110" w:type="dxa"/>
-            </w:tcMar>
-            <w:vAlign w:val="center"/>
-            <w:shd w:fill="F7F9FB"/>
-          </w:tcPr>
-          <w:p>
-            <w:pPr>
-              <w:pStyle w:val="SmallTable"/>
-              <w:jc w:val="left"/>
-            </w:pPr>
-            <w:r>
-              <w:rPr>
-                <w:sz w:val="16"/>
-              </w:rPr>
-              <w:t>延迟可能直接改变安全行为</w:t>
-            </w:r>
-          </w:p>
-        </w:tc>
-        <w:tc>
-          <w:tcPr>
-            <w:tcW w:type="dxa" w:w="2493"/>
-            <w:tcBorders>
-              <w:top w:val="single" w:sz="6" w:space="0" w:color="D9D9D9"/>
-              <w:left w:val="single" w:sz="6" w:space="0" w:color="D9D9D9"/>
-              <w:bottom w:val="single" w:sz="6" w:space="0" w:color="D9D9D9"/>
-              <w:right w:val="single" w:sz="6" w:space="0" w:color="D9D9D9"/>
-              <w:insideH w:val="single" w:sz="6" w:space="0" w:color="D9D9D9"/>
-              <w:insideV w:val="single" w:sz="6" w:space="0" w:color="D9D9D9"/>
-            </w:tcBorders>
-            <w:tcMar>
-              <w:top w:w="90" w:type="dxa"/>
-              <w:start w:w="110" w:type="dxa"/>
-              <w:bottom w:w="90" w:type="dxa"/>
-              <w:end w:w="110" w:type="dxa"/>
-            </w:tcMar>
-            <w:vAlign w:val="center"/>
-            <w:shd w:fill="F7F9FB"/>
-          </w:tcPr>
-          <w:p>
-            <w:pPr>
-              <w:pStyle w:val="SmallTable"/>
-              <w:jc w:val="left"/>
-            </w:pPr>
-            <w:r>
-              <w:rPr>
-                <w:sz w:val="16"/>
-              </w:rPr>
-              <w:t>最大等待、本地安全降级、有限重试</w:t>
-            </w:r>
-          </w:p>
-        </w:tc>
-      </w:tr>
-    </w:tbl>
-    <w:p>
-      <w:pPr>
-        <w:spacing w:after="40"/>
-      </w:pPr>
-    </w:p>
-    <w:p>
-      <w:pPr>
-        <w:pStyle w:val="Heading2"/>
-      </w:pPr>
-      <w:r>
-        <w:rPr>
-          <w:i w:val="0"/>
-        </w:rPr>
-        <w:t>2.2 任务闭环要求因果证据</w:t>
-      </w:r>
-    </w:p>
-    <w:p>
-      <w:pPr>
-        <w:spacing w:before="60" w:after="140"/>
-        <w:ind w:left="227" w:right="227"/>
-        <w:shd w:fill="F3F5F7"/>
-      </w:pPr>
-      <w:r>
-        <w:rPr>
-          <w:rFonts w:ascii="Noto Sans Mono CJK SC" w:hAnsi="Noto Sans Mono CJK SC" w:eastAsia="Noto Sans Mono CJK SC"/>
-          <w:sz w:val="17"/>
-        </w:rPr>
-        <w:t>消息候选 / 请求</w:t>
-        <w:br/>
-      </w:r>
-      <w:r>
-        <w:rPr>
-          <w:rFonts w:ascii="Noto Sans Mono CJK SC" w:hAnsi="Noto Sans Mono CJK SC" w:eastAsia="Noto Sans Mono CJK SC"/>
-          <w:sz w:val="17"/>
-        </w:rPr>
-        <w:t xml:space="preserve">  → 准入决策</w:t>
-        <w:br/>
-      </w:r>
-      <w:r>
-        <w:rPr>
-          <w:rFonts w:ascii="Noto Sans Mono CJK SC" w:hAnsi="Noto Sans Mono CJK SC" w:eastAsia="Noto Sans Mono CJK SC"/>
-          <w:sz w:val="17"/>
-        </w:rPr>
-        <w:t xml:space="preserve">  → 进入队列、竞争、重传</w:t>
-        <w:br/>
-      </w:r>
-      <w:r>
-        <w:rPr>
-          <w:rFonts w:ascii="Noto Sans Mono CJK SC" w:hAnsi="Noto Sans Mono CJK SC" w:eastAsia="Noto Sans Mono CJK SC"/>
-          <w:sz w:val="17"/>
-        </w:rPr>
-        <w:t xml:space="preserve">  → 交付或过期</w:t>
-        <w:br/>
-      </w:r>
-      <w:r>
-        <w:rPr>
-          <w:rFonts w:ascii="Noto Sans Mono CJK SC" w:hAnsi="Noto Sans Mono CJK SC" w:eastAsia="Noto Sans Mono CJK SC"/>
-          <w:sz w:val="17"/>
-        </w:rPr>
-        <w:t xml:space="preserve">  → 接收端地图 / 状态版本变化</w:t>
-        <w:br/>
-      </w:r>
-      <w:r>
-        <w:rPr>
-          <w:rFonts w:ascii="Noto Sans Mono CJK SC" w:hAnsi="Noto Sans Mono CJK SC" w:eastAsia="Noto Sans Mono CJK SC"/>
-          <w:sz w:val="17"/>
-        </w:rPr>
-        <w:t xml:space="preserve">  → frontier 分配或目标集合改变</w:t>
-        <w:br/>
-      </w:r>
-      <w:r>
-        <w:rPr>
-          <w:rFonts w:ascii="Noto Sans Mono CJK SC" w:hAnsi="Noto Sans Mono CJK SC" w:eastAsia="Noto Sans Mono CJK SC"/>
-          <w:sz w:val="17"/>
-        </w:rPr>
-        <w:t xml:space="preserve">  → 机器人路径和运动改变</w:t>
-        <w:br/>
-      </w:r>
-      <w:r>
-        <w:rPr>
-          <w:rFonts w:ascii="Noto Sans Mono CJK SC" w:hAnsi="Noto Sans Mono CJK SC" w:eastAsia="Noto Sans Mono CJK SC"/>
-          <w:sz w:val="17"/>
-        </w:rPr>
-        <w:t xml:space="preserve">  → 覆盖率、完成时间、能量和安全结果改变</w:t>
-      </w:r>
-    </w:p>
-    <w:p>
-      <w:pPr/>
-      <w:r>
-        <w:rPr>
-          <w:i w:val="0"/>
-        </w:rPr>
-        <w:t>项目里需要保留上面这条链，而不是只在旁边跑一个 ns-3 仿真并同时记录几个网络指标。日志中要区分 `source_time`、`enqueue_time`、`admit_time`、`tx_time`、`delivery_time`、`consume_time`、`drop_time`、消息 ID、版本和尝试次数。否则只能知道“发生了丢包”，不知道丢包是否真的影响了任务。</w:t>
-      </w:r>
-    </w:p>
-    <w:p>
-      <w:r>
-        <w:br w:type="page"/>
-      </w:r>
-    </w:p>
-    <w:p>
-      <w:pPr>
-        <w:pStyle w:val="Heading1"/>
-      </w:pPr>
-      <w:r>
-        <w:rPr>
-          <w:i w:val="0"/>
-        </w:rPr>
-        <w:t>3 11 篇论文带来的问题地图</w:t>
-      </w:r>
-    </w:p>
-    <w:p>
-      <w:pPr/>
-      <w:r>
-        <w:rPr>
-          <w:i w:val="0"/>
-        </w:rPr>
-        <w:t>这批文献没有给出一个可以直接复制的方案，但把问题分成了几个相互连接的领域。下面的归纳来自 `260929_report` 目录下的 11 篇论文、`综述论文调研.docx` 和 2026-09-29 教师研究路线评审。</w:t>
-      </w:r>
-    </w:p>
-    <w:p>
-      <w:pPr>
-        <w:pStyle w:val="Heading2"/>
-      </w:pPr>
-      <w:r>
-        <w:rPr>
-          <w:i w:val="0"/>
-        </w:rPr>
-        <w:t>3.1 逐篇放置</w:t>
-      </w:r>
-    </w:p>
-    <w:tbl>
-      <w:tblPr>
-        <w:tblStyle w:val="TableGrid"/>
-        <w:tblW w:type="auto" w:w="0"/>
-        <w:jc w:val="center"/>
-        <w:tblLook w:firstColumn="1" w:firstRow="1" w:lastColumn="0" w:lastRow="0" w:noHBand="0" w:noVBand="1" w:val="04A0"/>
-      </w:tblPr>
-      <w:tblGrid>
-        <w:gridCol w:w="2493"/>
-        <w:gridCol w:w="2493"/>
-        <w:gridCol w:w="2493"/>
-        <w:gridCol w:w="2493"/>
-      </w:tblGrid>
-      <w:tr>
-        <w:trPr>
-          <w:tblHeader w:val="true"/>
-        </w:trPr>
-        <w:tc>
-          <w:tcPr>
-            <w:tcW w:type="dxa" w:w="1361"/>
+            <w:tcW w:type="dxa" w:w="1446"/>
             <w:shd w:fill="1F4E79"/>
             <w:tcBorders>
               <w:top w:val="single" w:sz="6" w:space="0" w:color="D9D9D9"/>
@@ -1308,13 +809,13 @@
                 <w:color w:val="FFFFFF"/>
                 <w:sz w:val="15"/>
               </w:rPr>
-              <w:t>方向</w:t>
+              <w:t>文献群</w:t>
             </w:r>
           </w:p>
         </w:tc>
         <w:tc>
           <w:tcPr>
-            <w:tcW w:type="dxa" w:w="2438"/>
+            <w:tcW w:type="dxa" w:w="2353"/>
             <w:shd w:fill="1F4E79"/>
             <w:tcBorders>
               <w:top w:val="single" w:sz="6" w:space="0" w:color="D9D9D9"/>
@@ -1343,13 +844,13 @@
                 <w:color w:val="FFFFFF"/>
                 <w:sz w:val="15"/>
               </w:rPr>
-              <w:t>文献</w:t>
+              <w:t>目录中的代表论文</w:t>
             </w:r>
           </w:p>
         </w:tc>
         <w:tc>
           <w:tcPr>
-            <w:tcW w:type="dxa" w:w="2948"/>
+            <w:tcW w:type="dxa" w:w="2835"/>
             <w:shd w:fill="1F4E79"/>
             <w:tcBorders>
               <w:top w:val="single" w:sz="6" w:space="0" w:color="D9D9D9"/>
@@ -1378,13 +879,13 @@
                 <w:color w:val="FFFFFF"/>
                 <w:sz w:val="15"/>
               </w:rPr>
-              <w:t>它主要关心什么</w:t>
+              <w:t>共同关注</w:t>
             </w:r>
           </w:p>
         </w:tc>
         <w:tc>
           <w:tcPr>
-            <w:tcW w:type="dxa" w:w="2381"/>
+            <w:tcW w:type="dxa" w:w="2268"/>
             <w:shd w:fill="1F4E79"/>
             <w:tcBorders>
               <w:top w:val="single" w:sz="6" w:space="0" w:color="D9D9D9"/>
@@ -1413,7 +914,7 @@
                 <w:color w:val="FFFFFF"/>
                 <w:sz w:val="15"/>
               </w:rPr>
-              <w:t>对当前项目的启发和边界</w:t>
+              <w:t>对当前路线的帮助</w:t>
             </w:r>
           </w:p>
         </w:tc>
@@ -1447,7 +948,7 @@
               <w:rPr>
                 <w:sz w:val="15"/>
               </w:rPr>
-              <w:t>通信 DRL</w:t>
+              <w:t>通信资源与 DRL</w:t>
             </w:r>
           </w:p>
         </w:tc>
@@ -1479,14 +980,7 @@
               <w:rPr>
                 <w:sz w:val="15"/>
               </w:rPr>
-              <w:t>Luong 等，2019</w:t>
-              <w:br/>
-            </w:r>
-            <w:r>
-              <w:rPr>
-                <w:sz w:val="15"/>
-              </w:rPr>
-              <w:t>Applications of DRL in Communications and Networking</w:t>
+              <w:t>2019 DRL 通信综述；2021/2022 无线资源分配综述；2023 多 UAV 无线网络；2026 动态资源分配综述</w:t>
             </w:r>
           </w:p>
         </w:tc>
@@ -1518,7 +1012,7 @@
               <w:rPr>
                 <w:sz w:val="15"/>
               </w:rPr>
-              <w:t>频谱接入、速率控制、缓存、卸载、路由、资源共享的 DRL 建模</w:t>
+              <w:t>动态网络中的资源、轨迹、接入、AoI、MARL/CTDE，以及稳定性、泛化和部署</w:t>
             </w:r>
           </w:p>
         </w:tc>
@@ -1550,7 +1044,7 @@
               <w:rPr>
                 <w:sz w:val="15"/>
               </w:rPr>
-              <w:t>提供状态—动作—奖励语言；原综述主要面向网络指标，项目还要验证任务闭环</w:t>
+              <w:t>提供网络决策语言；把 RL 放在负载审计和强基线之后</w:t>
             </w:r>
           </w:p>
         </w:tc>
@@ -1585,7 +1079,7 @@
               <w:rPr>
                 <w:sz w:val="15"/>
               </w:rPr>
-              <w:t>无线资源分配</w:t>
+              <w:t>机器人—网络协同</w:t>
             </w:r>
           </w:p>
         </w:tc>
@@ -1618,14 +1112,7 @@
               <w:rPr>
                 <w:sz w:val="15"/>
               </w:rPr>
-              <w:t>Alwarafy 等，2021/2022</w:t>
-              <w:br/>
-            </w:r>
-            <w:r>
-              <w:rPr>
-                <w:sz w:val="15"/>
-              </w:rPr>
-              <w:t>DRL for RRAM in HetNets</w:t>
+              <w:t>2022 多机器人通信 critical review；2026 多机器人协作通信综述</w:t>
             </w:r>
           </w:p>
         </w:tc>
@@ -1658,7 +1145,7 @@
               <w:rPr>
                 <w:sz w:val="15"/>
               </w:rPr>
-              <w:t>DQN、DDPG 等用于异构网络资源分配，讨论连续动作和复杂度</w:t>
+              <w:t>通信与机器人共同设计，拓扑、异构、规模、协议和 sim-to-real</w:t>
             </w:r>
           </w:p>
         </w:tc>
@@ -1691,7 +1178,7 @@
               <w:rPr>
                 <w:sz w:val="15"/>
               </w:rPr>
-              <w:t>说明 RL 适合动态、非凸、模型不完备问题；不能据此直接声称 RL 比强规则方法好</w:t>
+              <w:t>要求记录通信如何改变任务，而不是只报告网络指标</w:t>
             </w:r>
           </w:p>
         </w:tc>
@@ -1725,7 +1212,7 @@
               <w:rPr>
                 <w:sz w:val="15"/>
               </w:rPr>
-              <w:t>多 UAV 无线网络</w:t>
+              <w:t>任务导向与信息新鲜度</w:t>
             </w:r>
           </w:p>
         </w:tc>
@@ -1757,14 +1244,7 @@
               <w:rPr>
                 <w:sz w:val="15"/>
               </w:rPr>
-              <w:t>Bai 等，2023</w:t>
-              <w:br/>
-            </w:r>
-            <w:r>
-              <w:rPr>
-                <w:sz w:val="15"/>
-              </w:rPr>
-              <w:t>Toward Autonomous Multi-UAV Wireless Network</w:t>
+              <w:t>Goal-oriented communication；reasoning-empowered TOC；AoI 综述</w:t>
             </w:r>
           </w:p>
         </w:tc>
@@ -1796,7 +1276,7 @@
               <w:rPr>
                 <w:sz w:val="15"/>
               </w:rPr>
-              <w:t>轨迹、通信资源、多目标优化、MARL/CTDE、MADDPG、COMA、MAPPO、AoI</w:t>
+              <w:t>what/when/why to communicate、VoI、AoI、内容价值和资源约束</w:t>
             </w:r>
           </w:p>
         </w:tc>
@@ -1828,7 +1308,7 @@
               <w:rPr>
                 <w:sz w:val="15"/>
               </w:rPr>
-              <w:t>提醒奖励量纲、局部观测、规模和部署安全困难；当前先采用中央单智能体</w:t>
+              <w:t>形成“消息价值 = 任务贡献 + 时效 + 代价”的工作假设</w:t>
             </w:r>
           </w:p>
         </w:tc>
@@ -1863,7 +1343,7 @@
               <w:rPr>
                 <w:sz w:val="15"/>
               </w:rPr>
-              <w:t>动态资源分配</w:t>
+              <w:t>多机器人任务与探索</w:t>
             </w:r>
           </w:p>
         </w:tc>
@@ -1896,14 +1376,7 @@
               <w:rPr>
                 <w:sz w:val="15"/>
               </w:rPr>
-              <w:t>Clinton 等，2026</w:t>
-              <w:br/>
-            </w:r>
-            <w:r>
-              <w:rPr>
-                <w:sz w:val="15"/>
-              </w:rPr>
-              <w:t>Adaptive resource allocation in dynamic wireless environments</w:t>
+              <w:t>Sensors 多机器人 DRL；多机器人协同探索综述</w:t>
             </w:r>
           </w:p>
         </w:tc>
@@ -1936,7 +1409,7 @@
               <w:rPr>
                 <w:sz w:val="15"/>
               </w:rPr>
-              <w:t>优化、DRL、MARL 和混合方法；训练稳定、泛化、扩展和真实验证</w:t>
+              <w:t>覆盖、建图、frontier、分配、导航和团队协作</w:t>
             </w:r>
           </w:p>
         </w:tc>
@@ -1969,971 +1442,7 @@
               <w:rPr>
                 <w:sz w:val="15"/>
               </w:rPr>
-              <w:t>支持先测真实负载再决定学习；实物验证本身不是方法创新</w:t>
-            </w:r>
-          </w:p>
-        </w:tc>
-      </w:tr>
-      <w:tr>
-        <w:tc>
-          <w:tcPr>
-            <w:tcW w:type="dxa" w:w="2493"/>
-            <w:tcBorders>
-              <w:top w:val="single" w:sz="6" w:space="0" w:color="D9D9D9"/>
-              <w:left w:val="single" w:sz="6" w:space="0" w:color="D9D9D9"/>
-              <w:bottom w:val="single" w:sz="6" w:space="0" w:color="D9D9D9"/>
-              <w:right w:val="single" w:sz="6" w:space="0" w:color="D9D9D9"/>
-              <w:insideH w:val="single" w:sz="6" w:space="0" w:color="D9D9D9"/>
-              <w:insideV w:val="single" w:sz="6" w:space="0" w:color="D9D9D9"/>
-            </w:tcBorders>
-            <w:tcMar>
-              <w:top w:w="90" w:type="dxa"/>
-              <w:start w:w="110" w:type="dxa"/>
-              <w:bottom w:w="90" w:type="dxa"/>
-              <w:end w:w="110" w:type="dxa"/>
-            </w:tcMar>
-            <w:vAlign w:val="center"/>
-          </w:tcPr>
-          <w:p>
-            <w:pPr>
-              <w:pStyle w:val="SmallTable"/>
-              <w:jc w:val="center"/>
-            </w:pPr>
-            <w:r>
-              <w:rPr>
-                <w:sz w:val="15"/>
-              </w:rPr>
-              <w:t>多机器人通信协同</w:t>
-            </w:r>
-          </w:p>
-        </w:tc>
-        <w:tc>
-          <w:tcPr>
-            <w:tcW w:type="dxa" w:w="2493"/>
-            <w:tcBorders>
-              <w:top w:val="single" w:sz="6" w:space="0" w:color="D9D9D9"/>
-              <w:left w:val="single" w:sz="6" w:space="0" w:color="D9D9D9"/>
-              <w:bottom w:val="single" w:sz="6" w:space="0" w:color="D9D9D9"/>
-              <w:right w:val="single" w:sz="6" w:space="0" w:color="D9D9D9"/>
-              <w:insideH w:val="single" w:sz="6" w:space="0" w:color="D9D9D9"/>
-              <w:insideV w:val="single" w:sz="6" w:space="0" w:color="D9D9D9"/>
-            </w:tcBorders>
-            <w:tcMar>
-              <w:top w:w="90" w:type="dxa"/>
-              <w:start w:w="110" w:type="dxa"/>
-              <w:bottom w:w="90" w:type="dxa"/>
-              <w:end w:w="110" w:type="dxa"/>
-            </w:tcMar>
-            <w:vAlign w:val="center"/>
-          </w:tcPr>
-          <w:p>
-            <w:pPr>
-              <w:pStyle w:val="SmallTable"/>
-              <w:jc w:val="left"/>
-            </w:pPr>
-            <w:r>
-              <w:rPr>
-                <w:sz w:val="15"/>
-              </w:rPr>
-              <w:t>Gielis 等，2022</w:t>
-              <w:br/>
-            </w:r>
-            <w:r>
-              <w:rPr>
-                <w:sz w:val="15"/>
-              </w:rPr>
-              <w:t>A Critical Review of Communications in Multi-robot Systems</w:t>
-            </w:r>
-          </w:p>
-        </w:tc>
-        <w:tc>
-          <w:tcPr>
-            <w:tcW w:type="dxa" w:w="2493"/>
-            <w:tcBorders>
-              <w:top w:val="single" w:sz="6" w:space="0" w:color="D9D9D9"/>
-              <w:left w:val="single" w:sz="6" w:space="0" w:color="D9D9D9"/>
-              <w:bottom w:val="single" w:sz="6" w:space="0" w:color="D9D9D9"/>
-              <w:right w:val="single" w:sz="6" w:space="0" w:color="D9D9D9"/>
-              <w:insideH w:val="single" w:sz="6" w:space="0" w:color="D9D9D9"/>
-              <w:insideV w:val="single" w:sz="6" w:space="0" w:color="D9D9D9"/>
-            </w:tcBorders>
-            <w:tcMar>
-              <w:top w:w="90" w:type="dxa"/>
-              <w:start w:w="110" w:type="dxa"/>
-              <w:bottom w:w="90" w:type="dxa"/>
-              <w:end w:w="110" w:type="dxa"/>
-            </w:tcMar>
-            <w:vAlign w:val="center"/>
-          </w:tcPr>
-          <w:p>
-            <w:pPr>
-              <w:pStyle w:val="SmallTable"/>
-              <w:jc w:val="left"/>
-            </w:pPr>
-            <w:r>
-              <w:rPr>
-                <w:sz w:val="15"/>
-              </w:rPr>
-              <w:t>通信与运动、控制、网络共同设计，关注数据驱动和 sim-to-real</w:t>
-            </w:r>
-          </w:p>
-        </w:tc>
-        <w:tc>
-          <w:tcPr>
-            <w:tcW w:type="dxa" w:w="2493"/>
-            <w:tcBorders>
-              <w:top w:val="single" w:sz="6" w:space="0" w:color="D9D9D9"/>
-              <w:left w:val="single" w:sz="6" w:space="0" w:color="D9D9D9"/>
-              <w:bottom w:val="single" w:sz="6" w:space="0" w:color="D9D9D9"/>
-              <w:right w:val="single" w:sz="6" w:space="0" w:color="D9D9D9"/>
-              <w:insideH w:val="single" w:sz="6" w:space="0" w:color="D9D9D9"/>
-              <w:insideV w:val="single" w:sz="6" w:space="0" w:color="D9D9D9"/>
-            </w:tcBorders>
-            <w:tcMar>
-              <w:top w:w="90" w:type="dxa"/>
-              <w:start w:w="110" w:type="dxa"/>
-              <w:bottom w:w="90" w:type="dxa"/>
-              <w:end w:w="110" w:type="dxa"/>
-            </w:tcMar>
-            <w:vAlign w:val="center"/>
-          </w:tcPr>
-          <w:p>
-            <w:pPr>
-              <w:pStyle w:val="SmallTable"/>
-              <w:jc w:val="left"/>
-            </w:pPr>
-            <w:r>
-              <w:rPr>
-                <w:sz w:val="15"/>
-              </w:rPr>
-              <w:t>强化系统视角；“多机器人 + 真实 Wi-Fi”不能单独作为创新</w:t>
-            </w:r>
-          </w:p>
-        </w:tc>
-      </w:tr>
-      <w:tr>
-        <w:tc>
-          <w:tcPr>
-            <w:tcW w:type="dxa" w:w="2493"/>
-            <w:tcBorders>
-              <w:top w:val="single" w:sz="6" w:space="0" w:color="D9D9D9"/>
-              <w:left w:val="single" w:sz="6" w:space="0" w:color="D9D9D9"/>
-              <w:bottom w:val="single" w:sz="6" w:space="0" w:color="D9D9D9"/>
-              <w:right w:val="single" w:sz="6" w:space="0" w:color="D9D9D9"/>
-              <w:insideH w:val="single" w:sz="6" w:space="0" w:color="D9D9D9"/>
-              <w:insideV w:val="single" w:sz="6" w:space="0" w:color="D9D9D9"/>
-            </w:tcBorders>
-            <w:tcMar>
-              <w:top w:w="90" w:type="dxa"/>
-              <w:start w:w="110" w:type="dxa"/>
-              <w:bottom w:w="90" w:type="dxa"/>
-              <w:end w:w="110" w:type="dxa"/>
-            </w:tcMar>
-            <w:vAlign w:val="center"/>
-            <w:shd w:fill="F7F9FB"/>
-          </w:tcPr>
-          <w:p>
-            <w:pPr>
-              <w:pStyle w:val="SmallTable"/>
-              <w:jc w:val="center"/>
-            </w:pPr>
-            <w:r>
-              <w:rPr>
-                <w:sz w:val="15"/>
-              </w:rPr>
-              <w:t>多机器人协作通信</w:t>
-            </w:r>
-          </w:p>
-        </w:tc>
-        <w:tc>
-          <w:tcPr>
-            <w:tcW w:type="dxa" w:w="2493"/>
-            <w:tcBorders>
-              <w:top w:val="single" w:sz="6" w:space="0" w:color="D9D9D9"/>
-              <w:left w:val="single" w:sz="6" w:space="0" w:color="D9D9D9"/>
-              <w:bottom w:val="single" w:sz="6" w:space="0" w:color="D9D9D9"/>
-              <w:right w:val="single" w:sz="6" w:space="0" w:color="D9D9D9"/>
-              <w:insideH w:val="single" w:sz="6" w:space="0" w:color="D9D9D9"/>
-              <w:insideV w:val="single" w:sz="6" w:space="0" w:color="D9D9D9"/>
-            </w:tcBorders>
-            <w:tcMar>
-              <w:top w:w="90" w:type="dxa"/>
-              <w:start w:w="110" w:type="dxa"/>
-              <w:bottom w:w="90" w:type="dxa"/>
-              <w:end w:w="110" w:type="dxa"/>
-            </w:tcMar>
-            <w:vAlign w:val="center"/>
-            <w:shd w:fill="F7F9FB"/>
-          </w:tcPr>
-          <w:p>
-            <w:pPr>
-              <w:pStyle w:val="SmallTable"/>
-              <w:jc w:val="left"/>
-            </w:pPr>
-            <w:r>
-              <w:rPr>
-                <w:sz w:val="15"/>
-              </w:rPr>
-              <w:t>A Survey on Multi-Robot Collaboration and Communication，2026 预印本</w:t>
-            </w:r>
-          </w:p>
-        </w:tc>
-        <w:tc>
-          <w:tcPr>
-            <w:tcW w:type="dxa" w:w="2493"/>
-            <w:tcBorders>
-              <w:top w:val="single" w:sz="6" w:space="0" w:color="D9D9D9"/>
-              <w:left w:val="single" w:sz="6" w:space="0" w:color="D9D9D9"/>
-              <w:bottom w:val="single" w:sz="6" w:space="0" w:color="D9D9D9"/>
-              <w:right w:val="single" w:sz="6" w:space="0" w:color="D9D9D9"/>
-              <w:insideH w:val="single" w:sz="6" w:space="0" w:color="D9D9D9"/>
-              <w:insideV w:val="single" w:sz="6" w:space="0" w:color="D9D9D9"/>
-            </w:tcBorders>
-            <w:tcMar>
-              <w:top w:w="90" w:type="dxa"/>
-              <w:start w:w="110" w:type="dxa"/>
-              <w:bottom w:w="90" w:type="dxa"/>
-              <w:end w:w="110" w:type="dxa"/>
-            </w:tcMar>
-            <w:vAlign w:val="center"/>
-            <w:shd w:fill="F7F9FB"/>
-          </w:tcPr>
-          <w:p>
-            <w:pPr>
-              <w:pStyle w:val="SmallTable"/>
-              <w:jc w:val="left"/>
-            </w:pPr>
-            <w:r>
-              <w:rPr>
-                <w:sz w:val="15"/>
-              </w:rPr>
-              <w:t>图论、Swarm-SLAM、Wi-Fi/蓝牙/Zigbee/LoRa、异构和大规模拓扑</w:t>
-            </w:r>
-          </w:p>
-        </w:tc>
-        <w:tc>
-          <w:tcPr>
-            <w:tcW w:type="dxa" w:w="2493"/>
-            <w:tcBorders>
-              <w:top w:val="single" w:sz="6" w:space="0" w:color="D9D9D9"/>
-              <w:left w:val="single" w:sz="6" w:space="0" w:color="D9D9D9"/>
-              <w:bottom w:val="single" w:sz="6" w:space="0" w:color="D9D9D9"/>
-              <w:right w:val="single" w:sz="6" w:space="0" w:color="D9D9D9"/>
-              <w:insideH w:val="single" w:sz="6" w:space="0" w:color="D9D9D9"/>
-              <w:insideV w:val="single" w:sz="6" w:space="0" w:color="D9D9D9"/>
-            </w:tcBorders>
-            <w:tcMar>
-              <w:top w:w="90" w:type="dxa"/>
-              <w:start w:w="110" w:type="dxa"/>
-              <w:bottom w:w="90" w:type="dxa"/>
-              <w:end w:w="110" w:type="dxa"/>
-            </w:tcMar>
-            <w:vAlign w:val="center"/>
-            <w:shd w:fill="F7F9FB"/>
-          </w:tcPr>
-          <w:p>
-            <w:pPr>
-              <w:pStyle w:val="SmallTable"/>
-              <w:jc w:val="left"/>
-            </w:pPr>
-            <w:r>
-              <w:rPr>
-                <w:sz w:val="15"/>
-              </w:rPr>
-              <w:t>提供问题地图；规模和异构先作为风险，不作为第一版变量</w:t>
-            </w:r>
-          </w:p>
-        </w:tc>
-      </w:tr>
-      <w:tr>
-        <w:tc>
-          <w:tcPr>
-            <w:tcW w:type="dxa" w:w="2493"/>
-            <w:tcBorders>
-              <w:top w:val="single" w:sz="6" w:space="0" w:color="D9D9D9"/>
-              <w:left w:val="single" w:sz="6" w:space="0" w:color="D9D9D9"/>
-              <w:bottom w:val="single" w:sz="6" w:space="0" w:color="D9D9D9"/>
-              <w:right w:val="single" w:sz="6" w:space="0" w:color="D9D9D9"/>
-              <w:insideH w:val="single" w:sz="6" w:space="0" w:color="D9D9D9"/>
-              <w:insideV w:val="single" w:sz="6" w:space="0" w:color="D9D9D9"/>
-            </w:tcBorders>
-            <w:tcMar>
-              <w:top w:w="90" w:type="dxa"/>
-              <w:start w:w="110" w:type="dxa"/>
-              <w:bottom w:w="90" w:type="dxa"/>
-              <w:end w:w="110" w:type="dxa"/>
-            </w:tcMar>
-            <w:vAlign w:val="center"/>
-          </w:tcPr>
-          <w:p>
-            <w:pPr>
-              <w:pStyle w:val="SmallTable"/>
-              <w:jc w:val="center"/>
-            </w:pPr>
-            <w:r>
-              <w:rPr>
-                <w:sz w:val="15"/>
-              </w:rPr>
-              <w:t>目标导向通信</w:t>
-            </w:r>
-          </w:p>
-        </w:tc>
-        <w:tc>
-          <w:tcPr>
-            <w:tcW w:type="dxa" w:w="2493"/>
-            <w:tcBorders>
-              <w:top w:val="single" w:sz="6" w:space="0" w:color="D9D9D9"/>
-              <w:left w:val="single" w:sz="6" w:space="0" w:color="D9D9D9"/>
-              <w:bottom w:val="single" w:sz="6" w:space="0" w:color="D9D9D9"/>
-              <w:right w:val="single" w:sz="6" w:space="0" w:color="D9D9D9"/>
-              <w:insideH w:val="single" w:sz="6" w:space="0" w:color="D9D9D9"/>
-              <w:insideV w:val="single" w:sz="6" w:space="0" w:color="D9D9D9"/>
-            </w:tcBorders>
-            <w:tcMar>
-              <w:top w:w="90" w:type="dxa"/>
-              <w:start w:w="110" w:type="dxa"/>
-              <w:bottom w:w="90" w:type="dxa"/>
-              <w:end w:w="110" w:type="dxa"/>
-            </w:tcMar>
-            <w:vAlign w:val="center"/>
-          </w:tcPr>
-          <w:p>
-            <w:pPr>
-              <w:pStyle w:val="SmallTable"/>
-              <w:jc w:val="left"/>
-            </w:pPr>
-            <w:r>
-              <w:rPr>
-                <w:sz w:val="15"/>
-              </w:rPr>
-              <w:t>Charalambous 等，2024/2026</w:t>
-              <w:br/>
-            </w:r>
-            <w:r>
-              <w:rPr>
-                <w:sz w:val="15"/>
-              </w:rPr>
-              <w:t>Toward Goal-Oriented Communication in MAS</w:t>
-            </w:r>
-          </w:p>
-        </w:tc>
-        <w:tc>
-          <w:tcPr>
-            <w:tcW w:type="dxa" w:w="2493"/>
-            <w:tcBorders>
-              <w:top w:val="single" w:sz="6" w:space="0" w:color="D9D9D9"/>
-              <w:left w:val="single" w:sz="6" w:space="0" w:color="D9D9D9"/>
-              <w:bottom w:val="single" w:sz="6" w:space="0" w:color="D9D9D9"/>
-              <w:right w:val="single" w:sz="6" w:space="0" w:color="D9D9D9"/>
-              <w:insideH w:val="single" w:sz="6" w:space="0" w:color="D9D9D9"/>
-              <w:insideV w:val="single" w:sz="6" w:space="0" w:color="D9D9D9"/>
-            </w:tcBorders>
-            <w:tcMar>
-              <w:top w:w="90" w:type="dxa"/>
-              <w:start w:w="110" w:type="dxa"/>
-              <w:bottom w:w="90" w:type="dxa"/>
-              <w:end w:w="110" w:type="dxa"/>
-            </w:tcMar>
-            <w:vAlign w:val="center"/>
-          </w:tcPr>
-          <w:p>
-            <w:pPr>
-              <w:pStyle w:val="SmallTable"/>
-              <w:jc w:val="left"/>
-            </w:pPr>
-            <w:r>
-              <w:rPr>
-                <w:sz w:val="15"/>
-              </w:rPr>
-              <w:t>从比特保真转向共同目标贡献，整理 VoI、CoIL、AoI、VAoI</w:t>
-            </w:r>
-          </w:p>
-        </w:tc>
-        <w:tc>
-          <w:tcPr>
-            <w:tcW w:type="dxa" w:w="2493"/>
-            <w:tcBorders>
-              <w:top w:val="single" w:sz="6" w:space="0" w:color="D9D9D9"/>
-              <w:left w:val="single" w:sz="6" w:space="0" w:color="D9D9D9"/>
-              <w:bottom w:val="single" w:sz="6" w:space="0" w:color="D9D9D9"/>
-              <w:right w:val="single" w:sz="6" w:space="0" w:color="D9D9D9"/>
-              <w:insideH w:val="single" w:sz="6" w:space="0" w:color="D9D9D9"/>
-              <w:insideV w:val="single" w:sz="6" w:space="0" w:color="D9D9D9"/>
-            </w:tcBorders>
-            <w:tcMar>
-              <w:top w:w="90" w:type="dxa"/>
-              <w:start w:w="110" w:type="dxa"/>
-              <w:bottom w:w="90" w:type="dxa"/>
-              <w:end w:w="110" w:type="dxa"/>
-            </w:tcMar>
-            <w:vAlign w:val="center"/>
-          </w:tcPr>
-          <w:p>
-            <w:pPr>
-              <w:pStyle w:val="SmallTable"/>
-              <w:jc w:val="left"/>
-            </w:pPr>
-            <w:r>
-              <w:rPr>
-                <w:sz w:val="15"/>
-              </w:rPr>
-              <w:t>给出消息价值术语；项目还要放入真实 Wi-Fi 排队和交付</w:t>
-            </w:r>
-          </w:p>
-        </w:tc>
-      </w:tr>
-      <w:tr>
-        <w:tc>
-          <w:tcPr>
-            <w:tcW w:type="dxa" w:w="2493"/>
-            <w:tcBorders>
-              <w:top w:val="single" w:sz="6" w:space="0" w:color="D9D9D9"/>
-              <w:left w:val="single" w:sz="6" w:space="0" w:color="D9D9D9"/>
-              <w:bottom w:val="single" w:sz="6" w:space="0" w:color="D9D9D9"/>
-              <w:right w:val="single" w:sz="6" w:space="0" w:color="D9D9D9"/>
-              <w:insideH w:val="single" w:sz="6" w:space="0" w:color="D9D9D9"/>
-              <w:insideV w:val="single" w:sz="6" w:space="0" w:color="D9D9D9"/>
-            </w:tcBorders>
-            <w:tcMar>
-              <w:top w:w="90" w:type="dxa"/>
-              <w:start w:w="110" w:type="dxa"/>
-              <w:bottom w:w="90" w:type="dxa"/>
-              <w:end w:w="110" w:type="dxa"/>
-            </w:tcMar>
-            <w:vAlign w:val="center"/>
-            <w:shd w:fill="F7F9FB"/>
-          </w:tcPr>
-          <w:p>
-            <w:pPr>
-              <w:pStyle w:val="SmallTable"/>
-              <w:jc w:val="center"/>
-            </w:pPr>
-            <w:r>
-              <w:rPr>
-                <w:sz w:val="15"/>
-              </w:rPr>
-              <w:t>推理增强 TOC</w:t>
-            </w:r>
-          </w:p>
-        </w:tc>
-        <w:tc>
-          <w:tcPr>
-            <w:tcW w:type="dxa" w:w="2493"/>
-            <w:tcBorders>
-              <w:top w:val="single" w:sz="6" w:space="0" w:color="D9D9D9"/>
-              <w:left w:val="single" w:sz="6" w:space="0" w:color="D9D9D9"/>
-              <w:bottom w:val="single" w:sz="6" w:space="0" w:color="D9D9D9"/>
-              <w:right w:val="single" w:sz="6" w:space="0" w:color="D9D9D9"/>
-              <w:insideH w:val="single" w:sz="6" w:space="0" w:color="D9D9D9"/>
-              <w:insideV w:val="single" w:sz="6" w:space="0" w:color="D9D9D9"/>
-            </w:tcBorders>
-            <w:tcMar>
-              <w:top w:w="90" w:type="dxa"/>
-              <w:start w:w="110" w:type="dxa"/>
-              <w:bottom w:w="90" w:type="dxa"/>
-              <w:end w:w="110" w:type="dxa"/>
-            </w:tcMar>
-            <w:vAlign w:val="center"/>
-            <w:shd w:fill="F7F9FB"/>
-          </w:tcPr>
-          <w:p>
-            <w:pPr>
-              <w:pStyle w:val="SmallTable"/>
-              <w:jc w:val="left"/>
-            </w:pPr>
-            <w:r>
-              <w:rPr>
-                <w:sz w:val="15"/>
-              </w:rPr>
-              <w:t>Xie 等，2026</w:t>
-              <w:br/>
-            </w:r>
-            <w:r>
-              <w:rPr>
-                <w:sz w:val="15"/>
-              </w:rPr>
-              <w:t>Towards reasoning-empowered TOC for agent networks</w:t>
-            </w:r>
-          </w:p>
-        </w:tc>
-        <w:tc>
-          <w:tcPr>
-            <w:tcW w:type="dxa" w:w="2493"/>
-            <w:tcBorders>
-              <w:top w:val="single" w:sz="6" w:space="0" w:color="D9D9D9"/>
-              <w:left w:val="single" w:sz="6" w:space="0" w:color="D9D9D9"/>
-              <w:bottom w:val="single" w:sz="6" w:space="0" w:color="D9D9D9"/>
-              <w:right w:val="single" w:sz="6" w:space="0" w:color="D9D9D9"/>
-              <w:insideH w:val="single" w:sz="6" w:space="0" w:color="D9D9D9"/>
-              <w:insideV w:val="single" w:sz="6" w:space="0" w:color="D9D9D9"/>
-            </w:tcBorders>
-            <w:tcMar>
-              <w:top w:w="90" w:type="dxa"/>
-              <w:start w:w="110" w:type="dxa"/>
-              <w:bottom w:w="90" w:type="dxa"/>
-              <w:end w:w="110" w:type="dxa"/>
-            </w:tcMar>
-            <w:vAlign w:val="center"/>
-            <w:shd w:fill="F7F9FB"/>
-          </w:tcPr>
-          <w:p>
-            <w:pPr>
-              <w:pStyle w:val="SmallTable"/>
-              <w:jc w:val="left"/>
-            </w:pPr>
-            <w:r>
-              <w:rPr>
-                <w:sz w:val="15"/>
-              </w:rPr>
-              <w:t>让 agent 判断 what/when/why to communicate，连接感知、推理和规划</w:t>
-            </w:r>
-          </w:p>
-        </w:tc>
-        <w:tc>
-          <w:tcPr>
-            <w:tcW w:type="dxa" w:w="2493"/>
-            <w:tcBorders>
-              <w:top w:val="single" w:sz="6" w:space="0" w:color="D9D9D9"/>
-              <w:left w:val="single" w:sz="6" w:space="0" w:color="D9D9D9"/>
-              <w:bottom w:val="single" w:sz="6" w:space="0" w:color="D9D9D9"/>
-              <w:right w:val="single" w:sz="6" w:space="0" w:color="D9D9D9"/>
-              <w:insideH w:val="single" w:sz="6" w:space="0" w:color="D9D9D9"/>
-              <w:insideV w:val="single" w:sz="6" w:space="0" w:color="D9D9D9"/>
-            </w:tcBorders>
-            <w:tcMar>
-              <w:top w:w="90" w:type="dxa"/>
-              <w:start w:w="110" w:type="dxa"/>
-              <w:bottom w:w="90" w:type="dxa"/>
-              <w:end w:w="110" w:type="dxa"/>
-            </w:tcMar>
-            <w:vAlign w:val="center"/>
-            <w:shd w:fill="F7F9FB"/>
-          </w:tcPr>
-          <w:p>
-            <w:pPr>
-              <w:pStyle w:val="SmallTable"/>
-              <w:jc w:val="left"/>
-            </w:pPr>
-            <w:r>
-              <w:rPr>
-                <w:sz w:val="15"/>
-              </w:rPr>
-              <w:t>理念接近；当前先做可审计的候选/准入协议，不直接做生成式语义通信</w:t>
-            </w:r>
-          </w:p>
-        </w:tc>
-      </w:tr>
-      <w:tr>
-        <w:tc>
-          <w:tcPr>
-            <w:tcW w:type="dxa" w:w="2493"/>
-            <w:tcBorders>
-              <w:top w:val="single" w:sz="6" w:space="0" w:color="D9D9D9"/>
-              <w:left w:val="single" w:sz="6" w:space="0" w:color="D9D9D9"/>
-              <w:bottom w:val="single" w:sz="6" w:space="0" w:color="D9D9D9"/>
-              <w:right w:val="single" w:sz="6" w:space="0" w:color="D9D9D9"/>
-              <w:insideH w:val="single" w:sz="6" w:space="0" w:color="D9D9D9"/>
-              <w:insideV w:val="single" w:sz="6" w:space="0" w:color="D9D9D9"/>
-            </w:tcBorders>
-            <w:tcMar>
-              <w:top w:w="90" w:type="dxa"/>
-              <w:start w:w="110" w:type="dxa"/>
-              <w:bottom w:w="90" w:type="dxa"/>
-              <w:end w:w="110" w:type="dxa"/>
-            </w:tcMar>
-            <w:vAlign w:val="center"/>
-          </w:tcPr>
-          <w:p>
-            <w:pPr>
-              <w:pStyle w:val="SmallTable"/>
-              <w:jc w:val="center"/>
-            </w:pPr>
-            <w:r>
-              <w:rPr>
-                <w:sz w:val="15"/>
-              </w:rPr>
-              <w:t>多机器人 DRL</w:t>
-            </w:r>
-          </w:p>
-        </w:tc>
-        <w:tc>
-          <w:tcPr>
-            <w:tcW w:type="dxa" w:w="2493"/>
-            <w:tcBorders>
-              <w:top w:val="single" w:sz="6" w:space="0" w:color="D9D9D9"/>
-              <w:left w:val="single" w:sz="6" w:space="0" w:color="D9D9D9"/>
-              <w:bottom w:val="single" w:sz="6" w:space="0" w:color="D9D9D9"/>
-              <w:right w:val="single" w:sz="6" w:space="0" w:color="D9D9D9"/>
-              <w:insideH w:val="single" w:sz="6" w:space="0" w:color="D9D9D9"/>
-              <w:insideV w:val="single" w:sz="6" w:space="0" w:color="D9D9D9"/>
-            </w:tcBorders>
-            <w:tcMar>
-              <w:top w:w="90" w:type="dxa"/>
-              <w:start w:w="110" w:type="dxa"/>
-              <w:bottom w:w="90" w:type="dxa"/>
-              <w:end w:w="110" w:type="dxa"/>
-            </w:tcMar>
-            <w:vAlign w:val="center"/>
-          </w:tcPr>
-          <w:p>
-            <w:pPr>
-              <w:pStyle w:val="SmallTable"/>
-              <w:jc w:val="left"/>
-            </w:pPr>
-            <w:r>
-              <w:rPr>
-                <w:sz w:val="15"/>
-              </w:rPr>
-              <w:t>Sensors，2023</w:t>
-              <w:br/>
-            </w:r>
-            <w:r>
-              <w:rPr>
-                <w:sz w:val="15"/>
-              </w:rPr>
-              <w:t>Multi-Agent DRL for Multi-Robot Applications</w:t>
-            </w:r>
-          </w:p>
-        </w:tc>
-        <w:tc>
-          <w:tcPr>
-            <w:tcW w:type="dxa" w:w="2493"/>
-            <w:tcBorders>
-              <w:top w:val="single" w:sz="6" w:space="0" w:color="D9D9D9"/>
-              <w:left w:val="single" w:sz="6" w:space="0" w:color="D9D9D9"/>
-              <w:bottom w:val="single" w:sz="6" w:space="0" w:color="D9D9D9"/>
-              <w:right w:val="single" w:sz="6" w:space="0" w:color="D9D9D9"/>
-              <w:insideH w:val="single" w:sz="6" w:space="0" w:color="D9D9D9"/>
-              <w:insideV w:val="single" w:sz="6" w:space="0" w:color="D9D9D9"/>
-            </w:tcBorders>
-            <w:tcMar>
-              <w:top w:w="90" w:type="dxa"/>
-              <w:start w:w="110" w:type="dxa"/>
-              <w:bottom w:w="90" w:type="dxa"/>
-              <w:end w:w="110" w:type="dxa"/>
-            </w:tcMar>
-            <w:vAlign w:val="center"/>
-          </w:tcPr>
-          <w:p>
-            <w:pPr>
-              <w:pStyle w:val="SmallTable"/>
-              <w:jc w:val="left"/>
-            </w:pPr>
-            <w:r>
-              <w:rPr>
-                <w:sz w:val="15"/>
-              </w:rPr>
-              <w:t>覆盖、探索、导航、信息收集、分配、搬运等多机器人任务</w:t>
-            </w:r>
-          </w:p>
-        </w:tc>
-        <w:tc>
-          <w:tcPr>
-            <w:tcW w:type="dxa" w:w="2493"/>
-            <w:tcBorders>
-              <w:top w:val="single" w:sz="6" w:space="0" w:color="D9D9D9"/>
-              <w:left w:val="single" w:sz="6" w:space="0" w:color="D9D9D9"/>
-              <w:bottom w:val="single" w:sz="6" w:space="0" w:color="D9D9D9"/>
-              <w:right w:val="single" w:sz="6" w:space="0" w:color="D9D9D9"/>
-              <w:insideH w:val="single" w:sz="6" w:space="0" w:color="D9D9D9"/>
-              <w:insideV w:val="single" w:sz="6" w:space="0" w:color="D9D9D9"/>
-            </w:tcBorders>
-            <w:tcMar>
-              <w:top w:w="90" w:type="dxa"/>
-              <w:start w:w="110" w:type="dxa"/>
-              <w:bottom w:w="90" w:type="dxa"/>
-              <w:end w:w="110" w:type="dxa"/>
-            </w:tcMar>
-            <w:vAlign w:val="center"/>
-          </w:tcPr>
-          <w:p>
-            <w:pPr>
-              <w:pStyle w:val="SmallTable"/>
-              <w:jc w:val="left"/>
-            </w:pPr>
-            <w:r>
-              <w:rPr>
-                <w:sz w:val="15"/>
-              </w:rPr>
-              <w:t>帮助固定任务层；通信不是综述中心，不能直接解决网络因果</w:t>
-            </w:r>
-          </w:p>
-        </w:tc>
-      </w:tr>
-      <w:tr>
-        <w:tc>
-          <w:tcPr>
-            <w:tcW w:type="dxa" w:w="2493"/>
-            <w:tcBorders>
-              <w:top w:val="single" w:sz="6" w:space="0" w:color="D9D9D9"/>
-              <w:left w:val="single" w:sz="6" w:space="0" w:color="D9D9D9"/>
-              <w:bottom w:val="single" w:sz="6" w:space="0" w:color="D9D9D9"/>
-              <w:right w:val="single" w:sz="6" w:space="0" w:color="D9D9D9"/>
-              <w:insideH w:val="single" w:sz="6" w:space="0" w:color="D9D9D9"/>
-              <w:insideV w:val="single" w:sz="6" w:space="0" w:color="D9D9D9"/>
-            </w:tcBorders>
-            <w:tcMar>
-              <w:top w:w="90" w:type="dxa"/>
-              <w:start w:w="110" w:type="dxa"/>
-              <w:bottom w:w="90" w:type="dxa"/>
-              <w:end w:w="110" w:type="dxa"/>
-            </w:tcMar>
-            <w:vAlign w:val="center"/>
-            <w:shd w:fill="F7F9FB"/>
-          </w:tcPr>
-          <w:p>
-            <w:pPr>
-              <w:pStyle w:val="SmallTable"/>
-              <w:jc w:val="center"/>
-            </w:pPr>
-            <w:r>
-              <w:rPr>
-                <w:sz w:val="15"/>
-              </w:rPr>
-              <w:t>多机器人探索</w:t>
-            </w:r>
-          </w:p>
-        </w:tc>
-        <w:tc>
-          <w:tcPr>
-            <w:tcW w:type="dxa" w:w="2493"/>
-            <w:tcBorders>
-              <w:top w:val="single" w:sz="6" w:space="0" w:color="D9D9D9"/>
-              <w:left w:val="single" w:sz="6" w:space="0" w:color="D9D9D9"/>
-              <w:bottom w:val="single" w:sz="6" w:space="0" w:color="D9D9D9"/>
-              <w:right w:val="single" w:sz="6" w:space="0" w:color="D9D9D9"/>
-              <w:insideH w:val="single" w:sz="6" w:space="0" w:color="D9D9D9"/>
-              <w:insideV w:val="single" w:sz="6" w:space="0" w:color="D9D9D9"/>
-            </w:tcBorders>
-            <w:tcMar>
-              <w:top w:w="90" w:type="dxa"/>
-              <w:start w:w="110" w:type="dxa"/>
-              <w:bottom w:w="90" w:type="dxa"/>
-              <w:end w:w="110" w:type="dxa"/>
-            </w:tcMar>
-            <w:vAlign w:val="center"/>
-            <w:shd w:fill="F7F9FB"/>
-          </w:tcPr>
-          <w:p>
-            <w:pPr>
-              <w:pStyle w:val="SmallTable"/>
-              <w:jc w:val="left"/>
-            </w:pPr>
-            <w:r>
-              <w:rPr>
-                <w:sz w:val="15"/>
-              </w:rPr>
-              <w:t>Wang 等，2025</w:t>
-              <w:br/>
-            </w:r>
-            <w:r>
-              <w:rPr>
-                <w:sz w:val="15"/>
-              </w:rPr>
-              <w:t>Multi-Robot System for Cooperative Exploration</w:t>
-            </w:r>
-          </w:p>
-        </w:tc>
-        <w:tc>
-          <w:tcPr>
-            <w:tcW w:type="dxa" w:w="2493"/>
-            <w:tcBorders>
-              <w:top w:val="single" w:sz="6" w:space="0" w:color="D9D9D9"/>
-              <w:left w:val="single" w:sz="6" w:space="0" w:color="D9D9D9"/>
-              <w:bottom w:val="single" w:sz="6" w:space="0" w:color="D9D9D9"/>
-              <w:right w:val="single" w:sz="6" w:space="0" w:color="D9D9D9"/>
-              <w:insideH w:val="single" w:sz="6" w:space="0" w:color="D9D9D9"/>
-              <w:insideV w:val="single" w:sz="6" w:space="0" w:color="D9D9D9"/>
-            </w:tcBorders>
-            <w:tcMar>
-              <w:top w:w="90" w:type="dxa"/>
-              <w:start w:w="110" w:type="dxa"/>
-              <w:bottom w:w="90" w:type="dxa"/>
-              <w:end w:w="110" w:type="dxa"/>
-            </w:tcMar>
-            <w:vAlign w:val="center"/>
-            <w:shd w:fill="F7F9FB"/>
-          </w:tcPr>
-          <w:p>
-            <w:pPr>
-              <w:pStyle w:val="SmallTable"/>
-              <w:jc w:val="left"/>
-            </w:pPr>
-            <w:r>
-              <w:rPr>
-                <w:sz w:val="15"/>
-              </w:rPr>
-              <w:t>定位建图、地图融合、frontier、分配和运动规划；通信常作为约束</w:t>
-            </w:r>
-          </w:p>
-        </w:tc>
-        <w:tc>
-          <w:tcPr>
-            <w:tcW w:type="dxa" w:w="2493"/>
-            <w:tcBorders>
-              <w:top w:val="single" w:sz="6" w:space="0" w:color="D9D9D9"/>
-              <w:left w:val="single" w:sz="6" w:space="0" w:color="D9D9D9"/>
-              <w:bottom w:val="single" w:sz="6" w:space="0" w:color="D9D9D9"/>
-              <w:right w:val="single" w:sz="6" w:space="0" w:color="D9D9D9"/>
-              <w:insideH w:val="single" w:sz="6" w:space="0" w:color="D9D9D9"/>
-              <w:insideV w:val="single" w:sz="6" w:space="0" w:color="D9D9D9"/>
-            </w:tcBorders>
-            <w:tcMar>
-              <w:top w:w="90" w:type="dxa"/>
-              <w:start w:w="110" w:type="dxa"/>
-              <w:bottom w:w="90" w:type="dxa"/>
-              <w:end w:w="110" w:type="dxa"/>
-            </w:tcMar>
-            <w:vAlign w:val="center"/>
-            <w:shd w:fill="F7F9FB"/>
-          </w:tcPr>
-          <w:p>
-            <w:pPr>
-              <w:pStyle w:val="SmallTable"/>
-              <w:jc w:val="left"/>
-            </w:pPr>
-            <w:r>
-              <w:rPr>
-                <w:sz w:val="15"/>
-              </w:rPr>
-              <w:t>为模块化任务栈提供依据；项目尝试把通信变成可测决策变量</w:t>
-            </w:r>
-          </w:p>
-        </w:tc>
-      </w:tr>
-      <w:tr>
-        <w:tc>
-          <w:tcPr>
-            <w:tcW w:type="dxa" w:w="2493"/>
-            <w:tcBorders>
-              <w:top w:val="single" w:sz="6" w:space="0" w:color="D9D9D9"/>
-              <w:left w:val="single" w:sz="6" w:space="0" w:color="D9D9D9"/>
-              <w:bottom w:val="single" w:sz="6" w:space="0" w:color="D9D9D9"/>
-              <w:right w:val="single" w:sz="6" w:space="0" w:color="D9D9D9"/>
-              <w:insideH w:val="single" w:sz="6" w:space="0" w:color="D9D9D9"/>
-              <w:insideV w:val="single" w:sz="6" w:space="0" w:color="D9D9D9"/>
-            </w:tcBorders>
-            <w:tcMar>
-              <w:top w:w="90" w:type="dxa"/>
-              <w:start w:w="110" w:type="dxa"/>
-              <w:bottom w:w="90" w:type="dxa"/>
-              <w:end w:w="110" w:type="dxa"/>
-            </w:tcMar>
-            <w:vAlign w:val="center"/>
-          </w:tcPr>
-          <w:p>
-            <w:pPr>
-              <w:pStyle w:val="SmallTable"/>
-              <w:jc w:val="center"/>
-            </w:pPr>
-            <w:r>
-              <w:rPr>
-                <w:sz w:val="15"/>
-              </w:rPr>
-              <w:t>信息年龄</w:t>
-            </w:r>
-          </w:p>
-        </w:tc>
-        <w:tc>
-          <w:tcPr>
-            <w:tcW w:type="dxa" w:w="2493"/>
-            <w:tcBorders>
-              <w:top w:val="single" w:sz="6" w:space="0" w:color="D9D9D9"/>
-              <w:left w:val="single" w:sz="6" w:space="0" w:color="D9D9D9"/>
-              <w:bottom w:val="single" w:sz="6" w:space="0" w:color="D9D9D9"/>
-              <w:right w:val="single" w:sz="6" w:space="0" w:color="D9D9D9"/>
-              <w:insideH w:val="single" w:sz="6" w:space="0" w:color="D9D9D9"/>
-              <w:insideV w:val="single" w:sz="6" w:space="0" w:color="D9D9D9"/>
-            </w:tcBorders>
-            <w:tcMar>
-              <w:top w:w="90" w:type="dxa"/>
-              <w:start w:w="110" w:type="dxa"/>
-              <w:bottom w:w="90" w:type="dxa"/>
-              <w:end w:w="110" w:type="dxa"/>
-            </w:tcMar>
-            <w:vAlign w:val="center"/>
-          </w:tcPr>
-          <w:p>
-            <w:pPr>
-              <w:pStyle w:val="SmallTable"/>
-              <w:jc w:val="left"/>
-            </w:pPr>
-            <w:r>
-              <w:rPr>
-                <w:sz w:val="15"/>
-              </w:rPr>
-              <w:t>Yates 等，2021</w:t>
-              <w:br/>
-            </w:r>
-            <w:r>
-              <w:rPr>
-                <w:sz w:val="15"/>
-              </w:rPr>
-              <w:t>Age of Information</w:t>
-            </w:r>
-          </w:p>
-        </w:tc>
-        <w:tc>
-          <w:tcPr>
-            <w:tcW w:type="dxa" w:w="2493"/>
-            <w:tcBorders>
-              <w:top w:val="single" w:sz="6" w:space="0" w:color="D9D9D9"/>
-              <w:left w:val="single" w:sz="6" w:space="0" w:color="D9D9D9"/>
-              <w:bottom w:val="single" w:sz="6" w:space="0" w:color="D9D9D9"/>
-              <w:right w:val="single" w:sz="6" w:space="0" w:color="D9D9D9"/>
-              <w:insideH w:val="single" w:sz="6" w:space="0" w:color="D9D9D9"/>
-              <w:insideV w:val="single" w:sz="6" w:space="0" w:color="D9D9D9"/>
-            </w:tcBorders>
-            <w:tcMar>
-              <w:top w:w="90" w:type="dxa"/>
-              <w:start w:w="110" w:type="dxa"/>
-              <w:bottom w:w="90" w:type="dxa"/>
-              <w:end w:w="110" w:type="dxa"/>
-            </w:tcMar>
-            <w:vAlign w:val="center"/>
-          </w:tcPr>
-          <w:p>
-            <w:pPr>
-              <w:pStyle w:val="SmallTable"/>
-              <w:jc w:val="left"/>
-            </w:pPr>
-            <w:r>
-              <w:rPr>
-                <w:sz w:val="15"/>
-              </w:rPr>
-              <w:t>状态更新新鲜度、排队、能量受限更新和无线网络</w:t>
-            </w:r>
-          </w:p>
-        </w:tc>
-        <w:tc>
-          <w:tcPr>
-            <w:tcW w:type="dxa" w:w="2493"/>
-            <w:tcBorders>
-              <w:top w:val="single" w:sz="6" w:space="0" w:color="D9D9D9"/>
-              <w:left w:val="single" w:sz="6" w:space="0" w:color="D9D9D9"/>
-              <w:bottom w:val="single" w:sz="6" w:space="0" w:color="D9D9D9"/>
-              <w:right w:val="single" w:sz="6" w:space="0" w:color="D9D9D9"/>
-              <w:insideH w:val="single" w:sz="6" w:space="0" w:color="D9D9D9"/>
-              <w:insideV w:val="single" w:sz="6" w:space="0" w:color="D9D9D9"/>
-            </w:tcBorders>
-            <w:tcMar>
-              <w:top w:w="90" w:type="dxa"/>
-              <w:start w:w="110" w:type="dxa"/>
-              <w:bottom w:w="90" w:type="dxa"/>
-              <w:end w:w="110" w:type="dxa"/>
-            </w:tcMar>
-            <w:vAlign w:val="center"/>
-          </w:tcPr>
-          <w:p>
-            <w:pPr>
-              <w:pStyle w:val="SmallTable"/>
-              <w:jc w:val="left"/>
-            </w:pPr>
-            <w:r>
-              <w:rPr>
-                <w:sz w:val="15"/>
-              </w:rPr>
-              <w:t>AoI 很重要但不能代替内容价值；动作里要允许等待</w:t>
+              <w:t>固定任务栈、设计可重复场景，把通信影响留给可测变量</w:t>
             </w:r>
           </w:p>
         </w:tc>
@@ -2952,7 +1461,7 @@
         <w:rPr>
           <w:i w:val="0"/>
         </w:rPr>
-        <w:t>3.2 文献共同关心的四个问题</w:t>
+        <w:t>2.6 从文献得到的工作解释</w:t>
       </w:r>
     </w:p>
     <w:p>
@@ -2966,7 +1475,7 @@
         <w:t xml:space="preserve">• </w:t>
       </w:r>
       <w:r>
-        <w:t>资源怎么分：频谱、时隙、速率、功率、计算和存储如何在动态环境中分配。</w:t>
+        <w:t>内容生成层：机器人根据本地任务状态产生地图、frontier、位姿、电量、目标和安全事件候选。</w:t>
       </w:r>
     </w:p>
     <w:p>
@@ -2980,7 +1489,7 @@
         <w:t xml:space="preserve">• </w:t>
       </w:r>
       <w:r>
-        <w:t>谁在做决策：规则、优化、集中式 RL、MARL、CTDE，各自面临信息量和规模代价。</w:t>
+        <w:t>应用准入层：中央策略决定哪些候选进入发送通道，考虑任务阶段、内容价值、时效和代价。</w:t>
       </w:r>
     </w:p>
     <w:p>
@@ -2994,32 +1503,7 @@
         <w:t xml:space="preserve">• </w:t>
       </w:r>
       <w:r>
-        <w:t>传什么才有用：从完整数据、压缩特征到任务导向消息，关注内容价值和通信开销。</w:t>
-      </w:r>
-    </w:p>
-    <w:p>
-      <w:pPr>
-        <w:pStyle w:val="BulletCustom"/>
-      </w:pPr>
-      <w:r>
-        <w:rPr>
-          <w:b/>
-        </w:rPr>
-        <w:t xml:space="preserve">• </w:t>
-      </w:r>
-      <w:r>
-        <w:t>怎样落到真实系统：仿真和实物差距、真实信道、动态拓扑、安全约束和可复现性。</w:t>
-      </w:r>
-    </w:p>
-    <w:p>
-      <w:pPr>
-        <w:pStyle w:val="Heading2"/>
-      </w:pPr>
-      <w:r>
-        <w:rPr>
-          <w:i w:val="0"/>
-        </w:rPr>
-        <w:t>3.3 我暂时不把它说成“文献空白”</w:t>
+        <w:t>网络交付层：Wi-Fi 的排队、竞争、退避、重传、干扰和传播决定消息何时、是否到达；接收端再把已交付信息消费为状态和任务决策。</w:t>
       </w:r>
     </w:p>
     <w:p>
@@ -3028,7 +1512,16 @@
         <w:rPr>
           <w:i w:val="0"/>
         </w:rPr>
-        <w:t>教师评审特别提醒：事件触发通信、发送者选择、任务收益、异构机器人、真实 Wi-Fi 和实物演示分别都能找到直接或高度相关先例。因而当前更稳妥的说法是：我想验证一种具体的因果闭环——在固定多机器人任务和固定消息语义下，真实 Wi-Fi 的竞争、排队、重传、时延和过期信息，是否会改变后续任务分配与完成结果；如果强非学习方法已经足够，也应该把“不需要复杂 RL”作为诚实结论。</w:t>
+        <w:t>要验证的不是“学习策略是否让某个网络指标变大”，而是这三层是否能在日志中接上：候选生成 → 准入 → 入队和尝试 → 交付或过期 → 接收端消费 → 任务变化 → 最终完成结果。</w:t>
+      </w:r>
+    </w:p>
+    <w:p>
+      <w:pPr/>
+      <w:r>
+        <w:rPr>
+          <w:i w:val="0"/>
+        </w:rPr>
+        <w:t>这也决定了当前不把贡献说成一个笼统的“多机器人 + 真实 Wi-Fi + 强化学习”组合，而是先验证一条可以被审计的系统因果链。</w:t>
       </w:r>
     </w:p>
     <w:p>
@@ -3044,7 +1537,7 @@
         <w:rPr>
           <w:i w:val="0"/>
         </w:rPr>
-        <w:t>4 我现在想尝试的方法</w:t>
+        <w:t>3 把文献落到一个可验证的问题</w:t>
       </w:r>
     </w:p>
     <w:p>
@@ -3055,7 +1548,7 @@
         <w:rPr>
           <w:i w:val="0"/>
         </w:rPr>
-        <w:t>4.1 先固定什么</w:t>
+        <w:t>3.1 具体场景：陌生室内环境中的协同探索与目标集合</w:t>
       </w:r>
     </w:p>
     <w:p>
@@ -3064,7 +1557,16 @@
         <w:rPr>
           <w:i w:val="0"/>
         </w:rPr>
-        <w:t>为了让结果能归因到通信决策，第一版固定：机器人任务栈、SLAM、frontier 生成、Nav2、本地避障、目标确认规则、消息语义和序列化格式。策略不直接学习地图、导航、任务分配或 Wi-Fi MAC 参数。机器人本地保留感知、避障、低电量返航和断网降级，通信策略不能覆盖安全约束。</w:t>
+        <w:t>在实验室、房间组合或长走廊里，2–3 台 TurtleBot3 从共同起始/充电区域出发，不预先知道地图。它们使用激光雷达和本地 SLAM 建图，通过 frontier 分配探索区域，之后寻找指定目标。目标被确认后，信息需要到达中央协调器，再为仍参与任务的机器人分配互相分离的集合位姿；电量不足的机器人先返航、充电，再恢复任务。</w:t>
+      </w:r>
+    </w:p>
+    <w:p>
+      <w:pPr/>
+      <w:r>
+        <w:rPr>
+          <w:i w:val="0"/>
+        </w:rPr>
+        <w:t>这个场景只作为研究载体，不预先假设某一种算法一定有效。它能同时提供探索、目标事件、集合、安全返航和消息负载变化，让通信结果有机会传递到真实任务状态。</w:t>
       </w:r>
     </w:p>
     <w:p>
@@ -3075,7 +1577,47 @@
         <w:rPr>
           <w:i w:val="0"/>
         </w:rPr>
-        <w:t>4.2 方法的核心想法</w:t>
+        <w:t>3.2 要固定的任务层和安全边界</w:t>
+      </w:r>
+    </w:p>
+    <w:p>
+      <w:pPr/>
+      <w:r>
+        <w:rPr>
+          <w:i w:val="0"/>
+        </w:rPr>
+        <w:t>第一版固定机器人任务栈、SLAM、frontier 生成、Nav2、本地避障、目标确认规则、消息语义和序列化格式。通信策略不直接学习地图、导航、任务分配或 Wi-Fi MAC 参数；机器人本地保留感知、避障、低电量返航和断网降级，通信策略不能覆盖安全约束。</w:t>
+      </w:r>
+    </w:p>
+    <w:p>
+      <w:pPr>
+        <w:pStyle w:val="Heading1"/>
+      </w:pPr>
+      <w:r>
+        <w:rPr>
+          <w:i w:val="0"/>
+        </w:rPr>
+        <w:t>4 当前想尝试的方法</w:t>
+      </w:r>
+    </w:p>
+    <w:p>
+      <w:pPr>
+        <w:pStyle w:val="Heading2"/>
+      </w:pPr>
+      <w:r>
+        <w:rPr>
+          <w:i w:val="0"/>
+        </w:rPr>
+        <w:t>4.1 集中式、部分可观测的单智能体通信调度</w:t>
+      </w:r>
+    </w:p>
+    <w:p>
+      <w:pPr/>
+      <w:r>
+        <w:rPr>
+          <w:i w:val="0"/>
+        </w:rPr>
+        <w:t>采用一个中央策略，在每个决策窗选择“哪个 endpoint 的哪一类候选消息获得短期准入”，也允许普通消息暂不准入。多机器人是环境中的多个消息端点；中央只能看到已经交付的摘要、请求、心跳、状态版本和反馈，不免费读取机器人隐藏队列或 Gazebo 真值。</w:t>
       </w:r>
     </w:p>
     <w:p>
@@ -3087,7 +1629,7 @@
         <w:drawing>
           <wp:inline xmlns:a="http://schemas.openxmlformats.org/drawingml/2006/main" xmlns:pic="http://schemas.openxmlformats.org/drawingml/2006/picture">
             <wp:extent cx="5897880" cy="3619154"/>
-            <wp:docPr id="3" name="Picture 3" descr="汇报文档示意图"/>
+            <wp:docPr id="6" name="Picture 6" descr="汇报文档示意图 6"/>
             <wp:cNvGraphicFramePr>
               <a:graphicFrameLocks noChangeAspect="1"/>
             </wp:cNvGraphicFramePr>
@@ -3099,7 +1641,7 @@
                     <pic:cNvPicPr/>
                   </pic:nvPicPr>
                   <pic:blipFill>
-                    <a:blip r:embed="rId12"/>
+                    <a:blip r:embed="rId15"/>
                     <a:stretch>
                       <a:fillRect/>
                     </a:stretch>
@@ -3124,7 +1666,7 @@
         <w:jc w:val="center"/>
       </w:pPr>
       <w:r>
-        <w:t>图 6 拟议系统边界：机器人任务栈固定，通信准入成为可比较变量</w:t>
+        <w:t>图 6　系统边界：机器人任务栈固定，策略首先只控制应用层消息准入；Wi-Fi MAC/PHY 仍决定实际交付。</w:t>
       </w:r>
     </w:p>
     <w:p>
@@ -3133,7 +1675,7 @@
         <w:rPr>
           <w:i w:val="0"/>
         </w:rPr>
-        <w:t>采用一个集中式、部分可观测的单智能体通信调度器。多机器人是环境中的多个 endpoint，中央策略在每个决策窗选择“哪个 endpoint 的哪一类候选消息获得短期准入”，也允许不准入普通消息。</w:t>
+        <w:t>当前先用集中式、部分可观测的单智能体表述，而不自动把多机器人称为 MARL。只有当每台机器人独立运行需要学习的通信或行动策略，并通过团队交互共同学习时，才有必要使用 MARL 的组织方式。</w:t>
       </w:r>
     </w:p>
     <w:p>
@@ -3144,7 +1686,7 @@
         <w:rPr>
           <w:i w:val="0"/>
         </w:rPr>
-        <w:t>4.3 为什么先不把它叫 MARL</w:t>
+        <w:t>4.2 消息协议和可审计边界</w:t>
       </w:r>
     </w:p>
     <w:p>
@@ -3153,27 +1695,7 @@
         <w:rPr>
           <w:i w:val="0"/>
         </w:rPr>
-        <w:t>当前只有一个中央策略在做准入决策，多台机器人只是它面对的多个消息端点；这更接近一个集中式、部分可观测的单智能体问题。只有当每台机器人独立运行需要学习的通信或行动策略，并通过团队交互共同学习时，才有必要把方法组织为 MARL。网络里有多个输出头、训练集中式或系统里有多台机器人，都不能单独决定它是 MARL。</w:t>
-      </w:r>
-    </w:p>
-    <w:p>
-      <w:pPr>
-        <w:pStyle w:val="Heading2"/>
-      </w:pPr>
-      <w:r>
-        <w:rPr>
-          <w:i w:val="0"/>
-        </w:rPr>
-        <w:t>4.4 建议的协议机制</w:t>
-      </w:r>
-    </w:p>
-    <w:p>
-      <w:pPr/>
-      <w:r>
-        <w:rPr>
-          <w:i w:val="0"/>
-        </w:rPr>
-        <w:t>机器人先生成低开销 `candidate` 或 `request`，描述消息类型、版本、大小、生成时间、任务阶段和紧急等级；中央根据已收到的信息发放短期 `grant`；心跳和关键事件保留独立的最低限度通告路径；交付反馈进入中央接收状态存储。控制开销本身也要计入账本。</w:t>
+        <w:t>机器人先生成低开销的 `candidate` 或 `request`，描述消息类型、版本、大小、生成时间、任务阶段和紧急等级；中央根据已经收到的信息发放短期 `grant`；心跳和关键事件保留最低限度的通告路径；交付反馈进入中央接收状态存储。控制开销本身也计入账本。</w:t>
       </w:r>
     </w:p>
     <w:p>
@@ -3247,6 +1769,15 @@
       </w:r>
     </w:p>
     <w:p>
+      <w:pPr/>
+      <w:r>
+        <w:rPr>
+          <w:i w:val="0"/>
+        </w:rPr>
+        <w:t>日志需要区分 `source_time`、`enqueue_time`、`admit_time`、`tx_time`、`delivery_time`、`consume_time`、`drop_time`、消息 ID、版本和尝试次数。只有这样才能回答“消息没有送达”和“任务因此变差”是否是同一件事。</w:t>
+      </w:r>
+    </w:p>
+    <w:p>
       <w:pPr>
         <w:pStyle w:val="Heading2"/>
       </w:pPr>
@@ -3254,7 +1785,7 @@
         <w:rPr>
           <w:i w:val="0"/>
         </w:rPr>
-        <w:t>4.5 任务状态机和完成口径</w:t>
+        <w:t>4.3 任务状态机和完成口径</w:t>
       </w:r>
     </w:p>
     <w:p>
@@ -3266,7 +1797,7 @@
         <w:drawing>
           <wp:inline xmlns:a="http://schemas.openxmlformats.org/drawingml/2006/main" xmlns:pic="http://schemas.openxmlformats.org/drawingml/2006/picture">
             <wp:extent cx="5897880" cy="2246811"/>
-            <wp:docPr id="4" name="Picture 4" descr="汇报文档示意图"/>
+            <wp:docPr id="7" name="Picture 7" descr="汇报文档示意图 7"/>
             <wp:cNvGraphicFramePr>
               <a:graphicFrameLocks noChangeAspect="1"/>
             </wp:cNvGraphicFramePr>
@@ -3278,7 +1809,7 @@
                     <pic:cNvPicPr/>
                   </pic:nvPicPr>
                   <pic:blipFill>
-                    <a:blip r:embed="rId13"/>
+                    <a:blip r:embed="rId16"/>
                     <a:stretch>
                       <a:fillRect/>
                     </a:stretch>
@@ -3303,7 +1834,7 @@
         <w:jc w:val="center"/>
       </w:pPr>
       <w:r>
-        <w:t>图 7 任务状态机：FOUND 是过程，COMPLETE 才是完整任务成功</w:t>
+        <w:t>图 7　任务状态机：`FOUND` 和 90% 覆盖率是过程指标；无故障时只有满足所有集合条件才是 `COMPLETE`。</w:t>
       </w:r>
     </w:p>
     <w:p>
@@ -3314,7 +1845,7 @@
         <w:rPr>
           <w:i w:val="0"/>
         </w:rPr>
-        <w:t>4.6 预留的比较基线</w:t>
+        <w:t>4.4 比较基线和 RL 的位置</w:t>
       </w:r>
     </w:p>
     <w:p>
@@ -3323,7 +1854,16 @@
         <w:rPr>
           <w:i w:val="0"/>
         </w:rPr>
-        <w:t>进入 RL 前先运行以下规则：无普通通信、全部发送、固定周期、事件触发、freshness/deadline、task-priority、task-value greedy、link-aware greedy，以及在相同观测和消息接口上适配的 SchedNet-inspired 学习式评分。它们要使用相同任务栈、候选消息、网络条件、种子和安全约束。</w:t>
+        <w:t>进入 RL 前先运行：无普通通信、全部发送、固定周期、事件触发、freshness/deadline、task-priority、task-value greedy、link-aware greedy，以及在相同观测和消息接口上适配的 SchedNet-inspired 评分。所有方法使用相同任务栈、候选消息、网络条件、种子和安全约束。</w:t>
+      </w:r>
+    </w:p>
+    <w:p>
+      <w:pPr/>
+      <w:r>
+        <w:rPr>
+          <w:i w:val="0"/>
+        </w:rPr>
+        <w:t>如果强规则方法已经达到同样的任务表现，结论可以是“复杂 RL 没有带来足够收益”；如果通信负载、过期和任务后果之间存在长期权衡，再把集中式 POMDP 的 RL 作为候选方法。</w:t>
       </w:r>
     </w:p>
     <w:p>
@@ -3339,7 +1879,7 @@
         <w:rPr>
           <w:i w:val="0"/>
         </w:rPr>
-        <w:t>5 从仿真到实物的工程路线</w:t>
+        <w:t>5 从仿真到实物的 P0–P8 路线</w:t>
       </w:r>
     </w:p>
     <w:p>
@@ -3350,7 +1890,7 @@
         <w:rPr>
           <w:i w:val="0"/>
         </w:rPr>
-        <w:t>5.1 P0 到 P8 的简化路线</w:t>
+        <w:t>5.1 路线总览</w:t>
       </w:r>
     </w:p>
     <w:p>
@@ -3362,7 +1902,7 @@
         <w:drawing>
           <wp:inline xmlns:a="http://schemas.openxmlformats.org/drawingml/2006/main" xmlns:pic="http://schemas.openxmlformats.org/drawingml/2006/picture">
             <wp:extent cx="5897880" cy="2546812"/>
-            <wp:docPr id="5" name="Picture 5" descr="汇报文档示意图"/>
+            <wp:docPr id="8" name="Picture 8" descr="汇报文档示意图 8"/>
             <wp:cNvGraphicFramePr>
               <a:graphicFrameLocks noChangeAspect="1"/>
             </wp:cNvGraphicFramePr>
@@ -3374,7 +1914,7 @@
                     <pic:cNvPicPr/>
                   </pic:nvPicPr>
                   <pic:blipFill>
-                    <a:blip r:embed="rId14"/>
+                    <a:blip r:embed="rId17"/>
                     <a:stretch>
                       <a:fillRect/>
                     </a:stretch>
@@ -3399,7 +1939,7 @@
         <w:jc w:val="center"/>
       </w:pPr>
       <w:r>
-        <w:t>图 8 工程路线：先把任务和证据链站稳，再决定是否需要 RL</w:t>
+        <w:t>图 8　工程路线：先把任务和证据链站稳，再决定是否需要 RL。</w:t>
       </w:r>
     </w:p>
     <w:tbl>
@@ -3420,7 +1960,7 @@
         </w:trPr>
         <w:tc>
           <w:tcPr>
-            <w:tcW w:type="dxa" w:w="1134"/>
+            <w:tcW w:type="dxa" w:w="964"/>
             <w:shd w:fill="1F4E79"/>
             <w:tcBorders>
               <w:top w:val="single" w:sz="6" w:space="0" w:color="D9D9D9"/>
@@ -3447,7 +1987,7 @@
               <w:rPr>
                 <w:b/>
                 <w:color w:val="FFFFFF"/>
-                <w:sz w:val="16"/>
+                <w:sz w:val="15"/>
               </w:rPr>
               <w:t>阶段</w:t>
             </w:r>
@@ -3482,15 +2022,15 @@
               <w:rPr>
                 <w:b/>
                 <w:color w:val="FFFFFF"/>
-                <w:sz w:val="16"/>
+                <w:sz w:val="15"/>
               </w:rPr>
-              <w:t>主要问题</w:t>
+              <w:t>要回答的问题</w:t>
             </w:r>
           </w:p>
         </w:tc>
         <w:tc>
           <w:tcPr>
-            <w:tcW w:type="dxa" w:w="5726"/>
+            <w:tcW w:type="dxa" w:w="5896"/>
             <w:shd w:fill="1F4E79"/>
             <w:tcBorders>
               <w:top w:val="single" w:sz="6" w:space="0" w:color="D9D9D9"/>
@@ -3517,7 +2057,7 @@
               <w:rPr>
                 <w:b/>
                 <w:color w:val="FFFFFF"/>
-                <w:sz w:val="16"/>
+                <w:sz w:val="15"/>
               </w:rPr>
               <w:t>主要产物和退出条件</w:t>
             </w:r>
@@ -3551,7 +2091,7 @@
             </w:pPr>
             <w:r>
               <w:rPr>
-                <w:sz w:val="16"/>
+                <w:sz w:val="15"/>
               </w:rPr>
               <w:t>P0</w:t>
             </w:r>
@@ -3583,9 +2123,9 @@
             </w:pPr>
             <w:r>
               <w:rPr>
-                <w:sz w:val="16"/>
+                <w:sz w:val="15"/>
               </w:rPr>
-              <w:t>项目边界是否说清</w:t>
+              <w:t>项目边界和指标是否一致</w:t>
             </w:r>
           </w:p>
         </w:tc>
@@ -3615,9 +2155,9 @@
             </w:pPr>
             <w:r>
               <w:rPr>
-                <w:sz w:val="16"/>
+                <w:sz w:val="15"/>
               </w:rPr>
-              <w:t>研究计划、实施计划、当前状态和评测口径一致</w:t>
+              <w:t>研究计划、实施计划、状态和评测口径一致</w:t>
             </w:r>
           </w:p>
         </w:tc>
@@ -3650,7 +2190,7 @@
             </w:pPr>
             <w:r>
               <w:rPr>
-                <w:sz w:val="16"/>
+                <w:sz w:val="15"/>
               </w:rPr>
               <w:t>P1</w:t>
             </w:r>
@@ -3683,7 +2223,7 @@
             </w:pPr>
             <w:r>
               <w:rPr>
-                <w:sz w:val="16"/>
+                <w:sz w:val="15"/>
               </w:rPr>
               <w:t>机器人能否稳定探索并可评估</w:t>
             </w:r>
@@ -3716,9 +2256,9 @@
             </w:pPr>
             <w:r>
               <w:rPr>
-                <w:sz w:val="16"/>
+                <w:sz w:val="15"/>
               </w:rPr>
-              <w:t>Gazebo TurtleBot3、SLAM、frontier、Nav2、真值评估器、跨 world 探索基线</w:t>
+              <w:t>Gazebo TurtleBot3、SLAM、frontier、Nav2、评估器、跨 world 基线</w:t>
             </w:r>
           </w:p>
         </w:tc>
@@ -3750,7 +2290,7 @@
             </w:pPr>
             <w:r>
               <w:rPr>
-                <w:sz w:val="16"/>
+                <w:sz w:val="15"/>
               </w:rPr>
               <w:t>P2</w:t>
             </w:r>
@@ -3782,9 +2322,9 @@
             </w:pPr>
             <w:r>
               <w:rPr>
-                <w:sz w:val="16"/>
+                <w:sz w:val="15"/>
               </w:rPr>
-              <w:t>探索、发现、集合、返航充电能否连起来</w:t>
+              <w:t>探索、发现、集合、返航充电能否连成一个任务</w:t>
             </w:r>
           </w:p>
         </w:tc>
@@ -3814,7 +2354,7 @@
             </w:pPr>
             <w:r>
               <w:rPr>
-                <w:sz w:val="16"/>
+                <w:sz w:val="15"/>
               </w:rPr>
               <w:t>目标确认、权威状态机、不同集合位姿、电池安全和完整理想任务基线</w:t>
             </w:r>
@@ -3849,7 +2389,7 @@
             </w:pPr>
             <w:r>
               <w:rPr>
-                <w:sz w:val="16"/>
+                <w:sz w:val="15"/>
               </w:rPr>
               <w:t>P3</w:t>
             </w:r>
@@ -3882,9 +2422,9 @@
             </w:pPr>
             <w:r>
               <w:rPr>
-                <w:sz w:val="16"/>
+                <w:sz w:val="15"/>
               </w:rPr>
-              <w:t>以后网络故障是否真的能改变信息</w:t>
+              <w:t>网络故障能否改变信息和任务状态</w:t>
             </w:r>
           </w:p>
         </w:tc>
@@ -3915,9 +2455,9 @@
             </w:pPr>
             <w:r>
               <w:rPr>
-                <w:sz w:val="16"/>
+                <w:sz w:val="15"/>
               </w:rPr>
-              <w:t>GatewayEnvelope、候选/交付/消费账本、TTL/序号/ACK/重传、固定 delay/loss、freshness 降级和可视化</w:t>
+              <w:t>GatewayEnvelope、候选/交付/消费账本、TTL/序号/ACK/重传、可视化和 fault-mode</w:t>
             </w:r>
           </w:p>
         </w:tc>
@@ -3949,7 +2489,7 @@
             </w:pPr>
             <w:r>
               <w:rPr>
-                <w:sz w:val="16"/>
+                <w:sz w:val="15"/>
               </w:rPr>
               <w:t>P4</w:t>
             </w:r>
@@ -3981,7 +2521,7 @@
             </w:pPr>
             <w:r>
               <w:rPr>
-                <w:sz w:val="16"/>
+                <w:sz w:val="15"/>
               </w:rPr>
               <w:t>ns-3 是否和应用时间、字节、位置对上</w:t>
             </w:r>
@@ -4013,9 +2553,9 @@
             </w:pPr>
             <w:r>
               <w:rPr>
-                <w:sz w:val="16"/>
+                <w:sz w:val="15"/>
               </w:rPr>
-              <w:t>trace 对账、时间同步、Gazebo mobility、802.11n AP/STA、墙损耗、背景干扰、排队/重传/交付指标</w:t>
+              <w:t>trace 对账、Gazebo mobility、802.11n AP/STA、墙损耗、干扰、队列/重传/交付指标</w:t>
             </w:r>
           </w:p>
         </w:tc>
@@ -4048,7 +2588,7 @@
             </w:pPr>
             <w:r>
               <w:rPr>
-                <w:sz w:val="16"/>
+                <w:sz w:val="15"/>
               </w:rPr>
               <w:t>P5</w:t>
             </w:r>
@@ -4081,7 +2621,7 @@
             </w:pPr>
             <w:r>
               <w:rPr>
-                <w:sz w:val="16"/>
+                <w:sz w:val="15"/>
               </w:rPr>
               <w:t>问题是否真的需要 RL</w:t>
             </w:r>
@@ -4114,9 +2654,9 @@
             </w:pPr>
             <w:r>
               <w:rPr>
-                <w:sz w:val="16"/>
+                <w:sz w:val="15"/>
               </w:rPr>
-              <w:t>真实负载审计；强非学习基线和 SchedNet-inspired；记录 RL go/no-go</w:t>
+              <w:t>真实负载审计、强非学习基线、SchedNet-inspired 基线和 RL go/no-go</w:t>
             </w:r>
           </w:p>
         </w:tc>
@@ -4148,7 +2688,7 @@
             </w:pPr>
             <w:r>
               <w:rPr>
-                <w:sz w:val="16"/>
+                <w:sz w:val="15"/>
               </w:rPr>
               <w:t>P6</w:t>
             </w:r>
@@ -4180,7 +2720,7 @@
             </w:pPr>
             <w:r>
               <w:rPr>
-                <w:sz w:val="16"/>
+                <w:sz w:val="15"/>
               </w:rPr>
               <w:t>若有长期决策空间，如何学习</w:t>
             </w:r>
@@ -4212,9 +2752,9 @@
             </w:pPr>
             <w:r>
               <w:rPr>
-                <w:sz w:val="16"/>
+                <w:sz w:val="15"/>
               </w:rPr>
-              <w:t>集中式 POMDP 调度、硬安全覆盖、可部署观测、checkpoint 和验证集选模</w:t>
+              <w:t>集中式 POMDP、硬安全覆盖、可部署观测、checkpoint 和验证集选模</w:t>
             </w:r>
           </w:p>
         </w:tc>
@@ -4247,7 +2787,7 @@
             </w:pPr>
             <w:r>
               <w:rPr>
-                <w:sz w:val="16"/>
+                <w:sz w:val="15"/>
               </w:rPr>
               <w:t>P7</w:t>
             </w:r>
@@ -4280,9 +2820,9 @@
             </w:pPr>
             <w:r>
               <w:rPr>
-                <w:sz w:val="16"/>
+                <w:sz w:val="15"/>
               </w:rPr>
-              <w:t>是否能泛化、是否只是调参</w:t>
+              <w:t>是否能泛化，而不是只调好一个场景</w:t>
             </w:r>
           </w:p>
         </w:tc>
@@ -4313,7 +2853,7 @@
             </w:pPr>
             <w:r>
               <w:rPr>
-                <w:sz w:val="16"/>
+                <w:sz w:val="15"/>
               </w:rPr>
               <w:t>held-out world/目标/干扰/seed、配对统计、置信区间、消融和失败原因</w:t>
             </w:r>
@@ -4347,7 +2887,7 @@
             </w:pPr>
             <w:r>
               <w:rPr>
-                <w:sz w:val="16"/>
+                <w:sz w:val="15"/>
               </w:rPr>
               <w:t>P8</w:t>
             </w:r>
@@ -4379,7 +2919,7 @@
             </w:pPr>
             <w:r>
               <w:rPr>
-                <w:sz w:val="16"/>
+                <w:sz w:val="15"/>
               </w:rPr>
               <w:t>能否走出仿真</w:t>
             </w:r>
@@ -4411,9 +2951,9 @@
             </w:pPr>
             <w:r>
               <w:rPr>
-                <w:sz w:val="16"/>
+                <w:sz w:val="15"/>
               </w:rPr>
-              <w:t>单机真实感知与 UDP/Wi-Fi、双机端到端任务、sim-to-real 差异和安全证据</w:t>
+              <w:t>真实感知、UDP/Wi-Fi、双机端到端任务、sim-to-real 差异和安全证据</w:t>
             </w:r>
           </w:p>
         </w:tc>
@@ -4432,7 +2972,7 @@
         <w:rPr>
           <w:i w:val="0"/>
         </w:rPr>
-        <w:t>5.2 当前真正的下一道门</w:t>
+        <w:t>5.2 当前最近的工程门</w:t>
       </w:r>
     </w:p>
     <w:p>
@@ -4446,7 +2986,7 @@
         <w:t xml:space="preserve">• </w:t>
       </w:r>
       <w:r>
-        <w:t>在当前 HEAD 重新跑 P2D 完整理想通信矩阵、P3A 旁路和 gateway 审计，生成新的 commit/config/environment manifest。</w:t>
+        <w:t>在当前 HEAD 重新冻结 P2D 完整理想通信矩阵、P3A 旁路和 gateway 审计，生成新的 commit/config/environment manifest。</w:t>
       </w:r>
     </w:p>
     <w:p>
@@ -4460,7 +3000,7 @@
         <w:t xml:space="preserve">• </w:t>
       </w:r>
       <w:r>
-        <w:t>完成 P3B.5 的 Gazebo fault-mode 任务矩阵，检查未交付信息是否阻止错误的 RALLY、stale-state 是否触发安全等待、单机故障后健康机器人是否继续。</w:t>
+        <w:t>完成 P3B.5 的 Gazebo fault-mode 任务矩阵：未交付目标不能错误进入 `RALLY`，stale-state 应触发安全等待，单机故障后健康机器人仍能按口径继续。</w:t>
       </w:r>
     </w:p>
     <w:p>
@@ -4492,11 +3032,6 @@
       </w:r>
     </w:p>
     <w:p>
-      <w:r>
-        <w:br w:type="page"/>
-      </w:r>
-    </w:p>
-    <w:p>
       <w:pPr>
         <w:pStyle w:val="Heading1"/>
       </w:pPr>
@@ -4504,7 +3039,7 @@
         <w:rPr>
           <w:i w:val="0"/>
         </w:rPr>
-        <w:t>6 已经完成的工作和目前证据</w:t>
+        <w:t>6 已经完成的工作、证据和边界</w:t>
       </w:r>
     </w:p>
     <w:p>
@@ -4536,7 +3071,7 @@
         </w:trPr>
         <w:tc>
           <w:tcPr>
-            <w:tcW w:type="dxa" w:w="1701"/>
+            <w:tcW w:type="dxa" w:w="1757"/>
             <w:shd w:fill="1F4E79"/>
             <w:tcBorders>
               <w:top w:val="single" w:sz="6" w:space="0" w:color="D9D9D9"/>
@@ -4571,7 +3106,7 @@
         </w:tc>
         <w:tc>
           <w:tcPr>
-            <w:tcW w:type="dxa" w:w="3515"/>
+            <w:tcW w:type="dxa" w:w="3402"/>
             <w:shd w:fill="1F4E79"/>
             <w:tcBorders>
               <w:top w:val="single" w:sz="6" w:space="0" w:color="D9D9D9"/>
@@ -4606,7 +3141,7 @@
         </w:tc>
         <w:tc>
           <w:tcPr>
-            <w:tcW w:type="dxa" w:w="3912"/>
+            <w:tcW w:type="dxa" w:w="3969"/>
             <w:shd w:fill="1F4E79"/>
             <w:tcBorders>
               <w:top w:val="single" w:sz="6" w:space="0" w:color="D9D9D9"/>
@@ -4635,7 +3170,7 @@
                 <w:color w:val="FFFFFF"/>
                 <w:sz w:val="15"/>
               </w:rPr>
-              <w:t>现在的边界</w:t>
+              <w:t>边界</w:t>
             </w:r>
           </w:p>
         </w:tc>
@@ -4669,7 +3204,7 @@
               <w:rPr>
                 <w:sz w:val="15"/>
               </w:rPr>
-              <w:t>wireless-rl</w:t>
+              <w:t>`wireless-rl`</w:t>
             </w:r>
           </w:p>
         </w:tc>
@@ -4701,7 +3236,7 @@
               <w:rPr>
                 <w:sz w:val="15"/>
               </w:rPr>
-              <w:t>ns-3/ns3-gym 的 5 用户抽象队列调度 MDP，已有 baseline、DQN、checkpoint、多 seed 工具</w:t>
+              <w:t>ns-3/ns3-gym 的 5 用户抽象队列调度 MDP，已有 baseline、DQN、checkpoint 和多 seed 工具</w:t>
             </w:r>
           </w:p>
         </w:tc>
@@ -4733,7 +3268,7 @@
               <w:rPr>
                 <w:sz w:val="15"/>
               </w:rPr>
-              <w:t>还没有真实 Wi-Fi 节点、传播、干扰和机器人任务，历史结果只能说明工具链可用</w:t>
+              <w:t>还没有真实 Wi-Fi 节点、传播、干扰和机器人任务；历史结果只能说明工具链可用</w:t>
             </w:r>
           </w:p>
         </w:tc>
@@ -4768,7 +3303,7 @@
               <w:rPr>
                 <w:sz w:val="15"/>
               </w:rPr>
-              <w:t>multi_robot</w:t>
+              <w:t>`multi_robot`</w:t>
             </w:r>
           </w:p>
         </w:tc>
@@ -4801,7 +3336,7 @@
               <w:rPr>
                 <w:sz w:val="15"/>
               </w:rPr>
-              <w:t>Gazebo world、TurtleBot3 模型、SLAM/Nav2、启动参数和任务场景</w:t>
+              <w:t>Gazebo world、TurtleBot3、SLAM/Nav2、启动参数和任务场景</w:t>
             </w:r>
           </w:p>
         </w:tc>
@@ -4868,7 +3403,7 @@
               <w:rPr>
                 <w:sz w:val="15"/>
               </w:rPr>
-              <w:t>merge_map</w:t>
+              <w:t>`merge_map`</w:t>
             </w:r>
           </w:p>
         </w:tc>
@@ -4967,7 +3502,7 @@
               <w:rPr>
                 <w:sz w:val="15"/>
               </w:rPr>
-              <w:t>multi_robot_exploration/control.py</w:t>
+              <w:t>`multi_robot_exploration/control.py`</w:t>
             </w:r>
           </w:p>
         </w:tc>
@@ -5000,7 +3535,7 @@
               <w:rPr>
                 <w:sz w:val="15"/>
               </w:rPr>
-              <w:t>总部协同探索、frontier、目标后集合、失败隔离</w:t>
+              <w:t>协同探索、frontier、目标后集合、失败隔离</w:t>
             </w:r>
           </w:p>
         </w:tc>
@@ -5067,7 +3602,7 @@
               <w:rPr>
                 <w:sz w:val="15"/>
               </w:rPr>
-              <w:t>ideal_gateway.py</w:t>
+              <w:t>`ideal_gateway.py`</w:t>
             </w:r>
           </w:p>
         </w:tc>
@@ -5166,7 +3701,7 @@
               <w:rPr>
                 <w:sz w:val="15"/>
               </w:rPr>
-              <w:t>battery_manager.py</w:t>
+              <w:t>`battery_manager.py`</w:t>
             </w:r>
           </w:p>
         </w:tc>
@@ -5232,7 +3767,7 @@
               <w:rPr>
                 <w:sz w:val="15"/>
               </w:rPr>
-              <w:t>第一版 c_tx=0，共享充电器和通信能耗未实现</w:t>
+              <w:t>第一版 `c_tx=0`，共享充电器和通信能耗未实现</w:t>
             </w:r>
           </w:p>
         </w:tc>
@@ -5266,7 +3801,7 @@
               <w:rPr>
                 <w:sz w:val="15"/>
               </w:rPr>
-              <w:t>task_evaluator.py</w:t>
+              <w:t>`task_evaluator.py`</w:t>
             </w:r>
           </w:p>
         </w:tc>
@@ -5298,7 +3833,7 @@
               <w:rPr>
                 <w:sz w:val="15"/>
               </w:rPr>
-              <w:t>只读评估器，记录覆盖率、地图质量、路径、碰撞、阶段、电池和失败原因</w:t>
+              <w:t>记录覆盖率、地图质量、路径、碰撞、阶段、电池和失败原因</w:t>
             </w:r>
           </w:p>
         </w:tc>
@@ -5349,7 +3884,7 @@
         <w:rPr>
           <w:i w:val="0"/>
         </w:rPr>
-        <w:t>6.2 已经形成的任务层证据</w:t>
+        <w:t>6.2 任务层已经形成的证据</w:t>
       </w:r>
     </w:p>
     <w:p>
@@ -5361,7 +3896,7 @@
         <w:drawing>
           <wp:inline xmlns:a="http://schemas.openxmlformats.org/drawingml/2006/main" xmlns:pic="http://schemas.openxmlformats.org/drawingml/2006/picture">
             <wp:extent cx="5897880" cy="2527663"/>
-            <wp:docPr id="6" name="Picture 6" descr="汇报文档示意图"/>
+            <wp:docPr id="9" name="Picture 9" descr="汇报文档示意图 9"/>
             <wp:cNvGraphicFramePr>
               <a:graphicFrameLocks noChangeAspect="1"/>
             </wp:cNvGraphicFramePr>
@@ -5373,7 +3908,7 @@
                     <pic:cNvPicPr/>
                   </pic:nvPicPr>
                   <pic:blipFill>
-                    <a:blip r:embed="rId15"/>
+                    <a:blip r:embed="rId18"/>
                     <a:stretch>
                       <a:fillRect/>
                     </a:stretch>
@@ -5398,7 +3933,7 @@
         <w:jc w:val="center"/>
       </w:pPr>
       <w:r>
-        <w:t>图 9 阶段性证据：工程闭环已有结果，网络策略结论尚未开始</w:t>
+        <w:t>图 9　阶段性证据：任务闭环和日志证据逐步形成，网络策略结论尚未开始。</w:t>
       </w:r>
     </w:p>
     <w:p>
@@ -5425,7 +3960,7 @@
         <w:rPr>
           <w:i w:val="0"/>
         </w:rPr>
-        <w:t>P2C 强制充电。两机器人 seed 303、初始能量 18 的 episode 中，两台机器人各返航和充电 1 次，之后继续完成任务；最终 `COMPLETE`，总完成时间 190.1 秒，最低能量 6.661，碰撞和搜索重叠均为 0。这里的能量模型仍是可校准的简化模型，通信能耗暂设为 `c_tx=0`。</w:t>
+        <w:t>P2C 强制充电。两机器人 seed 303、初始能量 18 的 episode 中，两台机器人各返航和充电 1 次，之后继续完成任务；最终 `COMPLETE`，总完成时间 190.1 秒，最低能量 6.661，碰撞和搜索重叠均为 0。能量模型仍是可校准的简化模型，通信能耗暂设为 `c_tx=0`。</w:t>
       </w:r>
     </w:p>
     <w:p>
@@ -5434,7 +3969,7 @@
         <w:rPr>
           <w:i w:val="0"/>
         </w:rPr>
-        <w:t>P2D 完整理想通信基线。lab、rooms、corridors 三种场景共 10 项固定矩阵全部 `COMPLETE`、零碰撞、零基础设施失败；lab seed 202 和 corridors 双机器人交叉格发生过安全充电。场景初始能量分别为 40、40、45。它是“理想通信上界”，不是 Wi-Fi 结果。</w:t>
+        <w:t>P2D 完整理想通信基线。lab、rooms、corridors 三种场景共 10 项固定矩阵全部 `COMPLETE`、零碰撞、零基础设施失败；lab seed 202 和 corridors 双机器人交叉格发生过安全充电。场景初始能量分别为 40、40、45。它是理想通信上界，不是 Wi-Fi 结果。</w:t>
       </w:r>
     </w:p>
     <w:p>
@@ -5445,7 +3980,7 @@
         <w:rPr>
           <w:i w:val="0"/>
         </w:rPr>
-        <w:t>6.3 P3 的当前边界</w:t>
+        <w:t>6.3 P3 当前进展和保留边界</w:t>
       </w:r>
     </w:p>
     <w:p>
@@ -5454,7 +3989,7 @@
         <w:rPr>
           <w:i w:val="0"/>
         </w:rPr>
-        <w:t>P3A 历史批次已经证明中央地图、位姿、TF、电量、目标检测和 Nav2 命令可以通过同一个显式 gateway；旁路审计能检查中央是否绕过 gateway 直接订阅机器人 topic 或调用 action。但教师评审后，当前 task-stack 又发生了协调器、电池和路径净空修改，所以必须先做 P3A.6 重新冻结。</w:t>
+        <w:t>P3A 的历史批次证明中央地图、位姿、TF、电量、目标检测和 Nav2 命令可以通过同一个显式 gateway；旁路审计能检查是否绕过 gateway 直接订阅机器人 topic 或调用 action。由于当前 task-stack 又发生了协调器、电池和路径净空修改，P3A.6 需要在当前 HEAD 重新冻结。</w:t>
       </w:r>
     </w:p>
     <w:p>
@@ -5463,7 +3998,7 @@
         <w:rPr>
           <w:i w:val="0"/>
         </w:rPr>
-        <w:t>P3B 已完成的范围是固定 seed 的应用层 delay/loss transport、TTL、序号、重复/乱序、有限重传和逐消息账本。2026-09-28 的协议门禁为 4 项单测通过、54 格固定矩阵 PASS。100% 上行丢包的 Gazebo smoke 保留为失败样本，并且它符合“目标信息未交付时不能进入 RALLY”的安全预期；它还不是 fault-mode 任务成功率，也不是 Wi-Fi 性能。</w:t>
+        <w:t>P3B 已完成的范围是固定 seed 的应用层 delay/loss transport、TTL、序号、重复/乱序、有限重传和逐消息账本。2026-09-28 的协议门禁为 4 项单测通过、54 格固定矩阵 `PASS`。100% 上行丢包的 Gazebo smoke 保留为失败样本，它符合“目标信息未交付时不能进入 RALLY”的安全预期；它还不是 fault-mode 任务成功率，也不是 Wi-Fi 性能。</w:t>
       </w:r>
     </w:p>
     <w:p>
@@ -5474,7 +4009,7 @@
         <w:rPr>
           <w:i w:val="0"/>
         </w:rPr>
-        <w:t>6.4 2026-09-29 当前探索性诊断</w:t>
+        <w:t>6.4 最近的探索性诊断</w:t>
       </w:r>
     </w:p>
     <w:p>
@@ -5488,7 +4023,7 @@
         <w:t xml:space="preserve">• </w:t>
       </w:r>
       <w:r>
-        <w:t>单机器人初始能量 18 的 180 秒探索 smoke 中，实际发生 1 次返航和充电，之后恢复为 ACTIVE；最低能量 10.66，零碰撞，覆盖率 0.789。说明本地返航—充电—恢复闭环可以被日志看到。</w:t>
+        <w:t>单机器人初始能量 18 的 180 秒探索 smoke 中，实际发生 1 次返航和充电，之后恢复为 `ACTIVE`；最低能量 10.66，零碰撞，覆盖率 0.789。说明本地返航—充电—恢复闭环可以被日志观察到。</w:t>
       </w:r>
     </w:p>
     <w:p>
@@ -5502,7 +4037,7 @@
         <w:t xml:space="preserve">• </w:t>
       </w:r>
       <w:r>
-        <w:t>双机器人 120 秒联合探索中，nav_goal_count=24、成功 22、无 abort、正确自由覆盖率 0.9101、搜索重叠 0、碰撞 0。说明新的任务分配没有等待所有机器人或让一台机器人独占全部 frontier。</w:t>
+        <w:t>双机器人 120 秒联合探索中，`nav_goal_count=24`、成功 22、无 abort、正确自由覆盖率 0.9101、搜索重叠 0、碰撞 0。说明新的任务分配没有等待所有机器人或让一台机器人独占全部 frontier。</w:t>
       </w:r>
     </w:p>
     <w:p>
@@ -5516,7 +4051,7 @@
         <w:t xml:space="preserve">• </w:t>
       </w:r>
       <w:r>
-        <w:t>三机器人 RALLY 的动态占位死锁修复刚完成组件测试和构建，现场进程需要在干净 ROS domain 中重新启动验证。它属于当前 task-stack 的探索性工作，不应被写成已经通过的 P3A.6。</w:t>
+        <w:t>三机器人 RALLY 的动态占位死锁修复刚完成组件测试和构建，干净 ROS domain 下的进程重启验证仍待完成。这属于当前 task-stack 的探索性工作，不写成已经通过 P3A.6。</w:t>
       </w:r>
     </w:p>
     <w:p>
@@ -5527,7 +4062,7 @@
         <w:rPr>
           <w:i w:val="0"/>
         </w:rPr>
-        <w:t>6.5 需要保留的失败和限制</w:t>
+        <w:t>6.5 失败和限制也要保留</w:t>
       </w:r>
     </w:p>
     <w:p>
@@ -5541,7 +4076,7 @@
         <w:t xml:space="preserve">• </w:t>
       </w:r>
       <w:r>
-        <w:t>P3A.5 的历史当前 HEAD 批次曾出现 9/10 正式 episode 完成，lab seed 202 在启动后 RALLY 阶段失败；失败 episode 必须保留，不能用成功重跑覆盖。</w:t>
+        <w:t>P3A.5 历史当前 HEAD 批次曾出现 9/10 正式 episode 完成，lab seed 202 在启动后 `RALLY` 阶段失败；失败 episode 必须保留，不能用成功重跑覆盖。</w:t>
       </w:r>
     </w:p>
     <w:p>
@@ -5583,7 +4118,7 @@
         <w:t xml:space="preserve">• </w:t>
       </w:r>
       <w:r>
-        <w:t>电池返航目前使用保守的路径启发式，不能宣称一般安全保证；真实通信能耗、共享充电器排队和机械对接尚未做。</w:t>
+        <w:t>电池返航目前使用保守的路径启发式，真实通信能耗、共享充电器排队和机械对接尚未做。</w:t>
       </w:r>
     </w:p>
     <w:p>
@@ -5597,7 +4132,7 @@
         <w:t xml:space="preserve">• </w:t>
       </w:r>
       <w:r>
-        <w:t>机器人地图 origin 已要求预先对齐，当前不处理任意未知初始位姿下的地图配准。</w:t>
+        <w:t>机器人地图 origin 需要预先对齐，当前不处理任意未知初始位姿下的地图配准。</w:t>
       </w:r>
     </w:p>
     <w:p>
@@ -5612,11 +4147,6 @@
       </w:r>
       <w:r>
         <w:t>旧 ROS 进程、Fast DDS domain、CPU/Gazebo 负载会造成基础设施失败，必须和 episode 开始后的任务失败分开记录。</w:t>
-      </w:r>
-    </w:p>
-    <w:p>
-      <w:r>
-        <w:br w:type="page"/>
       </w:r>
     </w:p>
     <w:p>
@@ -5647,7 +4177,7 @@
         <w:rPr>
           <w:i w:val="0"/>
         </w:rPr>
-        <w:t>现场演示不追求“跑出一个漂亮数字”，而是让大家看到任务、通信边界和日志之间的关系。建议主演示使用 2 台机器人，时间紧张时先关闭全局 RViz；资源充足再切换到 3 台机器人。</w:t>
+        <w:t>主演示使用 2 台机器人：先看陌生环境中的协同探索，再看目标确认、集合、状态记录和可选的返航充电。时间和计算资源充足时再切换到 3 台机器人。演示的重点是让任务状态、通信边界和日志之间能互相对上，而不是临时追求一个更大的数字。</w:t>
       </w:r>
     </w:p>
     <w:p>
@@ -5855,7 +4385,7 @@
         <w:rPr>
           <w:i w:val="0"/>
         </w:rPr>
-        <w:t>Gazebo 中可以介绍：蓝色环是共同起始/充电区，红色环表示目标检测范围，橙色圆盘是目标确认后分配的集合位姿；右侧状态栏显示任务阶段、Nav2、电池模式和位姿。演示时可以打开一个终端观察：</w:t>
+        <w:t>Gazebo 中蓝色环是共同起始/充电区，红色环表示目标检测范围，橙色圆盘是目标确认后分配的集合位姿；右侧状态栏显示任务阶段、Nav2、电池模式和位姿。需要时可在另一个终端观察：</w:t>
       </w:r>
     </w:p>
     <w:p>
@@ -5910,7 +4440,7 @@
         <w:t xml:space="preserve">• </w:t>
       </w:r>
       <w:r>
-        <w:t>先看场景：两台机器人共同出发，各自探索，不预先知道地图和目标位置。</w:t>
+        <w:t>两台机器人共同出发，各自探索，不预先知道地图和目标位置。</w:t>
       </w:r>
     </w:p>
     <w:p>
@@ -5924,7 +4454,7 @@
         <w:t xml:space="preserve">• </w:t>
       </w:r>
       <w:r>
-        <w:t>再看协同：合并地图和 frontier 分配让两台机器人走向不同区域，强调任务层目前先固定。</w:t>
+        <w:t>合并地图和 frontier 分配让两台机器人走向不同区域，说明任务层目前先固定。</w:t>
       </w:r>
     </w:p>
     <w:p>
@@ -5938,7 +4468,7 @@
         <w:t xml:space="preserve">• </w:t>
       </w:r>
       <w:r>
-        <w:t>等目标确认：状态从 EXPLORE 经过 FOUND_UNCONFIRMED、FOUND 进入 RALLY；解释目标检测是 Gazebo MVP，不把它讲成真实视觉识别。</w:t>
+        <w:t>目标确认后，状态从 `EXPLORE` 经过 `FOUND_UNCONFIRMED`、`FOUND` 进入 `RALLY`；目标检测是 Gazebo MVP，不把它讲成真实视觉识别。</w:t>
       </w:r>
     </w:p>
     <w:p>
@@ -5952,7 +4482,7 @@
         <w:t xml:space="preserve">• </w:t>
       </w:r>
       <w:r>
-        <w:t>看集合：两台机器人被分到不同橙色集合位姿，连续稳定后才进入 COMPLETE。</w:t>
+        <w:t>两台机器人被分到不同橙色集合位姿，连续稳定后进入 `COMPLETE`。</w:t>
       </w:r>
     </w:p>
     <w:p>
@@ -5966,7 +4496,7 @@
         <w:t xml:space="preserve">• </w:t>
       </w:r>
       <w:r>
-        <w:t>可选电池演示：时间允许时改用两机器人强制充电命令，展示返回、充电和恢复；如果现场资源不足，不要临时切换三机器人低电量参数。</w:t>
+        <w:t>时间允许时再展示低电量返航、充电和恢复；如果资源不足，不临时切换三机器人低电量参数。</w:t>
       </w:r>
     </w:p>
     <w:p>
@@ -5980,7 +4510,7 @@
         <w:t xml:space="preserve">• </w:t>
       </w:r>
       <w:r>
-        <w:t>最后打开日志：展示任务评估 JSON/CSV 和 gateway message events，说明成功/失败、消息交付、任务阶段如何对上。</w:t>
+        <w:t>最后打开任务评估 JSON/CSV 和 gateway message events，对照成功/失败、消息交付和任务阶段。</w:t>
       </w:r>
     </w:p>
     <w:p>
@@ -5991,7 +4521,7 @@
         <w:rPr>
           <w:i w:val="0"/>
         </w:rPr>
-        <w:t>7.4 演示中的诚实口径</w:t>
+        <w:t>7.4 演示口径</w:t>
       </w:r>
     </w:p>
     <w:p>
@@ -6000,7 +4530,7 @@
         <w:rPr>
           <w:i/>
         </w:rPr>
-        <w:t>可以说：“现在演示的是任务层和消息边界已经能运行；真正的 Wi-Fi 4 排队、竞争、重传和干扰耦合还在后面。今天希望大家帮我判断这个问题定义和路线是否值得继续。”</w:t>
+        <w:t>可以说：“现在演示的是任务层和消息边界已经能运行；真正的 Wi-Fi 4 排队、竞争、重传和干扰耦合还在后面。”</w:t>
       </w:r>
     </w:p>
     <w:p>
@@ -6009,12 +4539,7 @@
         <w:rPr>
           <w:i/>
         </w:rPr>
-        <w:t>不要说：“Gazebo 跑通了，所以无线调度策略已经证明有效。”</w:t>
-      </w:r>
-    </w:p>
-    <w:p>
-      <w:r>
-        <w:br w:type="page"/>
+        <w:t>不把 Gazebo 跑通直接等同于无线调度策略已经有效。</w:t>
       </w:r>
     </w:p>
     <w:p>
@@ -6025,7 +4550,7 @@
         <w:rPr>
           <w:i w:val="0"/>
         </w:rPr>
-        <w:t>8 现在的反思和希望一起讨论的问题</w:t>
+        <w:t>8 反思与待讨论的问题</w:t>
       </w:r>
     </w:p>
     <w:p>
@@ -6036,7 +4561,7 @@
         <w:rPr>
           <w:i w:val="0"/>
         </w:rPr>
-        <w:t>8.1 项目实施阶段遇到的问题</w:t>
+        <w:t>8.1 实施阶段的几个认识</w:t>
       </w:r>
     </w:p>
     <w:p>
@@ -6045,7 +4570,7 @@
         <w:rPr>
           <w:i w:val="0"/>
         </w:rPr>
-        <w:t>任务闭环比想象中更脆弱。Nav2 lifecycle、地图坐标、全局/局部 costmap、动态障碍和电池返航会互相影响。之前出现过目标区动态占位死锁、返航 action 被迟到结果拉走、充电恢复后起点落在 lethal space 等问题。它们提醒我：如果不先把任务栈和失败分类冻结，后面网络实验很难解释。</w:t>
+        <w:t>任务闭环比想象中更脆弱。Nav2 lifecycle、地图坐标、全局/局部 costmap、动态障碍和电池返航会互相影响。之前出现过目标区动态占位死锁、返航 action 被迟到结果拉走、充电恢复后起点落在 lethal space 等问题。如果不先冻结任务栈和失败分类，后面的网络实验很难解释。</w:t>
       </w:r>
     </w:p>
     <w:p>
@@ -6063,7 +4588,7 @@
         <w:rPr>
           <w:i w:val="0"/>
         </w:rPr>
-        <w:t>网络未必一定是瓶颈。如果真实候选负载很小、消息很少过期，那么人为注入拥塞再训练 RL 只会制造一个不自然的问题。相反，可能更有价值的结果是：在合理负载下节省通信，而任务不变差。</w:t>
+        <w:t>网络可能不是瓶颈。如果真实候选负载很小、消息很少过期，人为注入拥塞再训练 RL 只会制造一个不自然的问题。更有价值的结果可能是：在合理负载下节省通信，而任务不变差。</w:t>
       </w:r>
     </w:p>
     <w:p>
@@ -6072,7 +4597,7 @@
         <w:rPr>
           <w:i w:val="0"/>
         </w:rPr>
-        <w:t>仿真到实物不是最后一步的简单复制。Gazebo 里的真值检测、同机 ROS 2/DDS 和理想 gateway 不能替代真实相机、UDP/Wi-Fi、时钟、遮挡和安全策略。实物链路需要单独校准和保留失败样本。</w:t>
+        <w:t>仿真到实物不是最后一步的复制。Gazebo 真值检测、同机 ROS 2/DDS 和理想 gateway 不能替代真实相机、UDP/Wi-Fi、时钟、遮挡和安全策略。实物链路需要单独校准并保留失败样本。</w:t>
       </w:r>
     </w:p>
     <w:p>
@@ -6083,7 +4608,7 @@
         <w:rPr>
           <w:i w:val="0"/>
         </w:rPr>
-        <w:t>8.2 方向上比较难的问题</w:t>
+        <w:t>8.2 方向上最难的几个问题</w:t>
       </w:r>
     </w:p>
     <w:p>
@@ -6111,7 +4636,7 @@
         <w:t xml:space="preserve">• </w:t>
       </w:r>
       <w:r>
-        <w:t>中央端能看到什么：为了可部署，中央不能免费知道机器人隐藏队列；但如果只看到很少的摘要，又如何避免“没有请求就永远不知道关键事件”？</w:t>
+        <w:t>中央端能看到什么：中央不能免费知道机器人隐藏队列；如果只看到摘要，又如何避免关键事件因为没有请求而永远不可见？</w:t>
       </w:r>
     </w:p>
     <w:p>
@@ -6125,7 +4650,7 @@
         <w:t xml:space="preserve">• </w:t>
       </w:r>
       <w:r>
-        <w:t>任务收益和网络指标如何公平结合：成功率、完成时间、payload、airtime、PDR、AoI、能耗的量纲不同；主终点需要预注册，不能看完结果后挑指标。</w:t>
+        <w:t>任务收益和网络指标如何结合：成功率、完成时间、payload、airtime、PDR、AoI、能耗量纲不同，主终点需要提前固定。</w:t>
       </w:r>
     </w:p>
     <w:p>
@@ -6139,7 +4664,7 @@
         <w:t xml:space="preserve">• </w:t>
       </w:r>
       <w:r>
-        <w:t>强基线会不会已经足够：task-value greedy 可能比复杂 RL 更稳定。如果它已经达到同等效果，项目应该怎样把结论改成“复杂 RL 没有必要”？</w:t>
+        <w:t>强基线会不会已经足够：task-value greedy 可能比复杂 RL 更稳定；如果结果相同，如何把“复杂 RL 没有必要”写成清楚的结论？</w:t>
       </w:r>
     </w:p>
     <w:p>
@@ -6153,7 +4678,7 @@
         <w:t xml:space="preserve">• </w:t>
       </w:r>
       <w:r>
-        <w:t>规模和异构怎么进入：2–3 台同构 TurtleBot3 适合先把因果链做清楚，但大规模机器人或异构传感器会带来状态和消息类型爆炸，何时加入才不把第一版问题做散？</w:t>
+        <w:t>规模和异构何时加入：2–3 台同构 TurtleBot3 适合先把因果链做清楚，大规模和异构会带来状态、消息类型和训练规模爆炸。</w:t>
       </w:r>
     </w:p>
     <w:p>
@@ -6167,7 +4692,7 @@
         <w:t xml:space="preserve">• </w:t>
       </w:r>
       <w:r>
-        <w:t>Wi-Fi 4 的真实性到什么程度：ns-3 的传播和墙损耗需要校准；没有测量数据时，哪些结果只能叫 synthetic sensitivity，不能叫 sim-to-real？</w:t>
+        <w:t>Wi-Fi 4 的真实性到什么程度：ns-3 传播和墙损耗需要校准；没有实测数据时，哪些结果只能叫 synthetic sensitivity？</w:t>
       </w:r>
     </w:p>
     <w:p>
@@ -6181,7 +4706,7 @@
         <w:t xml:space="preserve">• </w:t>
       </w:r>
       <w:r>
-        <w:t>实物部署的安全边界：网络短时中断时，机器人继续执行多少本地任务是安全的？什么时候应该等待、返航或报告 PARTIAL_COMPLETE？</w:t>
+        <w:t>实物部署的安全边界：短时断网时机器人继续执行多少本地任务是安全的？什么时候等待、返航或报告 `PARTIAL_COMPLETE`？</w:t>
       </w:r>
     </w:p>
     <w:p>
@@ -6192,7 +4717,7 @@
         <w:rPr>
           <w:i w:val="0"/>
         </w:rPr>
-        <w:t>8.3 希望现场讨论的三个选择题</w:t>
+        <w:t>8.3 当前最需要确定的三个选择</w:t>
       </w:r>
     </w:p>
     <w:tbl>
@@ -6241,13 +4766,13 @@
                 <w:color w:val="FFFFFF"/>
                 <w:sz w:val="16"/>
               </w:rPr>
-              <w:t>希望讨论的选择</w:t>
+              <w:t>选择</w:t>
             </w:r>
           </w:p>
         </w:tc>
         <w:tc>
           <w:tcPr>
-            <w:tcW w:type="dxa" w:w="6009"/>
+            <w:tcW w:type="dxa" w:w="5896"/>
             <w:shd w:fill="1F4E79"/>
             <w:tcBorders>
               <w:top w:val="single" w:sz="6" w:space="0" w:color="D9D9D9"/>
@@ -6276,7 +4801,7 @@
                 <w:color w:val="FFFFFF"/>
                 <w:sz w:val="16"/>
               </w:rPr>
-              <w:t>为什么现在需要决定</w:t>
+              <w:t>现在确定它的意义</w:t>
             </w:r>
           </w:p>
         </w:tc>
@@ -6310,7 +4835,7 @@
               <w:rPr>
                 <w:sz w:val="16"/>
               </w:rPr>
-              <w:t>把第一版收窄到“消息准入 + 真实 Wi-Fi 交付”</w:t>
+              <w:t>第一版是否收窄到“消息准入 + 真实 Wi-Fi 交付”</w:t>
             </w:r>
           </w:p>
         </w:tc>
@@ -6342,7 +4867,7 @@
               <w:rPr>
                 <w:sz w:val="16"/>
               </w:rPr>
-              <w:t>收窄后能固定任务栈和消息语义，把因果链做完整；保留更宽的 PHY/MAC 联合优化则会扩大变量</w:t>
+              <w:t>能固定任务栈和消息语义，把因果链做完整；更宽的 PHY/MAC 联合优化会扩大变量</w:t>
             </w:r>
           </w:p>
         </w:tc>
@@ -6377,7 +4902,7 @@
               <w:rPr>
                 <w:sz w:val="16"/>
               </w:rPr>
-              <w:t>先做真实负载和通信能耗测量，再决定 RL 是否进入主线</w:t>
+              <w:t>是否在 P3C.5/P4B 前先补一轮真实消息负载和通信能耗测量</w:t>
             </w:r>
           </w:p>
         </w:tc>
@@ -6410,7 +4935,7 @@
               <w:rPr>
                 <w:sz w:val="16"/>
               </w:rPr>
-              <w:t>如果没有可测瓶颈，RL 可能只是人为制造优势；如果存在排队/过期，测量可以给出训练问题的边界</w:t>
+              <w:t>没有可测瓶颈时，RL 可能只是人为制造优势；有排队/过期时，测量能给训练问题定边界</w:t>
             </w:r>
           </w:p>
         </w:tc>
@@ -6444,7 +4969,7 @@
               <w:rPr>
                 <w:sz w:val="16"/>
               </w:rPr>
-              <w:t>现场主 demo 使用 2 台稳定完整任务，还是 3 台协同但更容易受资源和 Nav2 影响</w:t>
+              <w:t>现场主 demo 采用 2 台稳定完整任务还是 3 台协同任务</w:t>
             </w:r>
           </w:p>
         </w:tc>
@@ -6476,7 +5001,7 @@
               <w:rPr>
                 <w:sz w:val="16"/>
               </w:rPr>
-              <w:t>2 台更适合稳定展示端到端闭环；3 台更接近后续研究但更依赖机器资源和启动清理</w:t>
+              <w:t>2 台更适合展示端到端闭环；3 台更接近后续研究，但更依赖资源和启动清理</w:t>
             </w:r>
           </w:p>
         </w:tc>
@@ -6488,11 +5013,6 @@
       </w:pPr>
     </w:p>
     <w:p>
-      <w:r>
-        <w:br w:type="page"/>
-      </w:r>
-    </w:p>
-    <w:p>
       <w:pPr>
         <w:pStyle w:val="Heading1"/>
       </w:pPr>
@@ -6500,7 +5020,7 @@
         <w:rPr>
           <w:i w:val="0"/>
         </w:rPr>
-        <w:t>9 附录：听众可能会追问的口径和资料入口</w:t>
+        <w:t>9 附录：口径和资料入口</w:t>
       </w:r>
     </w:p>
     <w:p>
@@ -6558,7 +5078,7 @@
               <w:rPr>
                 <w:b/>
                 <w:color w:val="FFFFFF"/>
-                <w:sz w:val="17"/>
+                <w:sz w:val="16"/>
               </w:rPr>
               <w:t>词</w:t>
             </w:r>
@@ -6566,7 +5086,7 @@
         </w:tc>
         <w:tc>
           <w:tcPr>
-            <w:tcW w:type="dxa" w:w="6633"/>
+            <w:tcW w:type="dxa" w:w="6520"/>
             <w:shd w:fill="1F4E79"/>
             <w:tcBorders>
               <w:top w:val="single" w:sz="6" w:space="0" w:color="D9D9D9"/>
@@ -6593,7 +5113,7 @@
               <w:rPr>
                 <w:b/>
                 <w:color w:val="FFFFFF"/>
-                <w:sz w:val="17"/>
+                <w:sz w:val="16"/>
               </w:rPr>
               <w:t>当前准确含义</w:t>
             </w:r>
@@ -6627,7 +5147,7 @@
             </w:pPr>
             <w:r>
               <w:rPr>
-                <w:sz w:val="17"/>
+                <w:sz w:val="16"/>
               </w:rPr>
               <w:t>理想通信</w:t>
             </w:r>
@@ -6659,7 +5179,7 @@
             </w:pPr>
             <w:r>
               <w:rPr>
-                <w:sz w:val="17"/>
+                <w:sz w:val="16"/>
               </w:rPr>
               <w:t>P2D/P3A 的 zero-loss finite-rate gateway，仍有消息生成、限频、序列化和交付，不是无限带宽 oracle</w:t>
             </w:r>
@@ -6694,7 +5214,7 @@
             </w:pPr>
             <w:r>
               <w:rPr>
-                <w:sz w:val="17"/>
+                <w:sz w:val="16"/>
               </w:rPr>
               <w:t>应用层故障替身</w:t>
             </w:r>
@@ -6727,7 +5247,7 @@
             </w:pPr>
             <w:r>
               <w:rPr>
-                <w:sz w:val="17"/>
+                <w:sz w:val="16"/>
               </w:rPr>
               <w:t>P3B 的固定 delay/loss/TTL/ACK/重传队列，用来测协议和 stale-state 安全语义，不包含 Wi-Fi MAC/PHY</w:t>
             </w:r>
@@ -6761,7 +5281,7 @@
             </w:pPr>
             <w:r>
               <w:rPr>
-                <w:sz w:val="17"/>
+                <w:sz w:val="16"/>
               </w:rPr>
               <w:t>真实 Wi-Fi 结果</w:t>
             </w:r>
@@ -6793,7 +5313,7 @@
             </w:pPr>
             <w:r>
               <w:rPr>
-                <w:sz w:val="17"/>
+                <w:sz w:val="16"/>
               </w:rPr>
               <w:t>必须等 P4 的 ns-3 包级/时间级闭环和 Wi-Fi 4 场景完成后才能这样称呼</w:t>
             </w:r>
@@ -6835,7 +5355,7 @@
         </w:trPr>
         <w:tc>
           <w:tcPr>
-            <w:tcW w:type="dxa" w:w="2154"/>
+            <w:tcW w:type="dxa" w:w="2098"/>
             <w:shd w:fill="1F4E79"/>
             <w:tcBorders>
               <w:top w:val="single" w:sz="6" w:space="0" w:color="D9D9D9"/>
@@ -6862,7 +5382,7 @@
               <w:rPr>
                 <w:b/>
                 <w:color w:val="FFFFFF"/>
-                <w:sz w:val="16"/>
+                <w:sz w:val="15"/>
               </w:rPr>
               <w:t>检查点</w:t>
             </w:r>
@@ -6897,15 +5417,15 @@
               <w:rPr>
                 <w:b/>
                 <w:color w:val="FFFFFF"/>
-                <w:sz w:val="16"/>
+                <w:sz w:val="15"/>
               </w:rPr>
-              <w:t>现在的状态</w:t>
+              <w:t>状态</w:t>
             </w:r>
           </w:p>
         </w:tc>
         <w:tc>
           <w:tcPr>
-            <w:tcW w:type="dxa" w:w="4025"/>
+            <w:tcW w:type="dxa" w:w="3969"/>
             <w:shd w:fill="1F4E79"/>
             <w:tcBorders>
               <w:top w:val="single" w:sz="6" w:space="0" w:color="D9D9D9"/>
@@ -6932,9 +5452,9 @@
               <w:rPr>
                 <w:b/>
                 <w:color w:val="FFFFFF"/>
-                <w:sz w:val="16"/>
+                <w:sz w:val="15"/>
               </w:rPr>
-              <w:t>汇报时建议怎么说</w:t>
+              <w:t>汇报时的准确说法</w:t>
             </w:r>
           </w:p>
         </w:tc>
@@ -6966,7 +5486,7 @@
             </w:pPr>
             <w:r>
               <w:rPr>
-                <w:sz w:val="16"/>
+                <w:sz w:val="15"/>
               </w:rPr>
               <w:t>P0 项目审计</w:t>
             </w:r>
@@ -6998,7 +5518,7 @@
             </w:pPr>
             <w:r>
               <w:rPr>
-                <w:sz w:val="16"/>
+                <w:sz w:val="15"/>
               </w:rPr>
               <w:t>已验收</w:t>
             </w:r>
@@ -7030,7 +5550,7 @@
             </w:pPr>
             <w:r>
               <w:rPr>
-                <w:sz w:val="16"/>
+                <w:sz w:val="15"/>
               </w:rPr>
               <w:t>边界、口径和路线已经固化</w:t>
             </w:r>
@@ -7065,7 +5585,7 @@
             </w:pPr>
             <w:r>
               <w:rPr>
-                <w:sz w:val="16"/>
+                <w:sz w:val="15"/>
               </w:rPr>
               <w:t>P1 探索基线</w:t>
             </w:r>
@@ -7098,7 +5618,7 @@
             </w:pPr>
             <w:r>
               <w:rPr>
-                <w:sz w:val="16"/>
+                <w:sz w:val="15"/>
               </w:rPr>
               <w:t>已验收</w:t>
             </w:r>
@@ -7131,7 +5651,7 @@
             </w:pPr>
             <w:r>
               <w:rPr>
-                <w:sz w:val="16"/>
+                <w:sz w:val="15"/>
               </w:rPr>
               <w:t>任务层能重复探索，评估器能记录失败</w:t>
             </w:r>
@@ -7165,7 +5685,7 @@
             </w:pPr>
             <w:r>
               <w:rPr>
-                <w:sz w:val="16"/>
+                <w:sz w:val="15"/>
               </w:rPr>
               <w:t>P2 完整理想任务</w:t>
             </w:r>
@@ -7197,7 +5717,7 @@
             </w:pPr>
             <w:r>
               <w:rPr>
-                <w:sz w:val="16"/>
+                <w:sz w:val="15"/>
               </w:rPr>
               <w:t>已验收</w:t>
             </w:r>
@@ -7229,7 +5749,7 @@
             </w:pPr>
             <w:r>
               <w:rPr>
-                <w:sz w:val="16"/>
+                <w:sz w:val="15"/>
               </w:rPr>
               <w:t>目标、集合、返航充电可在同一 episode 闭环</w:t>
             </w:r>
@@ -7264,7 +5784,7 @@
             </w:pPr>
             <w:r>
               <w:rPr>
-                <w:sz w:val="16"/>
+                <w:sz w:val="15"/>
               </w:rPr>
               <w:t>P3A gateway</w:t>
             </w:r>
@@ -7297,7 +5817,7 @@
             </w:pPr>
             <w:r>
               <w:rPr>
-                <w:sz w:val="16"/>
+                <w:sz w:val="15"/>
               </w:rPr>
               <w:t>历史证据，当前 HEAD 待 P3A.6 重新冻结</w:t>
             </w:r>
@@ -7330,9 +5850,9 @@
             </w:pPr>
             <w:r>
               <w:rPr>
-                <w:sz w:val="16"/>
+                <w:sz w:val="15"/>
               </w:rPr>
-              <w:t>所有跨端信息已有统一边界，但公平基线还要重冻</w:t>
+              <w:t>跨端信息已有统一边界，但公平基线还要重冻</w:t>
             </w:r>
           </w:p>
         </w:tc>
@@ -7364,7 +5884,7 @@
             </w:pPr>
             <w:r>
               <w:rPr>
-                <w:sz w:val="16"/>
+                <w:sz w:val="15"/>
               </w:rPr>
               <w:t>P3B 协议门禁</w:t>
             </w:r>
@@ -7396,7 +5916,7 @@
             </w:pPr>
             <w:r>
               <w:rPr>
-                <w:sz w:val="16"/>
+                <w:sz w:val="15"/>
               </w:rPr>
               <w:t>已验收范围</w:t>
             </w:r>
@@ -7428,7 +5948,7 @@
             </w:pPr>
             <w:r>
               <w:rPr>
-                <w:sz w:val="16"/>
+                <w:sz w:val="15"/>
               </w:rPr>
               <w:t>故障语义和账本可复现，仍不是 Wi-Fi</w:t>
             </w:r>
@@ -7463,7 +5983,7 @@
             </w:pPr>
             <w:r>
               <w:rPr>
-                <w:sz w:val="16"/>
+                <w:sz w:val="15"/>
               </w:rPr>
               <w:t>P3B.5/P3C/P3C.5</w:t>
             </w:r>
@@ -7496,7 +6016,7 @@
             </w:pPr>
             <w:r>
               <w:rPr>
-                <w:sz w:val="16"/>
+                <w:sz w:val="15"/>
               </w:rPr>
               <w:t>待完成</w:t>
             </w:r>
@@ -7529,7 +6049,7 @@
             </w:pPr>
             <w:r>
               <w:rPr>
-                <w:sz w:val="16"/>
+                <w:sz w:val="15"/>
               </w:rPr>
               <w:t>完整故障任务、通信指标和真实负载还没有闭环</w:t>
             </w:r>
@@ -7563,7 +6083,7 @@
             </w:pPr>
             <w:r>
               <w:rPr>
-                <w:sz w:val="16"/>
+                <w:sz w:val="15"/>
               </w:rPr>
               <w:t>P4 ns-3 Wi-Fi</w:t>
             </w:r>
@@ -7595,7 +6115,7 @@
             </w:pPr>
             <w:r>
               <w:rPr>
-                <w:sz w:val="16"/>
+                <w:sz w:val="15"/>
               </w:rPr>
               <w:t>待完成</w:t>
             </w:r>
@@ -7627,9 +6147,9 @@
             </w:pPr>
             <w:r>
               <w:rPr>
-                <w:sz w:val="16"/>
+                <w:sz w:val="15"/>
               </w:rPr>
-              <w:t>这是下一阶段的核心工程门</w:t>
+              <w:t>下一阶段的核心工程门</w:t>
             </w:r>
           </w:p>
         </w:tc>
@@ -7662,7 +6182,7 @@
             </w:pPr>
             <w:r>
               <w:rPr>
-                <w:sz w:val="16"/>
+                <w:sz w:val="15"/>
               </w:rPr>
               <w:t>P5 强基线/RL go-no-go</w:t>
             </w:r>
@@ -7695,7 +6215,7 @@
             </w:pPr>
             <w:r>
               <w:rPr>
-                <w:sz w:val="16"/>
+                <w:sz w:val="15"/>
               </w:rPr>
               <w:t>待完成</w:t>
             </w:r>
@@ -7728,7 +6248,7 @@
             </w:pPr>
             <w:r>
               <w:rPr>
-                <w:sz w:val="16"/>
+                <w:sz w:val="15"/>
               </w:rPr>
               <w:t>先判断是否真的需要 RL</w:t>
             </w:r>
@@ -7762,7 +6282,7 @@
             </w:pPr>
             <w:r>
               <w:rPr>
-                <w:sz w:val="16"/>
+                <w:sz w:val="15"/>
               </w:rPr>
               <w:t>P6–P8</w:t>
             </w:r>
@@ -7794,7 +6314,7 @@
             </w:pPr>
             <w:r>
               <w:rPr>
-                <w:sz w:val="16"/>
+                <w:sz w:val="15"/>
               </w:rPr>
               <w:t>待完成</w:t>
             </w:r>
@@ -7826,7 +6346,7 @@
             </w:pPr>
             <w:r>
               <w:rPr>
-                <w:sz w:val="16"/>
+                <w:sz w:val="15"/>
               </w:rPr>
               <w:t>有条件进入学习、泛化和实物</w:t>
             </w:r>
@@ -7847,7 +6367,7 @@
         <w:rPr>
           <w:i w:val="0"/>
         </w:rPr>
-        <w:t>9.3 建议引用的项目资料</w:t>
+        <w:t>9.3 资料入口</w:t>
       </w:r>
     </w:p>
     <w:p>
@@ -7903,20 +6423,6 @@
         <w:t xml:space="preserve">• </w:t>
       </w:r>
       <w:r>
-        <w:t>教师研究路线评审：`report/20260929_teacher_research_route_review.md`</w:t>
-      </w:r>
-    </w:p>
-    <w:p>
-      <w:pPr>
-        <w:pStyle w:val="BulletCustom"/>
-      </w:pPr>
-      <w:r>
-        <w:rPr>
-          <w:b/>
-        </w:rPr>
-        <w:t xml:space="preserve">• </w:t>
-      </w:r>
-      <w:r>
         <w:t>ROS 2 运行说明：`ros2_ws/ros2-multi-robot-automap/user_guide.md`、`launch_commands.md`</w:t>
       </w:r>
     </w:p>
@@ -7942,7 +6448,7 @@
         <w:rPr>
           <w:i w:val="0"/>
         </w:rPr>
-        <w:t>9.4 一句话收束</w:t>
+        <w:t>9.4 收束</w:t>
       </w:r>
     </w:p>
     <w:p>
@@ -7951,7 +6457,7 @@
         <w:rPr>
           <w:i/>
         </w:rPr>
-        <w:t>我现在更想把这项工作做成一个可以被大家一起挑问题的系统：先让任务、消息、网络和日志真正连起来，再看学习方法是否带来不可替代的价值；如果答案是否定的，也能得到一个清楚、可复现的结论。</w:t>
+        <w:t>我现在想验证的不是某个算法名字是否足够新，而是：任务、消息、网络和日志能不能真正连成一条可以复现、可以质疑、也可以在否定后继续推进的系统证据链。先把这条链做好，再判断学习方法是否带来不可替代的价值。</w:t>
       </w:r>
     </w:p>
     <w:sectPr>
@@ -7978,7 +6484,7 @@
         <w:color w:val="6E7882"/>
         <w:sz w:val="16"/>
       </w:rPr>
-      <w:t xml:space="preserve">组内分享底稿 · 2026-09-29    </w:t>
+      <w:t xml:space="preserve">阶段性进展文档 · 2026-09-29    </w:t>
     </w:r>
     <w:r>
       <w:fldChar w:fldCharType="begin"/>
@@ -8002,7 +6508,7 @@
         <w:color w:val="6E7882"/>
         <w:sz w:val="16"/>
       </w:rPr>
-      <w:t>多机器人无线通信调度近期进展分享</w:t>
+      <w:t>多机器人无线通信问题与研究路线</w:t>
     </w:r>
   </w:p>
 </w:hdr>

</xml_diff>

<commit_message>
docs: add framework and paper figure evidence
</commit_message>
<xml_diff>
--- a/260929_report/多机器人无线通信调度近期进展分享文档.docx
+++ b/260929_report/多机器人无线通信调度近期进展分享文档.docx
@@ -515,7 +515,7 @@
       <w:r>
         <w:drawing>
           <wp:inline xmlns:a="http://schemas.openxmlformats.org/drawingml/2006/main" xmlns:pic="http://schemas.openxmlformats.org/drawingml/2006/picture">
-            <wp:extent cx="5897880" cy="5829696"/>
+            <wp:extent cx="5897880" cy="2765561"/>
             <wp:docPr id="3" name="Picture 3" descr="汇报文档示意图 3"/>
             <wp:cNvGraphicFramePr>
               <a:graphicFrameLocks noChangeAspect="1"/>
@@ -524,7 +524,7 @@
               <a:graphicData uri="http://schemas.openxmlformats.org/drawingml/2006/picture">
                 <pic:pic>
                   <pic:nvPicPr>
-                    <pic:cNvPr id="0" name="fig06_literature_drl.png"/>
+                    <pic:cNvPr id="0" name="fig06_paper_drl_taxonomy.png"/>
                     <pic:cNvPicPr/>
                   </pic:nvPicPr>
                   <pic:blipFill>
@@ -536,7 +536,7 @@
                   <pic:spPr>
                     <a:xfrm>
                       <a:off x="0" y="0"/>
-                      <a:ext cx="5897880" cy="5829696"/>
+                      <a:ext cx="5897880" cy="2765561"/>
                     </a:xfrm>
                     <a:prstGeom prst="rect"/>
                   </pic:spPr>
@@ -553,7 +553,7 @@
         <w:jc w:val="center"/>
       </w:pPr>
       <w:r>
-        <w:t>图 3　论文页面证据：通信 DRL 关注动态网络中的决策复杂度和资源管理；它提供建模语言，尚不能直接证明任务导向的 RL 会胜过规则方法。</w:t>
+        <w:t>图 3　论文 Figure 2 截图（Luong 等，2019）：通信与网络中的 DRL 被归纳到网络接入/速率控制、缓存/卸载、安全/连接保持和资源调度等类别。它支持网络侧存在动态决策空间，但不能直接证明任务导向的 RL 会胜过规则方法。</w:t>
       </w:r>
     </w:p>
     <w:p>
@@ -593,7 +593,7 @@
       <w:r>
         <w:drawing>
           <wp:inline xmlns:a="http://schemas.openxmlformats.org/drawingml/2006/main" xmlns:pic="http://schemas.openxmlformats.org/drawingml/2006/picture">
-            <wp:extent cx="5897880" cy="5206153"/>
+            <wp:extent cx="5897880" cy="4435482"/>
             <wp:docPr id="4" name="Picture 4" descr="汇报文档示意图 4"/>
             <wp:cNvGraphicFramePr>
               <a:graphicFrameLocks noChangeAspect="1"/>
@@ -602,7 +602,7 @@
               <a:graphicData uri="http://schemas.openxmlformats.org/drawingml/2006/picture">
                 <pic:pic>
                   <pic:nvPicPr>
-                    <pic:cNvPr id="0" name="fig07_literature_codesign.png"/>
+                    <pic:cNvPr id="0" name="fig07_paper_codesign_architecture.png"/>
                     <pic:cNvPicPr/>
                   </pic:nvPicPr>
                   <pic:blipFill>
@@ -614,7 +614,7 @@
                   <pic:spPr>
                     <a:xfrm>
                       <a:off x="0" y="0"/>
-                      <a:ext cx="5897880" cy="5206153"/>
+                      <a:ext cx="5897880" cy="4435482"/>
                     </a:xfrm>
                     <a:prstGeom prst="rect"/>
                   </pic:spPr>
@@ -631,7 +631,7 @@
         <w:jc w:val="center"/>
       </w:pPr>
       <w:r>
-        <w:t>图 4　论文页面证据：通信、机器人算法和网络需要共同设计；当前路线把消息生成、网络交付、接收端状态和任务结果放进同一条日志。</w:t>
+        <w:t>图 4　论文 Figure 1 截图（Gielis 等，2022）：把感知、控制、通信策略和信道竞争放在同一套机器人网络闭环中，强调共同设计。当前路线把消息生成、网络交付、接收端状态和任务结果放进同一条日志。</w:t>
       </w:r>
     </w:p>
     <w:p>
@@ -680,7 +680,7 @@
       <w:r>
         <w:drawing>
           <wp:inline xmlns:a="http://schemas.openxmlformats.org/drawingml/2006/main" xmlns:pic="http://schemas.openxmlformats.org/drawingml/2006/picture">
-            <wp:extent cx="5897880" cy="3129164"/>
+            <wp:extent cx="5897880" cy="1902123"/>
             <wp:docPr id="5" name="Picture 5" descr="汇报文档示意图 5"/>
             <wp:cNvGraphicFramePr>
               <a:graphicFrameLocks noChangeAspect="1"/>
@@ -689,7 +689,7 @@
               <a:graphicData uri="http://schemas.openxmlformats.org/drawingml/2006/picture">
                 <pic:pic>
                   <pic:nvPicPr>
-                    <pic:cNvPr id="0" name="fig08_literature_goal_aoi.png"/>
+                    <pic:cNvPr id="0" name="fig08_paper_task_aoi.png"/>
                     <pic:cNvPicPr/>
                   </pic:nvPicPr>
                   <pic:blipFill>
@@ -701,7 +701,7 @@
                   <pic:spPr>
                     <a:xfrm>
                       <a:off x="0" y="0"/>
-                      <a:ext cx="5897880" cy="3129164"/>
+                      <a:ext cx="5897880" cy="1902123"/>
                     </a:xfrm>
                     <a:prstGeom prst="rect"/>
                   </pic:spPr>
@@ -718,7 +718,7 @@
         <w:jc w:val="center"/>
       </w:pPr>
       <w:r>
-        <w:t>图 5　论文页面证据：Goal-oriented communication 关注共同目标，AoI 关注状态新鲜度；两者结合后更接近“消息是否值得占用信道”。</w:t>
+        <w:t>图 5　论文 Figure 2 截图：左图来自 Charalambous 等的任务导向通信综述，右图来自 Yates 等的 AoI 综述。左图把通信目标转向支持任务执行，右图用锯齿状过程表示信息新鲜度。</w:t>
       </w:r>
     </w:p>
     <w:p>
@@ -748,6 +748,55 @@
           <w:i w:val="0"/>
         </w:rPr>
         <w:t>另一方面，很多任务工作把通信简单处理成“可用/不可用”、范围约束或带宽限制，较少保留消息生成、排队、重传、过期、消费和任务变化的逐条因果记录。当前路线要补的不是再造一个探索算法，而是把这些消息过程显式化，并验证它们是否会改变探索、目标确认、集合和充电恢复。</w:t>
+      </w:r>
+    </w:p>
+    <w:p>
+      <w:pPr>
+        <w:spacing w:before="100" w:after="20"/>
+        <w:jc w:val="center"/>
+      </w:pPr>
+      <w:r>
+        <w:drawing>
+          <wp:inline xmlns:a="http://schemas.openxmlformats.org/drawingml/2006/main" xmlns:pic="http://schemas.openxmlformats.org/drawingml/2006/picture">
+            <wp:extent cx="5897880" cy="3946852"/>
+            <wp:docPr id="6" name="Picture 6" descr="汇报文档示意图 6"/>
+            <wp:cNvGraphicFramePr>
+              <a:graphicFrameLocks noChangeAspect="1"/>
+            </wp:cNvGraphicFramePr>
+            <a:graphic>
+              <a:graphicData uri="http://schemas.openxmlformats.org/drawingml/2006/picture">
+                <pic:pic>
+                  <pic:nvPicPr>
+                    <pic:cNvPr id="0" name="fig09_paper_exploration_strategy.png"/>
+                    <pic:cNvPicPr/>
+                  </pic:nvPicPr>
+                  <pic:blipFill>
+                    <a:blip r:embed="rId15"/>
+                    <a:stretch>
+                      <a:fillRect/>
+                    </a:stretch>
+                  </pic:blipFill>
+                  <pic:spPr>
+                    <a:xfrm>
+                      <a:off x="0" y="0"/>
+                      <a:ext cx="5897880" cy="3946852"/>
+                    </a:xfrm>
+                    <a:prstGeom prst="rect"/>
+                  </pic:spPr>
+                </pic:pic>
+              </a:graphicData>
+            </a:graphic>
+          </wp:inline>
+        </w:drawing>
+      </w:r>
+    </w:p>
+    <w:p>
+      <w:pPr>
+        <w:pStyle w:val="CaptionCustom"/>
+        <w:jc w:val="center"/>
+      </w:pPr>
+      <w:r>
+        <w:t>图 6　论文 Figure 9 截图（多机器人协同探索综述）：通过中继机器人、被动/主动感知或开放广播处理通信范围和信息交换，说明通信感知已经是探索系统中的设计变量。</w:t>
       </w:r>
     </w:p>
     <w:p>
@@ -1601,6 +1650,64 @@
       </w:r>
     </w:p>
     <w:p>
+      <w:pPr/>
+      <w:r>
+        <w:rPr>
+          <w:i w:val="0"/>
+        </w:rPr>
+        <w:t>先把整个验证闭环画出来：左侧是 Gazebo/ROS 2 中的机器人和任务，中央是应用层通信调度器，右侧是 ns-3 Wi-Fi 4 交付，底部记录 action chunk、任务指标、网络指标和对比结果。</w:t>
+      </w:r>
+    </w:p>
+    <w:p>
+      <w:pPr>
+        <w:spacing w:before="100" w:after="20"/>
+        <w:jc w:val="center"/>
+      </w:pPr>
+      <w:r>
+        <w:drawing>
+          <wp:inline xmlns:a="http://schemas.openxmlformats.org/drawingml/2006/main" xmlns:pic="http://schemas.openxmlformats.org/drawingml/2006/picture">
+            <wp:extent cx="5897880" cy="3319321"/>
+            <wp:docPr id="7" name="Picture 7" descr="汇报文档示意图 7"/>
+            <wp:cNvGraphicFramePr>
+              <a:graphicFrameLocks noChangeAspect="1"/>
+            </wp:cNvGraphicFramePr>
+            <a:graphic>
+              <a:graphicData uri="http://schemas.openxmlformats.org/drawingml/2006/picture">
+                <pic:pic>
+                  <pic:nvPicPr>
+                    <pic:cNvPr id="0" name="fig10_overall_framework.png"/>
+                    <pic:cNvPicPr/>
+                  </pic:nvPicPr>
+                  <pic:blipFill>
+                    <a:blip r:embed="rId16"/>
+                    <a:stretch>
+                      <a:fillRect/>
+                    </a:stretch>
+                  </pic:blipFill>
+                  <pic:spPr>
+                    <a:xfrm>
+                      <a:off x="0" y="0"/>
+                      <a:ext cx="5897880" cy="3319321"/>
+                    </a:xfrm>
+                    <a:prstGeom prst="rect"/>
+                  </pic:spPr>
+                </pic:pic>
+              </a:graphicData>
+            </a:graphic>
+          </wp:inline>
+        </w:drawing>
+      </w:r>
+    </w:p>
+    <w:p>
+      <w:pPr>
+        <w:pStyle w:val="CaptionCustom"/>
+        <w:jc w:val="center"/>
+      </w:pPr>
+      <w:r>
+        <w:t>图 7　总体验证框架：任务层、消息准入层、Wi-Fi 仿真层和评估日志在同一条 action chunk 闭环中交替运行。</w:t>
+      </w:r>
+    </w:p>
+    <w:p>
       <w:pPr>
         <w:pStyle w:val="Heading2"/>
       </w:pPr>
@@ -1629,7 +1736,7 @@
         <w:drawing>
           <wp:inline xmlns:a="http://schemas.openxmlformats.org/drawingml/2006/main" xmlns:pic="http://schemas.openxmlformats.org/drawingml/2006/picture">
             <wp:extent cx="5897880" cy="3619154"/>
-            <wp:docPr id="6" name="Picture 6" descr="汇报文档示意图 6"/>
+            <wp:docPr id="8" name="Picture 8" descr="汇报文档示意图 8"/>
             <wp:cNvGraphicFramePr>
               <a:graphicFrameLocks noChangeAspect="1"/>
             </wp:cNvGraphicFramePr>
@@ -1641,7 +1748,7 @@
                     <pic:cNvPicPr/>
                   </pic:nvPicPr>
                   <pic:blipFill>
-                    <a:blip r:embed="rId15"/>
+                    <a:blip r:embed="rId17"/>
                     <a:stretch>
                       <a:fillRect/>
                     </a:stretch>
@@ -1666,7 +1773,7 @@
         <w:jc w:val="center"/>
       </w:pPr>
       <w:r>
-        <w:t>图 6　系统边界：机器人任务栈固定，策略首先只控制应用层消息准入；Wi-Fi MAC/PHY 仍决定实际交付。</w:t>
+        <w:t>图 8　系统边界：机器人任务栈固定，策略首先只控制应用层消息准入；Wi-Fi MAC/PHY 仍决定实际交付。</w:t>
       </w:r>
     </w:p>
     <w:p>
@@ -1797,7 +1904,7 @@
         <w:drawing>
           <wp:inline xmlns:a="http://schemas.openxmlformats.org/drawingml/2006/main" xmlns:pic="http://schemas.openxmlformats.org/drawingml/2006/picture">
             <wp:extent cx="5897880" cy="2246811"/>
-            <wp:docPr id="7" name="Picture 7" descr="汇报文档示意图 7"/>
+            <wp:docPr id="9" name="Picture 9" descr="汇报文档示意图 9"/>
             <wp:cNvGraphicFramePr>
               <a:graphicFrameLocks noChangeAspect="1"/>
             </wp:cNvGraphicFramePr>
@@ -1809,7 +1916,7 @@
                     <pic:cNvPicPr/>
                   </pic:nvPicPr>
                   <pic:blipFill>
-                    <a:blip r:embed="rId16"/>
+                    <a:blip r:embed="rId18"/>
                     <a:stretch>
                       <a:fillRect/>
                     </a:stretch>
@@ -1834,7 +1941,7 @@
         <w:jc w:val="center"/>
       </w:pPr>
       <w:r>
-        <w:t>图 7　任务状态机：`FOUND` 和 90% 覆盖率是过程指标；无故障时只有满足所有集合条件才是 `COMPLETE`。</w:t>
+        <w:t>图 9　任务状态机：`FOUND` 和 90% 覆盖率是过程指标；无故障时只有满足所有集合条件才是 `COMPLETE`。</w:t>
       </w:r>
     </w:p>
     <w:p>
@@ -1902,7 +2009,7 @@
         <w:drawing>
           <wp:inline xmlns:a="http://schemas.openxmlformats.org/drawingml/2006/main" xmlns:pic="http://schemas.openxmlformats.org/drawingml/2006/picture">
             <wp:extent cx="5897880" cy="2546812"/>
-            <wp:docPr id="8" name="Picture 8" descr="汇报文档示意图 8"/>
+            <wp:docPr id="10" name="Picture 10" descr="汇报文档示意图 10"/>
             <wp:cNvGraphicFramePr>
               <a:graphicFrameLocks noChangeAspect="1"/>
             </wp:cNvGraphicFramePr>
@@ -1914,7 +2021,7 @@
                     <pic:cNvPicPr/>
                   </pic:nvPicPr>
                   <pic:blipFill>
-                    <a:blip r:embed="rId17"/>
+                    <a:blip r:embed="rId19"/>
                     <a:stretch>
                       <a:fillRect/>
                     </a:stretch>
@@ -1939,7 +2046,7 @@
         <w:jc w:val="center"/>
       </w:pPr>
       <w:r>
-        <w:t>图 8　工程路线：先把任务和证据链站稳，再决定是否需要 RL。</w:t>
+        <w:t>图 10　工程路线：先把任务和证据链站稳，再决定是否需要 RL。</w:t>
       </w:r>
     </w:p>
     <w:tbl>
@@ -3896,7 +4003,7 @@
         <w:drawing>
           <wp:inline xmlns:a="http://schemas.openxmlformats.org/drawingml/2006/main" xmlns:pic="http://schemas.openxmlformats.org/drawingml/2006/picture">
             <wp:extent cx="5897880" cy="2527663"/>
-            <wp:docPr id="9" name="Picture 9" descr="汇报文档示意图 9"/>
+            <wp:docPr id="11" name="Picture 11" descr="汇报文档示意图 11"/>
             <wp:cNvGraphicFramePr>
               <a:graphicFrameLocks noChangeAspect="1"/>
             </wp:cNvGraphicFramePr>
@@ -3908,7 +4015,7 @@
                     <pic:cNvPicPr/>
                   </pic:nvPicPr>
                   <pic:blipFill>
-                    <a:blip r:embed="rId18"/>
+                    <a:blip r:embed="rId20"/>
                     <a:stretch>
                       <a:fillRect/>
                     </a:stretch>
@@ -3933,7 +4040,7 @@
         <w:jc w:val="center"/>
       </w:pPr>
       <w:r>
-        <w:t>图 9　阶段性证据：任务闭环和日志证据逐步形成，网络策略结论尚未开始。</w:t>
+        <w:t>图 11　阶段性证据：任务闭环和日志证据逐步形成，网络策略结论尚未开始。</w:t>
       </w:r>
     </w:p>
     <w:p>

</xml_diff>